<commit_message>
Refactoring ang fixing bugs while testing the workflow engine
</commit_message>
<xml_diff>
--- a/MigrationScripts/EF Core Migration History.docx
+++ b/MigrationScripts/EF Core Migration History.docx
@@ -73,6 +73,7 @@
         <w:t xml:space="preserve">Install-Package </w:t>
       </w:r>
       <w:proofErr w:type="spellStart"/>
+      <w:proofErr w:type="gramStart"/>
       <w:r>
         <w:rPr>
           <w:b/>
@@ -82,6 +83,7 @@
         <w:t>Microsoft.EntityFrameworkCore.Tools</w:t>
       </w:r>
       <w:proofErr w:type="spellEnd"/>
+      <w:proofErr w:type="gramEnd"/>
     </w:p>
     <w:p>
       <w:pPr>
@@ -123,6 +125,7 @@
         <w:t xml:space="preserve">Update-Package </w:t>
       </w:r>
       <w:proofErr w:type="spellStart"/>
+      <w:proofErr w:type="gramStart"/>
       <w:r>
         <w:rPr>
           <w:b/>
@@ -132,6 +135,7 @@
         <w:t>Microsoft.EntityFrameworkCore.Tools</w:t>
       </w:r>
       <w:proofErr w:type="spellEnd"/>
+      <w:proofErr w:type="gramEnd"/>
     </w:p>
     <w:p>
       <w:pPr>
@@ -747,7 +751,23 @@
           </w:tcPr>
           <w:p>
             <w:r>
-              <w:t>The directory use to output the files. Paths are relative to the target project directory. Defaults to "Migrations".</w:t>
+              <w:t xml:space="preserve">The directory </w:t>
+            </w:r>
+            <w:proofErr w:type="gramStart"/>
+            <w:r>
+              <w:t>use</w:t>
+            </w:r>
+            <w:proofErr w:type="gramEnd"/>
+            <w:r>
+              <w:t xml:space="preserve"> to output the files. Paths are </w:t>
+            </w:r>
+            <w:proofErr w:type="gramStart"/>
+            <w:r>
+              <w:t>relative</w:t>
+            </w:r>
+            <w:proofErr w:type="gramEnd"/>
+            <w:r>
+              <w:t xml:space="preserve"> to the target project directory. Defaults to "Migrations".</w:t>
             </w:r>
           </w:p>
         </w:tc>
@@ -1321,8 +1341,13 @@
       <w:pPr>
         <w:ind w:left="360"/>
       </w:pPr>
-      <w:r>
-        <w:t>  The -</w:t>
+      <w:proofErr w:type="gramStart"/>
+      <w:r>
+        <w:t>  The</w:t>
+      </w:r>
+      <w:proofErr w:type="gramEnd"/>
+      <w:r>
+        <w:t xml:space="preserve"> -</w:t>
       </w:r>
       <w:proofErr w:type="spellStart"/>
       <w:r>
@@ -1347,8 +1372,13 @@
       <w:pPr>
         <w:ind w:left="360"/>
       </w:pPr>
-      <w:r>
-        <w:t xml:space="preserve">  If there are changes in your </w:t>
+      <w:proofErr w:type="gramStart"/>
+      <w:r>
+        <w:t>  If</w:t>
+      </w:r>
+      <w:proofErr w:type="gramEnd"/>
+      <w:r>
+        <w:t xml:space="preserve"> there are changes in your </w:t>
       </w:r>
       <w:r>
         <w:rPr>
@@ -1375,8 +1405,13 @@
       <w:pPr>
         <w:ind w:left="360"/>
       </w:pPr>
-      <w:r>
-        <w:t xml:space="preserve">  If there are </w:t>
+      <w:proofErr w:type="gramStart"/>
+      <w:r>
+        <w:t>  If</w:t>
+      </w:r>
+      <w:proofErr w:type="gramEnd"/>
+      <w:r>
+        <w:t xml:space="preserve"> there are </w:t>
       </w:r>
       <w:r>
         <w:rPr>
@@ -1602,7 +1637,11 @@
         <w:ind w:left="1080"/>
       </w:pPr>
       <w:r>
-        <w:t xml:space="preserve">Add-Migration </w:t>
+        <w:t>Add-</w:t>
+      </w:r>
+      <w:proofErr w:type="gramStart"/>
+      <w:r>
+        <w:t xml:space="preserve">Migration </w:t>
       </w:r>
       <w:r>
         <w:t xml:space="preserve"> </w:t>
@@ -1618,6 +1657,7 @@
         <w:t>ToMaritalStatusCode</w:t>
       </w:r>
       <w:proofErr w:type="spellEnd"/>
+      <w:proofErr w:type="gramEnd"/>
       <w:r>
         <w:t xml:space="preserve"> -Context </w:t>
       </w:r>
@@ -1722,7 +1762,11 @@
         <w:ind w:left="1080"/>
       </w:pPr>
       <w:r>
-        <w:t xml:space="preserve">Add-Migration </w:t>
+        <w:t>Add-</w:t>
+      </w:r>
+      <w:proofErr w:type="gramStart"/>
+      <w:r>
+        <w:t xml:space="preserve">Migration </w:t>
       </w:r>
       <w:r>
         <w:t xml:space="preserve"> </w:t>
@@ -1732,6 +1776,7 @@
         <w:t>RefactorEmployeeEntitySchema</w:t>
       </w:r>
       <w:proofErr w:type="spellEnd"/>
+      <w:proofErr w:type="gramEnd"/>
       <w:r>
         <w:t xml:space="preserve"> -Context </w:t>
       </w:r>
@@ -10807,19 +10852,525 @@
         <w:rPr>
           <w:color w:val="00B050"/>
         </w:rPr>
-        <w:t xml:space="preserve"> on </w:t>
-      </w:r>
-      <w:r>
-        <w:rPr>
-          <w:color w:val="00B050"/>
-        </w:rPr>
-        <w:t>12</w:t>
-      </w:r>
-      <w:r>
-        <w:rPr>
-          <w:color w:val="00B050"/>
-        </w:rPr>
-        <w:t>-Apr-2026</w:t>
+        <w:t xml:space="preserve"> on 12-Apr-2026</w:t>
+      </w:r>
+    </w:p>
+    <w:p>
+      <w:pPr>
+        <w:pStyle w:val="ListParagraph"/>
+        <w:ind w:left="1800"/>
+      </w:pPr>
+    </w:p>
+    <w:p>
+      <w:pPr>
+        <w:pStyle w:val="ListParagraph"/>
+        <w:numPr>
+          <w:ilvl w:val="0"/>
+          <w:numId w:val="6"/>
+        </w:numPr>
+        <w:spacing w:after="0"/>
+        <w:rPr>
+          <w:b/>
+          <w:bCs/>
+          <w:color w:val="EE0000"/>
+        </w:rPr>
+      </w:pPr>
+      <w:r>
+        <w:rPr>
+          <w:b/>
+          <w:bCs/>
+          <w:color w:val="EE0000"/>
+        </w:rPr>
+        <w:t>Data Migration PMC Command #</w:t>
+      </w:r>
+      <w:r>
+        <w:rPr>
+          <w:b/>
+          <w:bCs/>
+          <w:color w:val="EE0000"/>
+        </w:rPr>
+        <w:t>52</w:t>
+      </w:r>
+    </w:p>
+    <w:p>
+      <w:pPr>
+        <w:spacing w:after="0"/>
+        <w:ind w:left="1080"/>
+      </w:pPr>
+      <w:r>
+        <w:t>Add-Migration</w:t>
+      </w:r>
+      <w:r>
+        <w:t xml:space="preserve"> </w:t>
+      </w:r>
+      <w:proofErr w:type="spellStart"/>
+      <w:r>
+        <w:rPr>
+          <w:lang w:val="en-GB"/>
+        </w:rPr>
+        <w:t>Modify</w:t>
+      </w:r>
+      <w:r>
+        <w:rPr>
+          <w:lang w:val="en-GB"/>
+        </w:rPr>
+        <w:t>WorkflowCondition</w:t>
+      </w:r>
+      <w:proofErr w:type="spellEnd"/>
+      <w:r>
+        <w:t xml:space="preserve"> -Context </w:t>
+      </w:r>
+      <w:proofErr w:type="spellStart"/>
+      <w:r>
+        <w:t>AppDbContext</w:t>
+      </w:r>
+      <w:proofErr w:type="spellEnd"/>
+      <w:r>
+        <w:t xml:space="preserve"> </w:t>
+      </w:r>
+      <w:r>
+        <w:t xml:space="preserve">-Project </w:t>
+      </w:r>
+      <w:proofErr w:type="spellStart"/>
+      <w:r>
+        <w:t>KenHRApp.Infrastructure</w:t>
+      </w:r>
+      <w:proofErr w:type="spellEnd"/>
+      <w:r>
+        <w:t xml:space="preserve"> -</w:t>
+      </w:r>
+      <w:proofErr w:type="spellStart"/>
+      <w:r>
+        <w:t>StartupProject</w:t>
+      </w:r>
+      <w:proofErr w:type="spellEnd"/>
+      <w:r>
+        <w:t xml:space="preserve"> </w:t>
+      </w:r>
+      <w:proofErr w:type="spellStart"/>
+      <w:r>
+        <w:t>KenHRApp.Web</w:t>
+      </w:r>
+      <w:proofErr w:type="spellEnd"/>
+      <w:r>
+        <w:t xml:space="preserve"> -Verbose</w:t>
+      </w:r>
+    </w:p>
+    <w:p>
+      <w:pPr>
+        <w:spacing w:after="0"/>
+        <w:ind w:left="1080"/>
+      </w:pPr>
+    </w:p>
+    <w:p>
+      <w:pPr>
+        <w:spacing w:after="0"/>
+        <w:ind w:left="1080"/>
+      </w:pPr>
+      <w:r>
+        <w:t xml:space="preserve">Update-Database </w:t>
+      </w:r>
+      <w:r>
+        <w:t xml:space="preserve">-Context </w:t>
+      </w:r>
+      <w:proofErr w:type="spellStart"/>
+      <w:r>
+        <w:t>AppDbContext</w:t>
+      </w:r>
+      <w:proofErr w:type="spellEnd"/>
+    </w:p>
+    <w:p>
+      <w:pPr>
+        <w:ind w:left="1080"/>
+        <w:rPr>
+          <w:u w:val="single"/>
+        </w:rPr>
+      </w:pPr>
+      <w:r>
+        <w:rPr>
+          <w:b/>
+          <w:bCs/>
+          <w:u w:val="single"/>
+        </w:rPr>
+        <w:t>Status:</w:t>
+      </w:r>
+      <w:r>
+        <w:rPr>
+          <w:u w:val="single"/>
+        </w:rPr>
+        <w:t xml:space="preserve"> </w:t>
+      </w:r>
+    </w:p>
+    <w:p>
+      <w:pPr>
+        <w:pStyle w:val="ListParagraph"/>
+        <w:numPr>
+          <w:ilvl w:val="0"/>
+          <w:numId w:val="8"/>
+        </w:numPr>
+      </w:pPr>
+      <w:r>
+        <w:t>Development Database:</w:t>
+      </w:r>
+      <w:r>
+        <w:t xml:space="preserve"> </w:t>
+      </w:r>
+      <w:r>
+        <w:rPr>
+          <w:color w:val="00B050"/>
+        </w:rPr>
+        <w:t>Pending</w:t>
+      </w:r>
+    </w:p>
+    <w:p/>
+    <w:p/>
+    <w:p>
+      <w:pPr>
+        <w:pStyle w:val="ListParagraph"/>
+        <w:numPr>
+          <w:ilvl w:val="0"/>
+          <w:numId w:val="6"/>
+        </w:numPr>
+        <w:spacing w:after="0"/>
+        <w:rPr>
+          <w:b/>
+          <w:bCs/>
+          <w:color w:val="EE0000"/>
+        </w:rPr>
+      </w:pPr>
+      <w:r>
+        <w:rPr>
+          <w:b/>
+          <w:bCs/>
+          <w:color w:val="EE0000"/>
+        </w:rPr>
+        <w:lastRenderedPageBreak/>
+        <w:t>Data Migration PMC Command #</w:t>
+      </w:r>
+      <w:r>
+        <w:rPr>
+          <w:b/>
+          <w:bCs/>
+          <w:color w:val="EE0000"/>
+        </w:rPr>
+        <w:t>5</w:t>
+      </w:r>
+      <w:r>
+        <w:rPr>
+          <w:b/>
+          <w:bCs/>
+          <w:color w:val="EE0000"/>
+        </w:rPr>
+        <w:t>3</w:t>
+      </w:r>
+    </w:p>
+    <w:p>
+      <w:pPr>
+        <w:spacing w:after="0"/>
+        <w:ind w:left="1080"/>
+      </w:pPr>
+      <w:r>
+        <w:t>Add-Migration</w:t>
+      </w:r>
+      <w:r>
+        <w:t xml:space="preserve"> </w:t>
+      </w:r>
+      <w:proofErr w:type="spellStart"/>
+      <w:r>
+        <w:rPr>
+          <w:lang w:val="en-GB"/>
+        </w:rPr>
+        <w:t>Add</w:t>
+      </w:r>
+      <w:r>
+        <w:rPr>
+          <w:lang w:val="en-GB"/>
+        </w:rPr>
+        <w:t>IsTerminal</w:t>
+      </w:r>
+      <w:proofErr w:type="spellEnd"/>
+      <w:r>
+        <w:t xml:space="preserve"> -Context </w:t>
+      </w:r>
+      <w:proofErr w:type="spellStart"/>
+      <w:r>
+        <w:t>AppDbContext</w:t>
+      </w:r>
+      <w:proofErr w:type="spellEnd"/>
+      <w:r>
+        <w:t xml:space="preserve"> </w:t>
+      </w:r>
+      <w:r>
+        <w:t xml:space="preserve">-Project </w:t>
+      </w:r>
+      <w:proofErr w:type="spellStart"/>
+      <w:r>
+        <w:t>KenHRApp.Infrastructure</w:t>
+      </w:r>
+      <w:proofErr w:type="spellEnd"/>
+      <w:r>
+        <w:t xml:space="preserve"> -</w:t>
+      </w:r>
+      <w:proofErr w:type="spellStart"/>
+      <w:r>
+        <w:t>StartupProject</w:t>
+      </w:r>
+      <w:proofErr w:type="spellEnd"/>
+      <w:r>
+        <w:t xml:space="preserve"> </w:t>
+      </w:r>
+      <w:proofErr w:type="spellStart"/>
+      <w:r>
+        <w:t>KenHRApp.Web</w:t>
+      </w:r>
+      <w:proofErr w:type="spellEnd"/>
+      <w:r>
+        <w:t xml:space="preserve"> -Verbose</w:t>
+      </w:r>
+    </w:p>
+    <w:p>
+      <w:pPr>
+        <w:spacing w:after="0"/>
+        <w:ind w:left="1080"/>
+      </w:pPr>
+    </w:p>
+    <w:p>
+      <w:pPr>
+        <w:spacing w:after="0"/>
+        <w:ind w:left="1080"/>
+      </w:pPr>
+      <w:r>
+        <w:t xml:space="preserve">Update-Database </w:t>
+      </w:r>
+      <w:r>
+        <w:t xml:space="preserve">-Context </w:t>
+      </w:r>
+      <w:proofErr w:type="spellStart"/>
+      <w:r>
+        <w:t>AppDbContext</w:t>
+      </w:r>
+      <w:proofErr w:type="spellEnd"/>
+    </w:p>
+    <w:p>
+      <w:pPr>
+        <w:spacing w:after="0"/>
+        <w:ind w:left="1080"/>
+        <w:rPr>
+          <w:u w:val="single"/>
+        </w:rPr>
+      </w:pPr>
+      <w:r>
+        <w:rPr>
+          <w:b/>
+          <w:bCs/>
+          <w:u w:val="single"/>
+        </w:rPr>
+        <w:t>Status:</w:t>
+      </w:r>
+      <w:r>
+        <w:rPr>
+          <w:u w:val="single"/>
+        </w:rPr>
+        <w:t xml:space="preserve"> </w:t>
+      </w:r>
+    </w:p>
+    <w:p>
+      <w:pPr>
+        <w:pStyle w:val="ListParagraph"/>
+        <w:numPr>
+          <w:ilvl w:val="0"/>
+          <w:numId w:val="9"/>
+        </w:numPr>
+        <w:spacing w:after="0"/>
+      </w:pPr>
+      <w:r>
+        <w:t>Development Database:</w:t>
+      </w:r>
+      <w:r>
+        <w:t xml:space="preserve"> </w:t>
+      </w:r>
+      <w:r>
+        <w:rPr>
+          <w:color w:val="00B050"/>
+        </w:rPr>
+        <w:t>Pending</w:t>
+      </w:r>
+    </w:p>
+    <w:p>
+      <w:pPr>
+        <w:pStyle w:val="ListParagraph"/>
+        <w:ind w:left="1440"/>
+      </w:pPr>
+    </w:p>
+    <w:p>
+      <w:pPr>
+        <w:pStyle w:val="ListParagraph"/>
+        <w:numPr>
+          <w:ilvl w:val="0"/>
+          <w:numId w:val="6"/>
+        </w:numPr>
+        <w:spacing w:after="0"/>
+        <w:rPr>
+          <w:b/>
+          <w:bCs/>
+          <w:color w:val="EE0000"/>
+        </w:rPr>
+      </w:pPr>
+      <w:r>
+        <w:rPr>
+          <w:b/>
+          <w:bCs/>
+          <w:color w:val="EE0000"/>
+        </w:rPr>
+        <w:t>Data Migration PMC Command #</w:t>
+      </w:r>
+      <w:r>
+        <w:rPr>
+          <w:b/>
+          <w:bCs/>
+          <w:color w:val="EE0000"/>
+        </w:rPr>
+        <w:t>5</w:t>
+      </w:r>
+      <w:r>
+        <w:rPr>
+          <w:b/>
+          <w:bCs/>
+          <w:color w:val="EE0000"/>
+        </w:rPr>
+        <w:t>4</w:t>
+      </w:r>
+    </w:p>
+    <w:p>
+      <w:pPr>
+        <w:spacing w:after="0"/>
+        <w:ind w:left="1080"/>
+      </w:pPr>
+      <w:r>
+        <w:t>Add-Migration</w:t>
+      </w:r>
+      <w:r>
+        <w:t xml:space="preserve"> </w:t>
+      </w:r>
+      <w:proofErr w:type="spellStart"/>
+      <w:r>
+        <w:rPr>
+          <w:lang w:val="en-GB"/>
+        </w:rPr>
+        <w:t>SetNullable</w:t>
+      </w:r>
+      <w:r>
+        <w:rPr>
+          <w:lang w:val="en-GB"/>
+        </w:rPr>
+        <w:t>NextStepDefinitionId</w:t>
+      </w:r>
+      <w:proofErr w:type="spellEnd"/>
+      <w:r>
+        <w:t xml:space="preserve"> -Context </w:t>
+      </w:r>
+      <w:proofErr w:type="spellStart"/>
+      <w:r>
+        <w:t>AppDbContext</w:t>
+      </w:r>
+      <w:proofErr w:type="spellEnd"/>
+      <w:r>
+        <w:t xml:space="preserve"> </w:t>
+      </w:r>
+      <w:r>
+        <w:t xml:space="preserve">-Project </w:t>
+      </w:r>
+      <w:proofErr w:type="spellStart"/>
+      <w:r>
+        <w:t>KenHRApp.Infrastructure</w:t>
+      </w:r>
+      <w:proofErr w:type="spellEnd"/>
+      <w:r>
+        <w:t xml:space="preserve"> -</w:t>
+      </w:r>
+      <w:proofErr w:type="spellStart"/>
+      <w:r>
+        <w:t>StartupProject</w:t>
+      </w:r>
+      <w:proofErr w:type="spellEnd"/>
+      <w:r>
+        <w:t xml:space="preserve"> </w:t>
+      </w:r>
+      <w:proofErr w:type="spellStart"/>
+      <w:r>
+        <w:t>KenHRApp.Web</w:t>
+      </w:r>
+      <w:proofErr w:type="spellEnd"/>
+      <w:r>
+        <w:t xml:space="preserve"> -Verbose</w:t>
+      </w:r>
+    </w:p>
+    <w:p>
+      <w:pPr>
+        <w:spacing w:after="0"/>
+        <w:ind w:left="1080"/>
+      </w:pPr>
+    </w:p>
+    <w:p>
+      <w:pPr>
+        <w:spacing w:after="0"/>
+        <w:ind w:left="1080"/>
+      </w:pPr>
+      <w:r>
+        <w:t xml:space="preserve">Update-Database </w:t>
+      </w:r>
+      <w:r>
+        <w:t xml:space="preserve">-Context </w:t>
+      </w:r>
+      <w:proofErr w:type="spellStart"/>
+      <w:r>
+        <w:t>AppDbContext</w:t>
+      </w:r>
+      <w:proofErr w:type="spellEnd"/>
+    </w:p>
+    <w:p>
+      <w:pPr>
+        <w:spacing w:after="0"/>
+        <w:ind w:left="1080"/>
+        <w:rPr>
+          <w:u w:val="single"/>
+        </w:rPr>
+      </w:pPr>
+      <w:r>
+        <w:rPr>
+          <w:b/>
+          <w:bCs/>
+          <w:u w:val="single"/>
+        </w:rPr>
+        <w:t>Status:</w:t>
+      </w:r>
+      <w:r>
+        <w:rPr>
+          <w:u w:val="single"/>
+        </w:rPr>
+        <w:t xml:space="preserve"> </w:t>
+      </w:r>
+    </w:p>
+    <w:p>
+      <w:pPr>
+        <w:pStyle w:val="ListParagraph"/>
+        <w:numPr>
+          <w:ilvl w:val="0"/>
+          <w:numId w:val="9"/>
+        </w:numPr>
+        <w:spacing w:after="0"/>
+      </w:pPr>
+      <w:r>
+        <w:t>Development Database:</w:t>
+      </w:r>
+      <w:r>
+        <w:t xml:space="preserve"> </w:t>
+      </w:r>
+      <w:r>
+        <w:rPr>
+          <w:color w:val="00B050"/>
+        </w:rPr>
+        <w:t>Pending</w:t>
       </w:r>
     </w:p>
     <w:p>
@@ -10956,7 +11507,6 @@
           <w:color w:val="EE0000"/>
           <w:lang w:val="en-GB"/>
         </w:rPr>
-        <w:lastRenderedPageBreak/>
         <w:t xml:space="preserve">Script-Migration -Idempotent </w:t>
       </w:r>
       <w:r>
@@ -11133,7 +11683,16 @@
           <w:bCs/>
           <w:color w:val="EE0000"/>
         </w:rPr>
-        <w:t>C:\NET Projects\</w:t>
+        <w:t xml:space="preserve">C:\NET </w:t>
+      </w:r>
+      <w:r>
+        <w:rPr>
+          <w:b/>
+          <w:bCs/>
+          <w:color w:val="EE0000"/>
+        </w:rPr>
+        <w:lastRenderedPageBreak/>
+        <w:t>Projects\</w:t>
       </w:r>
       <w:proofErr w:type="spellStart"/>
       <w:r>
@@ -11626,7 +12185,6 @@
         </w:rPr>
       </w:pPr>
       <w:r>
-        <w:lastRenderedPageBreak/>
         <w:t xml:space="preserve">Script-Migration -From </w:t>
       </w:r>
       <w:proofErr w:type="spellStart"/>
@@ -11810,9 +12368,17 @@
         <w:rPr>
           <w:lang w:val="en-GB"/>
         </w:rPr>
-        <w:t>” to  “</w:t>
-      </w:r>
-      <w:proofErr w:type="spellStart"/>
+        <w:t xml:space="preserve">” </w:t>
+      </w:r>
+      <w:proofErr w:type="gramStart"/>
+      <w:r>
+        <w:rPr>
+          <w:lang w:val="en-GB"/>
+        </w:rPr>
+        <w:t>to  “</w:t>
+      </w:r>
+      <w:proofErr w:type="spellStart"/>
+      <w:proofErr w:type="gramEnd"/>
       <w:r>
         <w:t>UpdateFieldsEmployeeModel</w:t>
       </w:r>
@@ -11848,6 +12414,7 @@
         </w:rPr>
       </w:pPr>
       <w:r>
+        <w:lastRenderedPageBreak/>
         <w:t xml:space="preserve">Script-Migration -From </w:t>
       </w:r>
       <w:proofErr w:type="spellStart"/>
@@ -12024,9 +12591,17 @@
         <w:rPr>
           <w:lang w:val="en-GB"/>
         </w:rPr>
-        <w:t>” to  “</w:t>
-      </w:r>
-      <w:proofErr w:type="spellStart"/>
+        <w:t xml:space="preserve">” </w:t>
+      </w:r>
+      <w:proofErr w:type="gramStart"/>
+      <w:r>
+        <w:rPr>
+          <w:lang w:val="en-GB"/>
+        </w:rPr>
+        <w:t>to  “</w:t>
+      </w:r>
+      <w:proofErr w:type="spellStart"/>
+      <w:proofErr w:type="gramEnd"/>
       <w:r>
         <w:t>UpdatePresentPermanentCountry</w:t>
       </w:r>
@@ -12248,8 +12823,16 @@
         <w:rPr>
           <w:lang w:val="en-GB"/>
         </w:rPr>
-        <w:t>” to  “</w:t>
-      </w:r>
+        <w:t xml:space="preserve">” </w:t>
+      </w:r>
+      <w:proofErr w:type="gramStart"/>
+      <w:r>
+        <w:rPr>
+          <w:lang w:val="en-GB"/>
+        </w:rPr>
+        <w:t>to  “</w:t>
+      </w:r>
+      <w:proofErr w:type="gramEnd"/>
       <w:r>
         <w:t>Update</w:t>
       </w:r>
@@ -12513,9 +13096,17 @@
         <w:rPr>
           <w:lang w:val="en-GB"/>
         </w:rPr>
-        <w:t>” to  “</w:t>
-      </w:r>
-      <w:proofErr w:type="spellStart"/>
+        <w:t xml:space="preserve">” </w:t>
+      </w:r>
+      <w:proofErr w:type="gramStart"/>
+      <w:r>
+        <w:rPr>
+          <w:lang w:val="en-GB"/>
+        </w:rPr>
+        <w:t>to  “</w:t>
+      </w:r>
+      <w:proofErr w:type="spellStart"/>
+      <w:proofErr w:type="gramEnd"/>
       <w:r>
         <w:rPr>
           <w:lang w:val="en-GB"/>
@@ -12745,9 +13336,17 @@
         <w:rPr>
           <w:lang w:val="en-GB"/>
         </w:rPr>
-        <w:t>” to  “</w:t>
-      </w:r>
-      <w:proofErr w:type="spellStart"/>
+        <w:t xml:space="preserve">” </w:t>
+      </w:r>
+      <w:proofErr w:type="gramStart"/>
+      <w:r>
+        <w:rPr>
+          <w:lang w:val="en-GB"/>
+        </w:rPr>
+        <w:t>to  “</w:t>
+      </w:r>
+      <w:proofErr w:type="spellStart"/>
+      <w:proofErr w:type="gramEnd"/>
       <w:r>
         <w:t>UpdateQualificationEntity</w:t>
       </w:r>
@@ -12973,9 +13572,17 @@
         <w:rPr>
           <w:lang w:val="en-GB"/>
         </w:rPr>
-        <w:t>” to  “</w:t>
-      </w:r>
-      <w:proofErr w:type="spellStart"/>
+        <w:t xml:space="preserve">” </w:t>
+      </w:r>
+      <w:proofErr w:type="gramStart"/>
+      <w:r>
+        <w:rPr>
+          <w:lang w:val="en-GB"/>
+        </w:rPr>
+        <w:t>to  “</w:t>
+      </w:r>
+      <w:proofErr w:type="spellStart"/>
+      <w:proofErr w:type="gramEnd"/>
       <w:r>
         <w:t>UpdateEmployeeSkillEntity</w:t>
       </w:r>
@@ -13198,9 +13805,17 @@
         <w:rPr>
           <w:lang w:val="en-GB"/>
         </w:rPr>
-        <w:t>” to  “</w:t>
-      </w:r>
-      <w:proofErr w:type="spellStart"/>
+        <w:t xml:space="preserve">” </w:t>
+      </w:r>
+      <w:proofErr w:type="gramStart"/>
+      <w:r>
+        <w:rPr>
+          <w:lang w:val="en-GB"/>
+        </w:rPr>
+        <w:t>to  “</w:t>
+      </w:r>
+      <w:proofErr w:type="spellStart"/>
+      <w:proofErr w:type="gramEnd"/>
       <w:r>
         <w:t>UpdateLanguageSkillEntity</w:t>
       </w:r>
@@ -13225,7 +13840,6 @@
           <w:b/>
           <w:bCs/>
         </w:rPr>
-        <w:lastRenderedPageBreak/>
         <w:t>PMC script:</w:t>
       </w:r>
     </w:p>
@@ -13424,9 +14038,17 @@
         <w:rPr>
           <w:lang w:val="en-GB"/>
         </w:rPr>
-        <w:t>” to  “</w:t>
-      </w:r>
-      <w:proofErr w:type="spellStart"/>
+        <w:t xml:space="preserve">” </w:t>
+      </w:r>
+      <w:proofErr w:type="gramStart"/>
+      <w:r>
+        <w:rPr>
+          <w:lang w:val="en-GB"/>
+        </w:rPr>
+        <w:t>to  “</w:t>
+      </w:r>
+      <w:proofErr w:type="spellStart"/>
+      <w:proofErr w:type="gramEnd"/>
       <w:r>
         <w:t>UpdateEmployeeCertification</w:t>
       </w:r>
@@ -13451,6 +14073,7 @@
           <w:b/>
           <w:bCs/>
         </w:rPr>
+        <w:lastRenderedPageBreak/>
         <w:t>PMC script:</w:t>
       </w:r>
     </w:p>
@@ -13638,9 +14261,17 @@
         <w:rPr>
           <w:lang w:val="en-GB"/>
         </w:rPr>
-        <w:t>” to  “</w:t>
-      </w:r>
-      <w:proofErr w:type="spellStart"/>
+        <w:t xml:space="preserve">” </w:t>
+      </w:r>
+      <w:proofErr w:type="gramStart"/>
+      <w:r>
+        <w:rPr>
+          <w:lang w:val="en-GB"/>
+        </w:rPr>
+        <w:t>to  “</w:t>
+      </w:r>
+      <w:proofErr w:type="spellStart"/>
+      <w:proofErr w:type="gramEnd"/>
       <w:r>
         <w:t>ChangeEmployeeCertificationStateCity</w:t>
       </w:r>
@@ -13852,9 +14483,17 @@
         <w:rPr>
           <w:lang w:val="en-GB"/>
         </w:rPr>
-        <w:t>” to  “</w:t>
-      </w:r>
-      <w:proofErr w:type="spellStart"/>
+        <w:t xml:space="preserve">” </w:t>
+      </w:r>
+      <w:proofErr w:type="gramStart"/>
+      <w:r>
+        <w:rPr>
+          <w:lang w:val="en-GB"/>
+        </w:rPr>
+        <w:t>to  “</w:t>
+      </w:r>
+      <w:proofErr w:type="spellStart"/>
+      <w:proofErr w:type="gramEnd"/>
       <w:r>
         <w:t>UpdateFamilyVisa</w:t>
       </w:r>
@@ -14049,7 +14688,6 @@
           <w:bCs/>
           <w:lang w:val="en-GB"/>
         </w:rPr>
-        <w:lastRenderedPageBreak/>
         <w:t>Description:</w:t>
       </w:r>
       <w:r>
@@ -14067,9 +14705,17 @@
         <w:rPr>
           <w:lang w:val="en-GB"/>
         </w:rPr>
-        <w:t>” to  “</w:t>
-      </w:r>
-      <w:proofErr w:type="spellStart"/>
+        <w:t xml:space="preserve">” </w:t>
+      </w:r>
+      <w:proofErr w:type="gramStart"/>
+      <w:r>
+        <w:rPr>
+          <w:lang w:val="en-GB"/>
+        </w:rPr>
+        <w:t>to  “</w:t>
+      </w:r>
+      <w:proofErr w:type="spellStart"/>
+      <w:proofErr w:type="gramEnd"/>
       <w:r>
         <w:rPr>
           <w:lang w:val="en-GB"/>
@@ -14285,9 +14931,17 @@
         <w:rPr>
           <w:lang w:val="en-GB"/>
         </w:rPr>
-        <w:t>” to  “</w:t>
-      </w:r>
-      <w:proofErr w:type="spellStart"/>
+        <w:t xml:space="preserve">” </w:t>
+      </w:r>
+      <w:proofErr w:type="gramStart"/>
+      <w:r>
+        <w:rPr>
+          <w:lang w:val="en-GB"/>
+        </w:rPr>
+        <w:t>to  “</w:t>
+      </w:r>
+      <w:proofErr w:type="spellStart"/>
+      <w:proofErr w:type="gramEnd"/>
       <w:r>
         <w:rPr>
           <w:lang w:val="en-GB"/>
@@ -14321,6 +14975,7 @@
           <w:b/>
           <w:bCs/>
         </w:rPr>
+        <w:lastRenderedPageBreak/>
         <w:t>PMC script:</w:t>
       </w:r>
     </w:p>
@@ -14521,9 +15176,17 @@
         <w:rPr>
           <w:lang w:val="en-GB"/>
         </w:rPr>
-        <w:t>” to  “</w:t>
-      </w:r>
-      <w:proofErr w:type="spellStart"/>
+        <w:t xml:space="preserve">” </w:t>
+      </w:r>
+      <w:proofErr w:type="gramStart"/>
+      <w:r>
+        <w:rPr>
+          <w:lang w:val="en-GB"/>
+        </w:rPr>
+        <w:t>to  “</w:t>
+      </w:r>
+      <w:proofErr w:type="spellStart"/>
+      <w:proofErr w:type="gramEnd"/>
       <w:r>
         <w:rPr>
           <w:lang w:val="en-GB"/>
@@ -14744,9 +15407,17 @@
         <w:rPr>
           <w:lang w:val="en-GB"/>
         </w:rPr>
-        <w:t>” to  “</w:t>
-      </w:r>
-      <w:proofErr w:type="spellStart"/>
+        <w:t xml:space="preserve">” </w:t>
+      </w:r>
+      <w:proofErr w:type="gramStart"/>
+      <w:r>
+        <w:rPr>
+          <w:lang w:val="en-GB"/>
+        </w:rPr>
+        <w:t>to  “</w:t>
+      </w:r>
+      <w:proofErr w:type="spellStart"/>
+      <w:proofErr w:type="gramEnd"/>
       <w:r>
         <w:rPr>
           <w:lang w:val="en-GB"/>
@@ -14967,9 +15638,17 @@
         <w:rPr>
           <w:lang w:val="en-GB"/>
         </w:rPr>
-        <w:t>” to  “</w:t>
-      </w:r>
-      <w:proofErr w:type="spellStart"/>
+        <w:t xml:space="preserve">” </w:t>
+      </w:r>
+      <w:proofErr w:type="gramStart"/>
+      <w:r>
+        <w:rPr>
+          <w:lang w:val="en-GB"/>
+        </w:rPr>
+        <w:t>to  “</w:t>
+      </w:r>
+      <w:proofErr w:type="spellStart"/>
+      <w:proofErr w:type="gramEnd"/>
       <w:r>
         <w:t>RenameCompanyBranch</w:t>
       </w:r>
@@ -15142,6 +15821,7 @@
           <w:color w:val="EE0000"/>
           <w:lang w:val="en-GB"/>
         </w:rPr>
+        <w:lastRenderedPageBreak/>
         <w:t>Migration script #</w:t>
       </w:r>
       <w:r>
@@ -15184,9 +15864,17 @@
         <w:rPr>
           <w:lang w:val="en-GB"/>
         </w:rPr>
-        <w:t>” to  “</w:t>
-      </w:r>
-      <w:proofErr w:type="spellStart"/>
+        <w:t xml:space="preserve">” </w:t>
+      </w:r>
+      <w:proofErr w:type="gramStart"/>
+      <w:r>
+        <w:rPr>
+          <w:lang w:val="en-GB"/>
+        </w:rPr>
+        <w:t>to  “</w:t>
+      </w:r>
+      <w:proofErr w:type="spellStart"/>
+      <w:proofErr w:type="gramEnd"/>
       <w:r>
         <w:rPr>
           <w:lang w:val="en-GB"/>
@@ -15278,6 +15966,7 @@
       <w:r>
         <w:t xml:space="preserve"> -Output </w:t>
       </w:r>
+      <w:proofErr w:type="gramStart"/>
       <w:r>
         <w:rPr>
           <w:lang w:val="en-GB"/>
@@ -15298,6 +15987,7 @@
         </w:rPr>
         <w:t>\</w:t>
       </w:r>
+      <w:proofErr w:type="gramEnd"/>
       <w:r>
         <w:rPr>
           <w:lang w:val="en-GB"/>
@@ -15432,9 +16122,17 @@
         <w:rPr>
           <w:lang w:val="en-GB"/>
         </w:rPr>
-        <w:t>” to  “</w:t>
-      </w:r>
-      <w:proofErr w:type="spellStart"/>
+        <w:t xml:space="preserve">” </w:t>
+      </w:r>
+      <w:proofErr w:type="gramStart"/>
+      <w:r>
+        <w:rPr>
+          <w:lang w:val="en-GB"/>
+        </w:rPr>
+        <w:t>to  “</w:t>
+      </w:r>
+      <w:proofErr w:type="spellStart"/>
+      <w:proofErr w:type="gramEnd"/>
       <w:r>
         <w:rPr>
           <w:lang w:val="en-GB"/>
@@ -15523,6 +16221,7 @@
       <w:r>
         <w:t xml:space="preserve"> -Output </w:t>
       </w:r>
+      <w:proofErr w:type="gramStart"/>
       <w:r>
         <w:rPr>
           <w:lang w:val="en-GB"/>
@@ -15543,6 +16242,7 @@
         </w:rPr>
         <w:t>\</w:t>
       </w:r>
+      <w:proofErr w:type="gramEnd"/>
       <w:r>
         <w:rPr>
           <w:lang w:val="en-GB"/>
@@ -15676,9 +16376,17 @@
         <w:rPr>
           <w:lang w:val="en-GB"/>
         </w:rPr>
-        <w:t>” to  “</w:t>
-      </w:r>
-      <w:proofErr w:type="spellStart"/>
+        <w:t xml:space="preserve">” </w:t>
+      </w:r>
+      <w:proofErr w:type="gramStart"/>
+      <w:r>
+        <w:rPr>
+          <w:lang w:val="en-GB"/>
+        </w:rPr>
+        <w:t>to  “</w:t>
+      </w:r>
+      <w:proofErr w:type="spellStart"/>
+      <w:proofErr w:type="gramEnd"/>
       <w:r>
         <w:rPr>
           <w:lang w:val="en-GB"/>
@@ -15717,7 +16425,6 @@
         </w:rPr>
       </w:pPr>
       <w:r>
-        <w:lastRenderedPageBreak/>
         <w:t xml:space="preserve">Script-Migration -From </w:t>
       </w:r>
       <w:proofErr w:type="spellStart"/>
@@ -15911,9 +16618,17 @@
         <w:rPr>
           <w:lang w:val="en-GB"/>
         </w:rPr>
-        <w:t>” to  “</w:t>
-      </w:r>
-      <w:proofErr w:type="spellStart"/>
+        <w:t xml:space="preserve">” </w:t>
+      </w:r>
+      <w:proofErr w:type="gramStart"/>
+      <w:r>
+        <w:rPr>
+          <w:lang w:val="en-GB"/>
+        </w:rPr>
+        <w:t>to  “</w:t>
+      </w:r>
+      <w:proofErr w:type="spellStart"/>
+      <w:proofErr w:type="gramEnd"/>
       <w:r>
         <w:rPr>
           <w:lang w:val="en-GB"/>
@@ -15941,6 +16656,7 @@
           <w:b/>
           <w:bCs/>
         </w:rPr>
+        <w:lastRenderedPageBreak/>
         <w:t>PMC script:</w:t>
       </w:r>
     </w:p>
@@ -16129,9 +16845,17 @@
         <w:rPr>
           <w:lang w:val="en-GB"/>
         </w:rPr>
-        <w:t>” to  “</w:t>
-      </w:r>
-      <w:proofErr w:type="spellStart"/>
+        <w:t xml:space="preserve">” </w:t>
+      </w:r>
+      <w:proofErr w:type="gramStart"/>
+      <w:r>
+        <w:rPr>
+          <w:lang w:val="en-GB"/>
+        </w:rPr>
+        <w:t>to  “</w:t>
+      </w:r>
+      <w:proofErr w:type="spellStart"/>
+      <w:proofErr w:type="gramEnd"/>
       <w:r>
         <w:rPr>
           <w:lang w:val="en-GB"/>
@@ -16395,9 +17119,17 @@
         <w:rPr>
           <w:lang w:val="en-GB"/>
         </w:rPr>
-        <w:t>” to  “</w:t>
-      </w:r>
-      <w:proofErr w:type="spellStart"/>
+        <w:t xml:space="preserve">” </w:t>
+      </w:r>
+      <w:proofErr w:type="gramStart"/>
+      <w:r>
+        <w:rPr>
+          <w:lang w:val="en-GB"/>
+        </w:rPr>
+        <w:t>to  “</w:t>
+      </w:r>
+      <w:proofErr w:type="spellStart"/>
+      <w:proofErr w:type="gramEnd"/>
       <w:r>
         <w:rPr>
           <w:lang w:val="en-GB"/>
@@ -16614,7 +17346,6 @@
           <w:bCs/>
           <w:lang w:val="en-GB"/>
         </w:rPr>
-        <w:lastRenderedPageBreak/>
         <w:t>Description:</w:t>
       </w:r>
       <w:r>
@@ -16635,9 +17366,17 @@
         <w:rPr>
           <w:lang w:val="en-GB"/>
         </w:rPr>
-        <w:t>” to  “</w:t>
-      </w:r>
-      <w:proofErr w:type="spellStart"/>
+        <w:t xml:space="preserve">” </w:t>
+      </w:r>
+      <w:proofErr w:type="gramStart"/>
+      <w:r>
+        <w:rPr>
+          <w:lang w:val="en-GB"/>
+        </w:rPr>
+        <w:t>to  “</w:t>
+      </w:r>
+      <w:proofErr w:type="spellStart"/>
+      <w:proofErr w:type="gramEnd"/>
       <w:r>
         <w:rPr>
           <w:lang w:val="en-GB"/>
@@ -16862,9 +17601,17 @@
         <w:rPr>
           <w:lang w:val="en-GB"/>
         </w:rPr>
-        <w:t>” to  “</w:t>
-      </w:r>
-      <w:proofErr w:type="spellStart"/>
+        <w:t xml:space="preserve">” </w:t>
+      </w:r>
+      <w:proofErr w:type="gramStart"/>
+      <w:r>
+        <w:rPr>
+          <w:lang w:val="en-GB"/>
+        </w:rPr>
+        <w:t>to  “</w:t>
+      </w:r>
+      <w:proofErr w:type="spellStart"/>
+      <w:proofErr w:type="gramEnd"/>
       <w:r>
         <w:rPr>
           <w:lang w:val="en-GB"/>
@@ -16892,6 +17639,7 @@
           <w:b/>
           <w:bCs/>
         </w:rPr>
+        <w:lastRenderedPageBreak/>
         <w:t>PMC script:</w:t>
       </w:r>
     </w:p>
@@ -17094,9 +17842,17 @@
         <w:rPr>
           <w:lang w:val="en-GB"/>
         </w:rPr>
-        <w:t>” to  “</w:t>
-      </w:r>
-      <w:proofErr w:type="spellStart"/>
+        <w:t xml:space="preserve">” </w:t>
+      </w:r>
+      <w:proofErr w:type="gramStart"/>
+      <w:r>
+        <w:rPr>
+          <w:lang w:val="en-GB"/>
+        </w:rPr>
+        <w:t>to  “</w:t>
+      </w:r>
+      <w:proofErr w:type="spellStart"/>
+      <w:proofErr w:type="gramEnd"/>
       <w:r>
         <w:rPr>
           <w:lang w:val="en-GB"/>
@@ -17324,9 +18080,17 @@
         <w:rPr>
           <w:lang w:val="en-GB"/>
         </w:rPr>
-        <w:t>” to  “</w:t>
-      </w:r>
-      <w:proofErr w:type="spellStart"/>
+        <w:t xml:space="preserve">” </w:t>
+      </w:r>
+      <w:proofErr w:type="gramStart"/>
+      <w:r>
+        <w:rPr>
+          <w:lang w:val="en-GB"/>
+        </w:rPr>
+        <w:t>to  “</w:t>
+      </w:r>
+      <w:proofErr w:type="spellStart"/>
+      <w:proofErr w:type="gramEnd"/>
       <w:r>
         <w:rPr>
           <w:lang w:val="en-GB"/>
@@ -17570,9 +18334,17 @@
         <w:rPr>
           <w:lang w:val="en-GB"/>
         </w:rPr>
-        <w:t>” to  “</w:t>
-      </w:r>
-      <w:proofErr w:type="spellStart"/>
+        <w:t xml:space="preserve">” </w:t>
+      </w:r>
+      <w:proofErr w:type="gramStart"/>
+      <w:r>
+        <w:rPr>
+          <w:lang w:val="en-GB"/>
+        </w:rPr>
+        <w:t>to  “</w:t>
+      </w:r>
+      <w:proofErr w:type="spellStart"/>
+      <w:proofErr w:type="gramEnd"/>
       <w:r>
         <w:rPr>
           <w:lang w:val="en-GB"/>
@@ -17752,6 +18524,7 @@
           <w:color w:val="EE0000"/>
           <w:lang w:val="en-GB"/>
         </w:rPr>
+        <w:lastRenderedPageBreak/>
         <w:t>Migration script #</w:t>
       </w:r>
       <w:r>
@@ -17797,9 +18570,17 @@
         <w:rPr>
           <w:lang w:val="en-GB"/>
         </w:rPr>
-        <w:t>” to  “</w:t>
-      </w:r>
-      <w:proofErr w:type="spellStart"/>
+        <w:t xml:space="preserve">” </w:t>
+      </w:r>
+      <w:proofErr w:type="gramStart"/>
+      <w:r>
+        <w:rPr>
+          <w:lang w:val="en-GB"/>
+        </w:rPr>
+        <w:t>to  “</w:t>
+      </w:r>
+      <w:proofErr w:type="spellStart"/>
+      <w:proofErr w:type="gramEnd"/>
       <w:r>
         <w:rPr>
           <w:lang w:val="en-GB"/>
@@ -18032,9 +18813,17 @@
         <w:rPr>
           <w:lang w:val="en-GB"/>
         </w:rPr>
-        <w:t>” to  “</w:t>
-      </w:r>
-      <w:proofErr w:type="spellStart"/>
+        <w:t xml:space="preserve">” </w:t>
+      </w:r>
+      <w:proofErr w:type="gramStart"/>
+      <w:r>
+        <w:rPr>
+          <w:lang w:val="en-GB"/>
+        </w:rPr>
+        <w:t>to  “</w:t>
+      </w:r>
+      <w:proofErr w:type="spellStart"/>
+      <w:proofErr w:type="gramEnd"/>
       <w:r>
         <w:rPr>
           <w:lang w:val="en-GB"/>
@@ -18265,9 +19054,17 @@
         <w:rPr>
           <w:lang w:val="en-GB"/>
         </w:rPr>
-        <w:t>” to  “</w:t>
-      </w:r>
-      <w:proofErr w:type="spellStart"/>
+        <w:t xml:space="preserve">” </w:t>
+      </w:r>
+      <w:proofErr w:type="gramStart"/>
+      <w:r>
+        <w:rPr>
+          <w:lang w:val="en-GB"/>
+        </w:rPr>
+        <w:t>to  “</w:t>
+      </w:r>
+      <w:proofErr w:type="spellStart"/>
+      <w:proofErr w:type="gramEnd"/>
       <w:r>
         <w:rPr>
           <w:lang w:val="en-GB"/>
@@ -18306,7 +19103,6 @@
         </w:rPr>
       </w:pPr>
       <w:r>
-        <w:lastRenderedPageBreak/>
         <w:t xml:space="preserve">Script-Migration -From </w:t>
       </w:r>
       <w:proofErr w:type="spellStart"/>
@@ -18499,9 +19295,17 @@
         <w:rPr>
           <w:lang w:val="en-GB"/>
         </w:rPr>
-        <w:t>” to  “</w:t>
-      </w:r>
-      <w:proofErr w:type="spellStart"/>
+        <w:t xml:space="preserve">” </w:t>
+      </w:r>
+      <w:proofErr w:type="gramStart"/>
+      <w:r>
+        <w:rPr>
+          <w:lang w:val="en-GB"/>
+        </w:rPr>
+        <w:t>to  “</w:t>
+      </w:r>
+      <w:proofErr w:type="spellStart"/>
+      <w:proofErr w:type="gramEnd"/>
       <w:r>
         <w:t>AddAutoIDToAttendanceTimesheet</w:t>
       </w:r>
@@ -18644,6 +19448,7 @@
         <w:rPr>
           <w:lang w:val="en-GB"/>
         </w:rPr>
+        <w:lastRenderedPageBreak/>
         <w:t>Status:</w:t>
       </w:r>
       <w:r>
@@ -18731,9 +19536,17 @@
         <w:rPr>
           <w:lang w:val="en-GB"/>
         </w:rPr>
-        <w:t>” to  “</w:t>
-      </w:r>
-      <w:proofErr w:type="spellStart"/>
+        <w:t xml:space="preserve">” </w:t>
+      </w:r>
+      <w:proofErr w:type="gramStart"/>
+      <w:r>
+        <w:rPr>
+          <w:lang w:val="en-GB"/>
+        </w:rPr>
+        <w:t>to  “</w:t>
+      </w:r>
+      <w:proofErr w:type="spellStart"/>
+      <w:proofErr w:type="gramEnd"/>
       <w:r>
         <w:rPr>
           <w:lang w:val="en-GB"/>
@@ -18958,9 +19771,17 @@
         <w:rPr>
           <w:lang w:val="en-GB"/>
         </w:rPr>
-        <w:t>” to  “</w:t>
-      </w:r>
-      <w:proofErr w:type="spellStart"/>
+        <w:t xml:space="preserve">” </w:t>
+      </w:r>
+      <w:proofErr w:type="gramStart"/>
+      <w:r>
+        <w:rPr>
+          <w:lang w:val="en-GB"/>
+        </w:rPr>
+        <w:t>to  “</w:t>
+      </w:r>
+      <w:proofErr w:type="spellStart"/>
+      <w:proofErr w:type="gramEnd"/>
       <w:r>
         <w:rPr>
           <w:lang w:val="en-GB"/>
@@ -19191,9 +20012,17 @@
         <w:rPr>
           <w:lang w:val="en-GB"/>
         </w:rPr>
-        <w:t>” to  “</w:t>
-      </w:r>
-      <w:proofErr w:type="spellStart"/>
+        <w:t xml:space="preserve">” </w:t>
+      </w:r>
+      <w:proofErr w:type="gramStart"/>
+      <w:r>
+        <w:rPr>
+          <w:lang w:val="en-GB"/>
+        </w:rPr>
+        <w:t>to  “</w:t>
+      </w:r>
+      <w:proofErr w:type="spellStart"/>
+      <w:proofErr w:type="gramEnd"/>
       <w:r>
         <w:rPr>
           <w:lang w:val="en-GB"/>
@@ -19232,7 +20061,6 @@
         </w:rPr>
       </w:pPr>
       <w:r>
-        <w:lastRenderedPageBreak/>
         <w:t xml:space="preserve">Script-Migration -From </w:t>
       </w:r>
       <w:proofErr w:type="spellStart"/>
@@ -19440,9 +20268,17 @@
         <w:rPr>
           <w:lang w:val="en-GB"/>
         </w:rPr>
-        <w:t>” to  “</w:t>
-      </w:r>
-      <w:proofErr w:type="spellStart"/>
+        <w:t xml:space="preserve">” </w:t>
+      </w:r>
+      <w:proofErr w:type="gramStart"/>
+      <w:r>
+        <w:rPr>
+          <w:lang w:val="en-GB"/>
+        </w:rPr>
+        <w:t>to  “</w:t>
+      </w:r>
+      <w:proofErr w:type="spellStart"/>
+      <w:proofErr w:type="gramEnd"/>
       <w:r>
         <w:rPr>
           <w:lang w:val="en-GB"/>
@@ -19583,6 +20419,7 @@
         <w:rPr>
           <w:lang w:val="en-GB"/>
         </w:rPr>
+        <w:lastRenderedPageBreak/>
         <w:t>Status:</w:t>
       </w:r>
       <w:r>
@@ -19673,9 +20510,17 @@
         <w:rPr>
           <w:lang w:val="en-GB"/>
         </w:rPr>
-        <w:t>” to  “</w:t>
-      </w:r>
-      <w:proofErr w:type="spellStart"/>
+        <w:t xml:space="preserve">” </w:t>
+      </w:r>
+      <w:proofErr w:type="gramStart"/>
+      <w:r>
+        <w:rPr>
+          <w:lang w:val="en-GB"/>
+        </w:rPr>
+        <w:t>to  “</w:t>
+      </w:r>
+      <w:proofErr w:type="spellStart"/>
+      <w:proofErr w:type="gramEnd"/>
       <w:r>
         <w:rPr>
           <w:lang w:val="en-GB"/>
@@ -19900,9 +20745,17 @@
         <w:rPr>
           <w:lang w:val="en-GB"/>
         </w:rPr>
-        <w:t>” to  “</w:t>
-      </w:r>
-      <w:proofErr w:type="spellStart"/>
+        <w:t xml:space="preserve">” </w:t>
+      </w:r>
+      <w:proofErr w:type="gramStart"/>
+      <w:r>
+        <w:rPr>
+          <w:lang w:val="en-GB"/>
+        </w:rPr>
+        <w:t>to  “</w:t>
+      </w:r>
+      <w:proofErr w:type="spellStart"/>
+      <w:proofErr w:type="gramEnd"/>
       <w:r>
         <w:t>AddAuthenticationTokenFields</w:t>
       </w:r>
@@ -20125,9 +20978,17 @@
         <w:rPr>
           <w:lang w:val="en-GB"/>
         </w:rPr>
-        <w:t>” to  “</w:t>
-      </w:r>
-      <w:proofErr w:type="spellStart"/>
+        <w:t xml:space="preserve">” </w:t>
+      </w:r>
+      <w:proofErr w:type="gramStart"/>
+      <w:r>
+        <w:rPr>
+          <w:lang w:val="en-GB"/>
+        </w:rPr>
+        <w:t>to  “</w:t>
+      </w:r>
+      <w:proofErr w:type="spellStart"/>
+      <w:proofErr w:type="gramEnd"/>
       <w:r>
         <w:t>AddLeaveAttachment</w:t>
       </w:r>
@@ -20264,7 +21125,6 @@
         <w:rPr>
           <w:lang w:val="en-GB"/>
         </w:rPr>
-        <w:lastRenderedPageBreak/>
         <w:t>Status:</w:t>
       </w:r>
       <w:r>
@@ -20365,9 +21225,17 @@
         <w:rPr>
           <w:lang w:val="en-GB"/>
         </w:rPr>
-        <w:t>” to  “</w:t>
-      </w:r>
-      <w:proofErr w:type="spellStart"/>
+        <w:t xml:space="preserve">” </w:t>
+      </w:r>
+      <w:proofErr w:type="gramStart"/>
+      <w:r>
+        <w:rPr>
+          <w:lang w:val="en-GB"/>
+        </w:rPr>
+        <w:t>to  “</w:t>
+      </w:r>
+      <w:proofErr w:type="spellStart"/>
+      <w:proofErr w:type="gramEnd"/>
       <w:r>
         <w:t>AddFieldsLeaveRequisitionWF</w:t>
       </w:r>
@@ -20579,6 +21447,7 @@
           <w:bCs/>
           <w:lang w:val="en-GB"/>
         </w:rPr>
+        <w:lastRenderedPageBreak/>
         <w:t>Description:</w:t>
       </w:r>
       <w:r>
@@ -20596,9 +21465,17 @@
         <w:rPr>
           <w:lang w:val="en-GB"/>
         </w:rPr>
-        <w:t>” to  “</w:t>
-      </w:r>
-      <w:proofErr w:type="spellStart"/>
+        <w:t xml:space="preserve">” </w:t>
+      </w:r>
+      <w:proofErr w:type="gramStart"/>
+      <w:r>
+        <w:rPr>
+          <w:lang w:val="en-GB"/>
+        </w:rPr>
+        <w:t>to  “</w:t>
+      </w:r>
+      <w:proofErr w:type="spellStart"/>
+      <w:proofErr w:type="gramEnd"/>
       <w:r>
         <w:t>ModifyRelationLeaveAttachment</w:t>
       </w:r>
@@ -20830,9 +21707,17 @@
         <w:rPr>
           <w:lang w:val="en-GB"/>
         </w:rPr>
-        <w:t>” to  “</w:t>
-      </w:r>
-      <w:proofErr w:type="spellStart"/>
+        <w:t xml:space="preserve">” </w:t>
+      </w:r>
+      <w:proofErr w:type="gramStart"/>
+      <w:r>
+        <w:rPr>
+          <w:lang w:val="en-GB"/>
+        </w:rPr>
+        <w:t>to  “</w:t>
+      </w:r>
+      <w:proofErr w:type="spellStart"/>
+      <w:proofErr w:type="gramEnd"/>
       <w:r>
         <w:rPr>
           <w:lang w:val="en-GB"/>
@@ -21068,9 +21953,17 @@
         <w:rPr>
           <w:lang w:val="en-GB"/>
         </w:rPr>
-        <w:t>” to  “</w:t>
-      </w:r>
-      <w:proofErr w:type="spellStart"/>
+        <w:t xml:space="preserve">” </w:t>
+      </w:r>
+      <w:proofErr w:type="gramStart"/>
+      <w:r>
+        <w:rPr>
+          <w:lang w:val="en-GB"/>
+        </w:rPr>
+        <w:t>to  “</w:t>
+      </w:r>
+      <w:proofErr w:type="spellStart"/>
+      <w:proofErr w:type="gramEnd"/>
       <w:r>
         <w:rPr>
           <w:lang w:val="en-GB"/>
@@ -21255,33 +22148,6 @@
         </w:rPr>
         <w:t>-2026</w:t>
       </w:r>
-    </w:p>
-    <w:p>
-      <w:pPr>
-        <w:spacing w:after="0"/>
-        <w:ind w:left="720"/>
-        <w:rPr>
-          <w:color w:val="00B050"/>
-        </w:rPr>
-      </w:pPr>
-    </w:p>
-    <w:p>
-      <w:pPr>
-        <w:spacing w:after="0"/>
-        <w:ind w:left="720"/>
-        <w:rPr>
-          <w:color w:val="00B050"/>
-        </w:rPr>
-      </w:pPr>
-    </w:p>
-    <w:p>
-      <w:pPr>
-        <w:spacing w:after="0"/>
-        <w:ind w:left="720"/>
-        <w:rPr>
-          <w:color w:val="00B050"/>
-        </w:rPr>
-      </w:pPr>
     </w:p>
     <w:p>
       <w:pPr>
@@ -21314,7 +22180,6 @@
           <w:color w:val="EE0000"/>
           <w:lang w:val="en-GB"/>
         </w:rPr>
-        <w:lastRenderedPageBreak/>
         <w:t>Migration script #</w:t>
       </w:r>
       <w:r>
@@ -21361,9 +22226,17 @@
         <w:rPr>
           <w:lang w:val="en-GB"/>
         </w:rPr>
-        <w:t>” to  “</w:t>
-      </w:r>
-      <w:proofErr w:type="spellStart"/>
+        <w:t xml:space="preserve">” </w:t>
+      </w:r>
+      <w:proofErr w:type="gramStart"/>
+      <w:r>
+        <w:rPr>
+          <w:lang w:val="en-GB"/>
+        </w:rPr>
+        <w:t>to  “</w:t>
+      </w:r>
+      <w:proofErr w:type="spellStart"/>
+      <w:proofErr w:type="gramEnd"/>
       <w:r>
         <w:rPr>
           <w:lang w:val="en-GB"/>
@@ -21614,9 +22487,17 @@
         <w:rPr>
           <w:lang w:val="en-GB"/>
         </w:rPr>
-        <w:t>” to  “</w:t>
-      </w:r>
-      <w:proofErr w:type="spellStart"/>
+        <w:t xml:space="preserve">” </w:t>
+      </w:r>
+      <w:proofErr w:type="gramStart"/>
+      <w:r>
+        <w:rPr>
+          <w:lang w:val="en-GB"/>
+        </w:rPr>
+        <w:t>to  “</w:t>
+      </w:r>
+      <w:proofErr w:type="spellStart"/>
+      <w:proofErr w:type="gramEnd"/>
       <w:r>
         <w:rPr>
           <w:lang w:val="en-GB"/>
@@ -21754,6 +22635,7 @@
         <w:rPr>
           <w:lang w:val="en-GB"/>
         </w:rPr>
+        <w:lastRenderedPageBreak/>
         <w:t>Status:</w:t>
       </w:r>
       <w:r>
@@ -21801,8 +22683,806 @@
     </w:p>
     <w:p>
       <w:pPr>
+        <w:pStyle w:val="ListParagraph"/>
+        <w:numPr>
+          <w:ilvl w:val="0"/>
+          <w:numId w:val="3"/>
+        </w:numPr>
+        <w:spacing w:after="0"/>
+        <w:rPr>
+          <w:b/>
+          <w:bCs/>
+          <w:color w:val="EE0000"/>
+          <w:lang w:val="en-GB"/>
+        </w:rPr>
+      </w:pPr>
+      <w:r>
+        <w:rPr>
+          <w:b/>
+          <w:bCs/>
+          <w:color w:val="EE0000"/>
+          <w:lang w:val="en-GB"/>
+        </w:rPr>
+        <w:t>Migration script #</w:t>
+      </w:r>
+      <w:r>
+        <w:rPr>
+          <w:b/>
+          <w:bCs/>
+          <w:color w:val="EE0000"/>
+          <w:lang w:val="en-GB"/>
+        </w:rPr>
+        <w:t>45</w:t>
+      </w:r>
+    </w:p>
+    <w:p>
+      <w:pPr>
+        <w:spacing w:after="0"/>
         <w:ind w:left="720"/>
         <w:rPr>
+          <w:lang w:val="en-GB"/>
+        </w:rPr>
+      </w:pPr>
+      <w:r>
+        <w:rPr>
+          <w:b/>
+          <w:bCs/>
+          <w:lang w:val="en-GB"/>
+        </w:rPr>
+        <w:t>Description:</w:t>
+      </w:r>
+      <w:r>
+        <w:rPr>
+          <w:lang w:val="en-GB"/>
+        </w:rPr>
+        <w:t xml:space="preserve"> Create SQL migration script from “</w:t>
+      </w:r>
+      <w:proofErr w:type="spellStart"/>
+      <w:r>
+        <w:rPr>
+          <w:lang w:val="en-GB"/>
+        </w:rPr>
+        <w:t>AddWorkflowEntities</w:t>
+      </w:r>
+      <w:proofErr w:type="spellEnd"/>
+      <w:r>
+        <w:rPr>
+          <w:lang w:val="en-GB"/>
+        </w:rPr>
+        <w:t xml:space="preserve">” </w:t>
+      </w:r>
+      <w:proofErr w:type="gramStart"/>
+      <w:r>
+        <w:rPr>
+          <w:lang w:val="en-GB"/>
+        </w:rPr>
+        <w:t>to  “</w:t>
+      </w:r>
+      <w:proofErr w:type="spellStart"/>
+      <w:proofErr w:type="gramEnd"/>
+      <w:r>
+        <w:rPr>
+          <w:lang w:val="en-GB"/>
+        </w:rPr>
+        <w:t>ModifyWorkflowCondition</w:t>
+      </w:r>
+      <w:proofErr w:type="spellEnd"/>
+      <w:r>
+        <w:rPr>
+          <w:lang w:val="en-GB"/>
+        </w:rPr>
+        <w:t>”</w:t>
+      </w:r>
+    </w:p>
+    <w:p>
+      <w:pPr>
+        <w:spacing w:after="0"/>
+        <w:ind w:left="720"/>
+        <w:rPr>
+          <w:b/>
+          <w:bCs/>
+        </w:rPr>
+      </w:pPr>
+      <w:r>
+        <w:rPr>
+          <w:b/>
+          <w:bCs/>
+        </w:rPr>
+        <w:t>PMC script:</w:t>
+      </w:r>
+    </w:p>
+    <w:p>
+      <w:pPr>
+        <w:spacing w:after="0"/>
+        <w:ind w:left="720"/>
+        <w:rPr>
+          <w:lang w:val="en-GB"/>
+        </w:rPr>
+      </w:pPr>
+      <w:r>
+        <w:t xml:space="preserve">Script-Migration -From </w:t>
+      </w:r>
+      <w:proofErr w:type="spellStart"/>
+      <w:r>
+        <w:rPr>
+          <w:lang w:val="en-GB"/>
+        </w:rPr>
+        <w:t>AddWorkflowEntities</w:t>
+      </w:r>
+      <w:proofErr w:type="spellEnd"/>
+      <w:r>
+        <w:t xml:space="preserve"> -To </w:t>
+      </w:r>
+      <w:proofErr w:type="spellStart"/>
+      <w:r>
+        <w:rPr>
+          <w:lang w:val="en-GB"/>
+        </w:rPr>
+        <w:t>ModifyWorkflowCondition</w:t>
+      </w:r>
+      <w:proofErr w:type="spellEnd"/>
+      <w:r>
+        <w:rPr>
+          <w:lang w:val="en-GB"/>
+        </w:rPr>
+        <w:t xml:space="preserve"> </w:t>
+      </w:r>
+      <w:r>
+        <w:rPr>
+          <w:lang w:val="en-GB"/>
+        </w:rPr>
+        <w:t xml:space="preserve">-Context </w:t>
+      </w:r>
+      <w:proofErr w:type="spellStart"/>
+      <w:r>
+        <w:rPr>
+          <w:lang w:val="en-GB"/>
+        </w:rPr>
+        <w:t>AppDbContext</w:t>
+      </w:r>
+      <w:proofErr w:type="spellEnd"/>
+      <w:r>
+        <w:t xml:space="preserve"> -Output </w:t>
+      </w:r>
+      <w:r>
+        <w:rPr>
+          <w:lang w:val="en-GB"/>
+        </w:rPr>
+        <w:t>".\</w:t>
+      </w:r>
+      <w:proofErr w:type="spellStart"/>
+      <w:r>
+        <w:rPr>
+          <w:lang w:val="en-GB"/>
+        </w:rPr>
+        <w:t>MigrationScripts</w:t>
+      </w:r>
+      <w:proofErr w:type="spellEnd"/>
+      <w:r>
+        <w:rPr>
+          <w:lang w:val="en-GB"/>
+        </w:rPr>
+        <w:t>\</w:t>
+      </w:r>
+      <w:proofErr w:type="spellStart"/>
+      <w:r>
+        <w:rPr>
+          <w:lang w:val="en-GB"/>
+        </w:rPr>
+        <w:t>ModifyWorkflowCondition</w:t>
+      </w:r>
+      <w:r>
+        <w:rPr>
+          <w:lang w:val="en-GB"/>
+        </w:rPr>
+        <w:t>.sql</w:t>
+      </w:r>
+      <w:proofErr w:type="spellEnd"/>
+      <w:r>
+        <w:rPr>
+          <w:lang w:val="en-GB"/>
+        </w:rPr>
+        <w:t>"</w:t>
+      </w:r>
+    </w:p>
+    <w:p>
+      <w:pPr>
+        <w:spacing w:after="0"/>
+        <w:ind w:left="720"/>
+        <w:rPr>
+          <w:color w:val="00B050"/>
+        </w:rPr>
+      </w:pPr>
+      <w:r>
+        <w:rPr>
+          <w:lang w:val="en-GB"/>
+        </w:rPr>
+        <w:t>Status:</w:t>
+      </w:r>
+      <w:r>
+        <w:rPr>
+          <w:b/>
+          <w:bCs/>
+          <w:color w:val="00B050"/>
+          <w:lang w:val="en-GB"/>
+        </w:rPr>
+        <w:t xml:space="preserve"> </w:t>
+      </w:r>
+      <w:r>
+        <w:rPr>
+          <w:color w:val="00B050"/>
+        </w:rPr>
+        <w:t>Migration completed</w:t>
+      </w:r>
+      <w:r>
+        <w:rPr>
+          <w:color w:val="00B050"/>
+        </w:rPr>
+        <w:t xml:space="preserve"> on 14-Apr-2026</w:t>
+      </w:r>
+    </w:p>
+    <w:p>
+      <w:pPr>
+        <w:spacing w:after="0"/>
+        <w:ind w:left="720"/>
+        <w:rPr>
+          <w:color w:val="00B050"/>
+        </w:rPr>
+      </w:pPr>
+    </w:p>
+    <w:p>
+      <w:pPr>
+        <w:pStyle w:val="ListParagraph"/>
+        <w:numPr>
+          <w:ilvl w:val="0"/>
+          <w:numId w:val="3"/>
+        </w:numPr>
+        <w:spacing w:after="0"/>
+        <w:rPr>
+          <w:b/>
+          <w:bCs/>
+          <w:color w:val="EE0000"/>
+          <w:lang w:val="en-GB"/>
+        </w:rPr>
+      </w:pPr>
+      <w:r>
+        <w:rPr>
+          <w:b/>
+          <w:bCs/>
+          <w:color w:val="EE0000"/>
+          <w:lang w:val="en-GB"/>
+        </w:rPr>
+        <w:t>Migration script #</w:t>
+      </w:r>
+      <w:r>
+        <w:rPr>
+          <w:b/>
+          <w:bCs/>
+          <w:color w:val="EE0000"/>
+          <w:lang w:val="en-GB"/>
+        </w:rPr>
+        <w:t>4</w:t>
+      </w:r>
+      <w:r>
+        <w:rPr>
+          <w:b/>
+          <w:bCs/>
+          <w:color w:val="EE0000"/>
+          <w:lang w:val="en-GB"/>
+        </w:rPr>
+        <w:t>6</w:t>
+      </w:r>
+    </w:p>
+    <w:p>
+      <w:pPr>
+        <w:spacing w:after="0"/>
+        <w:ind w:left="720"/>
+        <w:rPr>
+          <w:lang w:val="en-GB"/>
+        </w:rPr>
+      </w:pPr>
+      <w:r>
+        <w:rPr>
+          <w:b/>
+          <w:bCs/>
+          <w:lang w:val="en-GB"/>
+        </w:rPr>
+        <w:t>Description:</w:t>
+      </w:r>
+      <w:r>
+        <w:rPr>
+          <w:lang w:val="en-GB"/>
+        </w:rPr>
+        <w:t xml:space="preserve"> Create SQL migration script from “</w:t>
+      </w:r>
+      <w:proofErr w:type="spellStart"/>
+      <w:r>
+        <w:rPr>
+          <w:lang w:val="en-GB"/>
+        </w:rPr>
+        <w:t>ModifyWorkflowCondition</w:t>
+      </w:r>
+      <w:proofErr w:type="spellEnd"/>
+      <w:r>
+        <w:rPr>
+          <w:lang w:val="en-GB"/>
+        </w:rPr>
+        <w:t xml:space="preserve">” </w:t>
+      </w:r>
+      <w:proofErr w:type="gramStart"/>
+      <w:r>
+        <w:rPr>
+          <w:lang w:val="en-GB"/>
+        </w:rPr>
+        <w:t>to  “</w:t>
+      </w:r>
+      <w:proofErr w:type="spellStart"/>
+      <w:proofErr w:type="gramEnd"/>
+      <w:r>
+        <w:rPr>
+          <w:lang w:val="en-GB"/>
+        </w:rPr>
+        <w:t>AddIsTerminal</w:t>
+      </w:r>
+      <w:proofErr w:type="spellEnd"/>
+      <w:r>
+        <w:rPr>
+          <w:lang w:val="en-GB"/>
+        </w:rPr>
+        <w:t>”</w:t>
+      </w:r>
+    </w:p>
+    <w:p>
+      <w:pPr>
+        <w:spacing w:after="0"/>
+        <w:ind w:left="720"/>
+        <w:rPr>
+          <w:b/>
+          <w:bCs/>
+        </w:rPr>
+      </w:pPr>
+      <w:r>
+        <w:rPr>
+          <w:b/>
+          <w:bCs/>
+        </w:rPr>
+        <w:t>PMC script:</w:t>
+      </w:r>
+    </w:p>
+    <w:p>
+      <w:pPr>
+        <w:spacing w:after="0"/>
+        <w:ind w:left="720"/>
+        <w:rPr>
+          <w:lang w:val="en-GB"/>
+        </w:rPr>
+      </w:pPr>
+      <w:r>
+        <w:t xml:space="preserve">Script-Migration -From </w:t>
+      </w:r>
+      <w:proofErr w:type="spellStart"/>
+      <w:r>
+        <w:rPr>
+          <w:lang w:val="en-GB"/>
+        </w:rPr>
+        <w:t>ModifyWorkflowCondition</w:t>
+      </w:r>
+      <w:proofErr w:type="spellEnd"/>
+      <w:r>
+        <w:t xml:space="preserve"> </w:t>
+      </w:r>
+      <w:r>
+        <w:t xml:space="preserve">-To </w:t>
+      </w:r>
+      <w:proofErr w:type="spellStart"/>
+      <w:r>
+        <w:rPr>
+          <w:lang w:val="en-GB"/>
+        </w:rPr>
+        <w:t>AddIsTerminal</w:t>
+      </w:r>
+      <w:proofErr w:type="spellEnd"/>
+      <w:r>
+        <w:rPr>
+          <w:lang w:val="en-GB"/>
+        </w:rPr>
+        <w:t xml:space="preserve"> </w:t>
+      </w:r>
+      <w:r>
+        <w:rPr>
+          <w:lang w:val="en-GB"/>
+        </w:rPr>
+        <w:t xml:space="preserve">-Context </w:t>
+      </w:r>
+      <w:proofErr w:type="spellStart"/>
+      <w:r>
+        <w:rPr>
+          <w:lang w:val="en-GB"/>
+        </w:rPr>
+        <w:t>AppDbContext</w:t>
+      </w:r>
+      <w:proofErr w:type="spellEnd"/>
+      <w:r>
+        <w:t xml:space="preserve"> -Output </w:t>
+      </w:r>
+      <w:r>
+        <w:rPr>
+          <w:lang w:val="en-GB"/>
+        </w:rPr>
+        <w:t>".\</w:t>
+      </w:r>
+      <w:proofErr w:type="spellStart"/>
+      <w:r>
+        <w:rPr>
+          <w:lang w:val="en-GB"/>
+        </w:rPr>
+        <w:t>MigrationScripts</w:t>
+      </w:r>
+      <w:proofErr w:type="spellEnd"/>
+      <w:r>
+        <w:rPr>
+          <w:lang w:val="en-GB"/>
+        </w:rPr>
+        <w:t>\</w:t>
+      </w:r>
+      <w:proofErr w:type="spellStart"/>
+      <w:r>
+        <w:rPr>
+          <w:lang w:val="en-GB"/>
+        </w:rPr>
+        <w:t>AddIsTerminal</w:t>
+      </w:r>
+      <w:r>
+        <w:rPr>
+          <w:lang w:val="en-GB"/>
+        </w:rPr>
+        <w:t>.sql</w:t>
+      </w:r>
+      <w:proofErr w:type="spellEnd"/>
+      <w:r>
+        <w:rPr>
+          <w:lang w:val="en-GB"/>
+        </w:rPr>
+        <w:t>"</w:t>
+      </w:r>
+    </w:p>
+    <w:p>
+      <w:pPr>
+        <w:spacing w:after="0"/>
+        <w:ind w:left="720"/>
+        <w:rPr>
+          <w:color w:val="00B050"/>
+        </w:rPr>
+      </w:pPr>
+      <w:r>
+        <w:rPr>
+          <w:lang w:val="en-GB"/>
+        </w:rPr>
+        <w:t>Status:</w:t>
+      </w:r>
+      <w:r>
+        <w:rPr>
+          <w:b/>
+          <w:bCs/>
+          <w:color w:val="00B050"/>
+          <w:lang w:val="en-GB"/>
+        </w:rPr>
+        <w:t xml:space="preserve"> </w:t>
+      </w:r>
+      <w:r>
+        <w:rPr>
+          <w:color w:val="00B050"/>
+        </w:rPr>
+        <w:t>Migration completed</w:t>
+      </w:r>
+      <w:r>
+        <w:rPr>
+          <w:color w:val="00B050"/>
+        </w:rPr>
+        <w:t xml:space="preserve"> on 14-Apr-2026</w:t>
+      </w:r>
+    </w:p>
+    <w:p>
+      <w:pPr>
+        <w:spacing w:after="0"/>
+        <w:ind w:left="720"/>
+        <w:rPr>
+          <w:color w:val="00B050"/>
+        </w:rPr>
+      </w:pPr>
+    </w:p>
+    <w:p>
+      <w:pPr>
+        <w:pStyle w:val="ListParagraph"/>
+        <w:numPr>
+          <w:ilvl w:val="0"/>
+          <w:numId w:val="3"/>
+        </w:numPr>
+        <w:spacing w:after="0"/>
+        <w:rPr>
+          <w:b/>
+          <w:bCs/>
+          <w:color w:val="EE0000"/>
+          <w:lang w:val="en-GB"/>
+        </w:rPr>
+      </w:pPr>
+      <w:r>
+        <w:rPr>
+          <w:b/>
+          <w:bCs/>
+          <w:color w:val="EE0000"/>
+          <w:lang w:val="en-GB"/>
+        </w:rPr>
+        <w:t>Migration script #</w:t>
+      </w:r>
+      <w:r>
+        <w:rPr>
+          <w:b/>
+          <w:bCs/>
+          <w:color w:val="EE0000"/>
+          <w:lang w:val="en-GB"/>
+        </w:rPr>
+        <w:t>4</w:t>
+      </w:r>
+      <w:r>
+        <w:rPr>
+          <w:b/>
+          <w:bCs/>
+          <w:color w:val="EE0000"/>
+          <w:lang w:val="en-GB"/>
+        </w:rPr>
+        <w:t>7</w:t>
+      </w:r>
+    </w:p>
+    <w:p>
+      <w:pPr>
+        <w:spacing w:after="0"/>
+        <w:ind w:left="720"/>
+        <w:rPr>
+          <w:lang w:val="en-GB"/>
+        </w:rPr>
+      </w:pPr>
+      <w:r>
+        <w:rPr>
+          <w:b/>
+          <w:bCs/>
+          <w:lang w:val="en-GB"/>
+        </w:rPr>
+        <w:t>Description:</w:t>
+      </w:r>
+      <w:r>
+        <w:rPr>
+          <w:lang w:val="en-GB"/>
+        </w:rPr>
+        <w:t xml:space="preserve"> Create SQL migration script from “</w:t>
+      </w:r>
+      <w:proofErr w:type="spellStart"/>
+      <w:r>
+        <w:rPr>
+          <w:lang w:val="en-GB"/>
+        </w:rPr>
+        <w:t>AddIsTerminal</w:t>
+      </w:r>
+      <w:proofErr w:type="spellEnd"/>
+      <w:r>
+        <w:rPr>
+          <w:lang w:val="en-GB"/>
+        </w:rPr>
+        <w:t xml:space="preserve">” </w:t>
+      </w:r>
+      <w:proofErr w:type="gramStart"/>
+      <w:r>
+        <w:rPr>
+          <w:lang w:val="en-GB"/>
+        </w:rPr>
+        <w:t>to  “</w:t>
+      </w:r>
+      <w:proofErr w:type="spellStart"/>
+      <w:proofErr w:type="gramEnd"/>
+      <w:r>
+        <w:rPr>
+          <w:lang w:val="en-GB"/>
+        </w:rPr>
+        <w:t>SetNullableNextStepDefinitionId</w:t>
+      </w:r>
+      <w:proofErr w:type="spellEnd"/>
+      <w:r>
+        <w:rPr>
+          <w:lang w:val="en-GB"/>
+        </w:rPr>
+        <w:t>”</w:t>
+      </w:r>
+    </w:p>
+    <w:p>
+      <w:pPr>
+        <w:spacing w:after="0"/>
+        <w:ind w:left="720"/>
+        <w:rPr>
+          <w:b/>
+          <w:bCs/>
+        </w:rPr>
+      </w:pPr>
+      <w:r>
+        <w:rPr>
+          <w:b/>
+          <w:bCs/>
+        </w:rPr>
+        <w:t>PMC script:</w:t>
+      </w:r>
+    </w:p>
+    <w:p>
+      <w:pPr>
+        <w:spacing w:after="0"/>
+        <w:ind w:left="720"/>
+        <w:rPr>
+          <w:lang w:val="en-GB"/>
+        </w:rPr>
+      </w:pPr>
+      <w:r>
+        <w:t xml:space="preserve">Script-Migration -From </w:t>
+      </w:r>
+      <w:proofErr w:type="spellStart"/>
+      <w:r>
+        <w:rPr>
+          <w:lang w:val="en-GB"/>
+        </w:rPr>
+        <w:t>AddIsTerminal</w:t>
+      </w:r>
+      <w:proofErr w:type="spellEnd"/>
+      <w:r>
+        <w:t xml:space="preserve"> </w:t>
+      </w:r>
+      <w:r>
+        <w:t xml:space="preserve">-To </w:t>
+      </w:r>
+      <w:proofErr w:type="spellStart"/>
+      <w:r>
+        <w:rPr>
+          <w:lang w:val="en-GB"/>
+        </w:rPr>
+        <w:t>SetNullableNextStepDefinitionId</w:t>
+      </w:r>
+      <w:proofErr w:type="spellEnd"/>
+      <w:r>
+        <w:rPr>
+          <w:lang w:val="en-GB"/>
+        </w:rPr>
+        <w:t xml:space="preserve"> </w:t>
+      </w:r>
+      <w:r>
+        <w:rPr>
+          <w:lang w:val="en-GB"/>
+        </w:rPr>
+        <w:t xml:space="preserve">-Context </w:t>
+      </w:r>
+      <w:proofErr w:type="spellStart"/>
+      <w:r>
+        <w:rPr>
+          <w:lang w:val="en-GB"/>
+        </w:rPr>
+        <w:t>AppDbContext</w:t>
+      </w:r>
+      <w:proofErr w:type="spellEnd"/>
+      <w:r>
+        <w:t xml:space="preserve"> -Output </w:t>
+      </w:r>
+      <w:r>
+        <w:rPr>
+          <w:lang w:val="en-GB"/>
+        </w:rPr>
+        <w:t>".\</w:t>
+      </w:r>
+      <w:proofErr w:type="spellStart"/>
+      <w:r>
+        <w:rPr>
+          <w:lang w:val="en-GB"/>
+        </w:rPr>
+        <w:t>MigrationScripts</w:t>
+      </w:r>
+      <w:proofErr w:type="spellEnd"/>
+      <w:r>
+        <w:rPr>
+          <w:lang w:val="en-GB"/>
+        </w:rPr>
+        <w:t>\</w:t>
+      </w:r>
+      <w:proofErr w:type="spellStart"/>
+      <w:r>
+        <w:rPr>
+          <w:lang w:val="en-GB"/>
+        </w:rPr>
+        <w:t>SetNullableNextStepDefinitionId</w:t>
+      </w:r>
+      <w:r>
+        <w:rPr>
+          <w:lang w:val="en-GB"/>
+        </w:rPr>
+        <w:t>.sql</w:t>
+      </w:r>
+      <w:proofErr w:type="spellEnd"/>
+      <w:r>
+        <w:rPr>
+          <w:lang w:val="en-GB"/>
+        </w:rPr>
+        <w:t>"</w:t>
+      </w:r>
+    </w:p>
+    <w:p>
+      <w:pPr>
+        <w:spacing w:after="0"/>
+        <w:ind w:left="720"/>
+        <w:rPr>
+          <w:color w:val="00B050"/>
+        </w:rPr>
+      </w:pPr>
+      <w:r>
+        <w:rPr>
+          <w:lang w:val="en-GB"/>
+        </w:rPr>
+        <w:t>Status:</w:t>
+      </w:r>
+      <w:r>
+        <w:rPr>
+          <w:b/>
+          <w:bCs/>
+          <w:color w:val="00B050"/>
+          <w:lang w:val="en-GB"/>
+        </w:rPr>
+        <w:t xml:space="preserve"> </w:t>
+      </w:r>
+      <w:r>
+        <w:rPr>
+          <w:color w:val="00B050"/>
+        </w:rPr>
+        <w:t>Migration completed</w:t>
+      </w:r>
+      <w:r>
+        <w:rPr>
+          <w:color w:val="00B050"/>
+        </w:rPr>
+        <w:t xml:space="preserve"> on 14-Apr-2026</w:t>
+      </w:r>
+    </w:p>
+    <w:p>
+      <w:pPr>
+        <w:spacing w:after="0"/>
+        <w:ind w:left="720"/>
+        <w:rPr>
+          <w:color w:val="00B050"/>
+        </w:rPr>
+      </w:pPr>
+    </w:p>
+    <w:p>
+      <w:pPr>
+        <w:spacing w:after="0"/>
+        <w:ind w:left="720"/>
+        <w:rPr>
+          <w:color w:val="00B050"/>
+        </w:rPr>
+      </w:pPr>
+    </w:p>
+    <w:p>
+      <w:pPr>
+        <w:spacing w:after="0"/>
+        <w:ind w:left="720"/>
+        <w:rPr>
+          <w:color w:val="00B050"/>
+        </w:rPr>
+      </w:pPr>
+    </w:p>
+    <w:p>
+      <w:pPr>
+        <w:spacing w:after="0"/>
+        <w:ind w:left="720"/>
+        <w:rPr>
+          <w:color w:val="00B050"/>
+        </w:rPr>
+      </w:pPr>
+    </w:p>
+    <w:p>
+      <w:pPr>
+        <w:ind w:left="720"/>
+        <w:rPr>
           <w:b/>
           <w:bCs/>
           <w:color w:val="00B050"/>
@@ -21836,6 +23516,7 @@
     </w:p>
     <w:p>
       <w:r>
+        <w:lastRenderedPageBreak/>
         <w:t>I have created a new key called “</w:t>
       </w:r>
       <w:proofErr w:type="spellStart"/>
@@ -22359,6 +24040,119 @@
     </w:lvl>
   </w:abstractNum>
   <w:abstractNum w:abstractNumId="4" w15:restartNumberingAfterBreak="0">
+    <w:nsid w:val="4127444C"/>
+    <w:multiLevelType w:val="hybridMultilevel"/>
+    <w:tmpl w:val="76260E94"/>
+    <w:lvl w:ilvl="0" w:tplc="08090005">
+      <w:start w:val="1"/>
+      <w:numFmt w:val="bullet"/>
+      <w:lvlText w:val=""/>
+      <w:lvlJc w:val="left"/>
+      <w:pPr>
+        <w:ind w:left="1800" w:hanging="360"/>
+      </w:pPr>
+      <w:rPr>
+        <w:rFonts w:ascii="Wingdings" w:hAnsi="Wingdings" w:hint="default"/>
+      </w:rPr>
+    </w:lvl>
+    <w:lvl w:ilvl="1" w:tplc="08090003" w:tentative="1">
+      <w:start w:val="1"/>
+      <w:numFmt w:val="bullet"/>
+      <w:lvlText w:val="o"/>
+      <w:lvlJc w:val="left"/>
+      <w:pPr>
+        <w:ind w:left="2520" w:hanging="360"/>
+      </w:pPr>
+      <w:rPr>
+        <w:rFonts w:ascii="Courier New" w:hAnsi="Courier New" w:cs="Courier New" w:hint="default"/>
+      </w:rPr>
+    </w:lvl>
+    <w:lvl w:ilvl="2" w:tplc="08090005" w:tentative="1">
+      <w:start w:val="1"/>
+      <w:numFmt w:val="bullet"/>
+      <w:lvlText w:val=""/>
+      <w:lvlJc w:val="left"/>
+      <w:pPr>
+        <w:ind w:left="3240" w:hanging="360"/>
+      </w:pPr>
+      <w:rPr>
+        <w:rFonts w:ascii="Wingdings" w:hAnsi="Wingdings" w:hint="default"/>
+      </w:rPr>
+    </w:lvl>
+    <w:lvl w:ilvl="3" w:tplc="08090001" w:tentative="1">
+      <w:start w:val="1"/>
+      <w:numFmt w:val="bullet"/>
+      <w:lvlText w:val=""/>
+      <w:lvlJc w:val="left"/>
+      <w:pPr>
+        <w:ind w:left="3960" w:hanging="360"/>
+      </w:pPr>
+      <w:rPr>
+        <w:rFonts w:ascii="Symbol" w:hAnsi="Symbol" w:hint="default"/>
+      </w:rPr>
+    </w:lvl>
+    <w:lvl w:ilvl="4" w:tplc="08090003" w:tentative="1">
+      <w:start w:val="1"/>
+      <w:numFmt w:val="bullet"/>
+      <w:lvlText w:val="o"/>
+      <w:lvlJc w:val="left"/>
+      <w:pPr>
+        <w:ind w:left="4680" w:hanging="360"/>
+      </w:pPr>
+      <w:rPr>
+        <w:rFonts w:ascii="Courier New" w:hAnsi="Courier New" w:cs="Courier New" w:hint="default"/>
+      </w:rPr>
+    </w:lvl>
+    <w:lvl w:ilvl="5" w:tplc="08090005" w:tentative="1">
+      <w:start w:val="1"/>
+      <w:numFmt w:val="bullet"/>
+      <w:lvlText w:val=""/>
+      <w:lvlJc w:val="left"/>
+      <w:pPr>
+        <w:ind w:left="5400" w:hanging="360"/>
+      </w:pPr>
+      <w:rPr>
+        <w:rFonts w:ascii="Wingdings" w:hAnsi="Wingdings" w:hint="default"/>
+      </w:rPr>
+    </w:lvl>
+    <w:lvl w:ilvl="6" w:tplc="08090001" w:tentative="1">
+      <w:start w:val="1"/>
+      <w:numFmt w:val="bullet"/>
+      <w:lvlText w:val=""/>
+      <w:lvlJc w:val="left"/>
+      <w:pPr>
+        <w:ind w:left="6120" w:hanging="360"/>
+      </w:pPr>
+      <w:rPr>
+        <w:rFonts w:ascii="Symbol" w:hAnsi="Symbol" w:hint="default"/>
+      </w:rPr>
+    </w:lvl>
+    <w:lvl w:ilvl="7" w:tplc="08090003" w:tentative="1">
+      <w:start w:val="1"/>
+      <w:numFmt w:val="bullet"/>
+      <w:lvlText w:val="o"/>
+      <w:lvlJc w:val="left"/>
+      <w:pPr>
+        <w:ind w:left="6840" w:hanging="360"/>
+      </w:pPr>
+      <w:rPr>
+        <w:rFonts w:ascii="Courier New" w:hAnsi="Courier New" w:cs="Courier New" w:hint="default"/>
+      </w:rPr>
+    </w:lvl>
+    <w:lvl w:ilvl="8" w:tplc="08090005" w:tentative="1">
+      <w:start w:val="1"/>
+      <w:numFmt w:val="bullet"/>
+      <w:lvlText w:val=""/>
+      <w:lvlJc w:val="left"/>
+      <w:pPr>
+        <w:ind w:left="7560" w:hanging="360"/>
+      </w:pPr>
+      <w:rPr>
+        <w:rFonts w:ascii="Wingdings" w:hAnsi="Wingdings" w:hint="default"/>
+      </w:rPr>
+    </w:lvl>
+  </w:abstractNum>
+  <w:abstractNum w:abstractNumId="5" w15:restartNumberingAfterBreak="0">
     <w:nsid w:val="4CF33A8A"/>
     <w:multiLevelType w:val="hybridMultilevel"/>
     <w:tmpl w:val="D474DEBA"/>
@@ -22471,7 +24265,7 @@
       </w:rPr>
     </w:lvl>
   </w:abstractNum>
-  <w:abstractNum w:abstractNumId="5" w15:restartNumberingAfterBreak="0">
+  <w:abstractNum w:abstractNumId="6" w15:restartNumberingAfterBreak="0">
     <w:nsid w:val="55166F4C"/>
     <w:multiLevelType w:val="hybridMultilevel"/>
     <w:tmpl w:val="13BA0AA6"/>
@@ -22584,7 +24378,120 @@
       </w:rPr>
     </w:lvl>
   </w:abstractNum>
-  <w:abstractNum w:abstractNumId="6" w15:restartNumberingAfterBreak="0">
+  <w:abstractNum w:abstractNumId="7" w15:restartNumberingAfterBreak="0">
+    <w:nsid w:val="61067249"/>
+    <w:multiLevelType w:val="hybridMultilevel"/>
+    <w:tmpl w:val="EE04ACA4"/>
+    <w:lvl w:ilvl="0" w:tplc="08090001">
+      <w:start w:val="1"/>
+      <w:numFmt w:val="bullet"/>
+      <w:lvlText w:val=""/>
+      <w:lvlJc w:val="left"/>
+      <w:pPr>
+        <w:ind w:left="1440" w:hanging="360"/>
+      </w:pPr>
+      <w:rPr>
+        <w:rFonts w:ascii="Symbol" w:hAnsi="Symbol" w:hint="default"/>
+      </w:rPr>
+    </w:lvl>
+    <w:lvl w:ilvl="1" w:tplc="08090003" w:tentative="1">
+      <w:start w:val="1"/>
+      <w:numFmt w:val="bullet"/>
+      <w:lvlText w:val="o"/>
+      <w:lvlJc w:val="left"/>
+      <w:pPr>
+        <w:ind w:left="2160" w:hanging="360"/>
+      </w:pPr>
+      <w:rPr>
+        <w:rFonts w:ascii="Courier New" w:hAnsi="Courier New" w:cs="Courier New" w:hint="default"/>
+      </w:rPr>
+    </w:lvl>
+    <w:lvl w:ilvl="2" w:tplc="08090005" w:tentative="1">
+      <w:start w:val="1"/>
+      <w:numFmt w:val="bullet"/>
+      <w:lvlText w:val=""/>
+      <w:lvlJc w:val="left"/>
+      <w:pPr>
+        <w:ind w:left="2880" w:hanging="360"/>
+      </w:pPr>
+      <w:rPr>
+        <w:rFonts w:ascii="Wingdings" w:hAnsi="Wingdings" w:hint="default"/>
+      </w:rPr>
+    </w:lvl>
+    <w:lvl w:ilvl="3" w:tplc="08090001" w:tentative="1">
+      <w:start w:val="1"/>
+      <w:numFmt w:val="bullet"/>
+      <w:lvlText w:val=""/>
+      <w:lvlJc w:val="left"/>
+      <w:pPr>
+        <w:ind w:left="3600" w:hanging="360"/>
+      </w:pPr>
+      <w:rPr>
+        <w:rFonts w:ascii="Symbol" w:hAnsi="Symbol" w:hint="default"/>
+      </w:rPr>
+    </w:lvl>
+    <w:lvl w:ilvl="4" w:tplc="08090003" w:tentative="1">
+      <w:start w:val="1"/>
+      <w:numFmt w:val="bullet"/>
+      <w:lvlText w:val="o"/>
+      <w:lvlJc w:val="left"/>
+      <w:pPr>
+        <w:ind w:left="4320" w:hanging="360"/>
+      </w:pPr>
+      <w:rPr>
+        <w:rFonts w:ascii="Courier New" w:hAnsi="Courier New" w:cs="Courier New" w:hint="default"/>
+      </w:rPr>
+    </w:lvl>
+    <w:lvl w:ilvl="5" w:tplc="08090005" w:tentative="1">
+      <w:start w:val="1"/>
+      <w:numFmt w:val="bullet"/>
+      <w:lvlText w:val=""/>
+      <w:lvlJc w:val="left"/>
+      <w:pPr>
+        <w:ind w:left="5040" w:hanging="360"/>
+      </w:pPr>
+      <w:rPr>
+        <w:rFonts w:ascii="Wingdings" w:hAnsi="Wingdings" w:hint="default"/>
+      </w:rPr>
+    </w:lvl>
+    <w:lvl w:ilvl="6" w:tplc="08090001" w:tentative="1">
+      <w:start w:val="1"/>
+      <w:numFmt w:val="bullet"/>
+      <w:lvlText w:val=""/>
+      <w:lvlJc w:val="left"/>
+      <w:pPr>
+        <w:ind w:left="5760" w:hanging="360"/>
+      </w:pPr>
+      <w:rPr>
+        <w:rFonts w:ascii="Symbol" w:hAnsi="Symbol" w:hint="default"/>
+      </w:rPr>
+    </w:lvl>
+    <w:lvl w:ilvl="7" w:tplc="08090003" w:tentative="1">
+      <w:start w:val="1"/>
+      <w:numFmt w:val="bullet"/>
+      <w:lvlText w:val="o"/>
+      <w:lvlJc w:val="left"/>
+      <w:pPr>
+        <w:ind w:left="6480" w:hanging="360"/>
+      </w:pPr>
+      <w:rPr>
+        <w:rFonts w:ascii="Courier New" w:hAnsi="Courier New" w:cs="Courier New" w:hint="default"/>
+      </w:rPr>
+    </w:lvl>
+    <w:lvl w:ilvl="8" w:tplc="08090005" w:tentative="1">
+      <w:start w:val="1"/>
+      <w:numFmt w:val="bullet"/>
+      <w:lvlText w:val=""/>
+      <w:lvlJc w:val="left"/>
+      <w:pPr>
+        <w:ind w:left="7200" w:hanging="360"/>
+      </w:pPr>
+      <w:rPr>
+        <w:rFonts w:ascii="Wingdings" w:hAnsi="Wingdings" w:hint="default"/>
+      </w:rPr>
+    </w:lvl>
+  </w:abstractNum>
+  <w:abstractNum w:abstractNumId="8" w15:restartNumberingAfterBreak="0">
     <w:nsid w:val="7A8E6340"/>
     <w:multiLevelType w:val="hybridMultilevel"/>
     <w:tmpl w:val="43FED5D0"/>
@@ -22698,10 +24605,10 @@
     </w:lvl>
   </w:abstractNum>
   <w:num w:numId="1" w16cid:durableId="1907647299">
-    <w:abstractNumId w:val="4"/>
+    <w:abstractNumId w:val="5"/>
   </w:num>
   <w:num w:numId="2" w16cid:durableId="1861813590">
-    <w:abstractNumId w:val="5"/>
+    <w:abstractNumId w:val="6"/>
   </w:num>
   <w:num w:numId="3" w16cid:durableId="399793268">
     <w:abstractNumId w:val="0"/>
@@ -22713,10 +24620,16 @@
     <w:abstractNumId w:val="3"/>
   </w:num>
   <w:num w:numId="6" w16cid:durableId="143356388">
-    <w:abstractNumId w:val="6"/>
+    <w:abstractNumId w:val="8"/>
   </w:num>
   <w:num w:numId="7" w16cid:durableId="1925843616">
     <w:abstractNumId w:val="1"/>
+  </w:num>
+  <w:num w:numId="8" w16cid:durableId="578252275">
+    <w:abstractNumId w:val="4"/>
+  </w:num>
+  <w:num w:numId="9" w16cid:durableId="1348096311">
+    <w:abstractNumId w:val="7"/>
   </w:num>
 </w:numbering>
 </file>
@@ -23324,7 +25237,6 @@
   <w:style w:type="character" w:default="1" w:styleId="DefaultParagraphFont">
     <w:name w:val="Default Paragraph Font"/>
     <w:uiPriority w:val="1"/>
-    <w:semiHidden/>
     <w:unhideWhenUsed/>
   </w:style>
   <w:style w:type="table" w:default="1" w:styleId="TableNormal">

</xml_diff>

<commit_message>
Added the workflow diagram in the Leave Requisition page
</commit_message>
<xml_diff>
--- a/MigrationScripts/EF Core Migration History.docx
+++ b/MigrationScripts/EF Core Migration History.docx
@@ -8992,9 +8992,9 @@
       </w:r>
       <w:r>
         <w:rPr>
-          <w:color w:val="EE0000"/>
-        </w:rPr>
-        <w:t>Pending</w:t>
+          <w:color w:val="00B050"/>
+        </w:rPr>
+        <w:t>Completed</w:t>
       </w:r>
     </w:p>
     <w:p>
@@ -9004,8 +9004,135 @@
     </w:p>
     <w:p>
       <w:pPr>
+        <w:pStyle w:val="ListParagraph"/>
+        <w:numPr>
+          <w:ilvl w:val="0"/>
+          <w:numId w:val="6"/>
+        </w:numPr>
         <w:spacing w:after="0"/>
-      </w:pPr>
+        <w:rPr>
+          <w:b/>
+          <w:bCs/>
+          <w:color w:val="EE0000"/>
+        </w:rPr>
+      </w:pPr>
+      <w:r>
+        <w:rPr>
+          <w:b/>
+          <w:bCs/>
+          <w:color w:val="EE0000"/>
+        </w:rPr>
+        <w:t>Data Migration PMC Command #</w:t>
+      </w:r>
+      <w:r>
+        <w:rPr>
+          <w:b/>
+          <w:bCs/>
+          <w:color w:val="EE0000"/>
+        </w:rPr>
+        <w:t>5</w:t>
+      </w:r>
+      <w:r>
+        <w:rPr>
+          <w:b/>
+          <w:bCs/>
+          <w:color w:val="EE0000"/>
+        </w:rPr>
+        <w:t>5</w:t>
+      </w:r>
+    </w:p>
+    <w:p>
+      <w:pPr>
+        <w:spacing w:after="0"/>
+        <w:ind w:left="1080"/>
+      </w:pPr>
+      <w:r>
+        <w:t>Add-Migration</w:t>
+      </w:r>
+      <w:r>
+        <w:t xml:space="preserve"> </w:t>
+      </w:r>
+      <w:r>
+        <w:rPr>
+          <w:lang w:val="en-GB"/>
+        </w:rPr>
+        <w:t>Add</w:t>
+      </w:r>
+      <w:r>
+        <w:rPr>
+          <w:lang w:val="en-GB"/>
+        </w:rPr>
+        <w:t>ApprovalStageDesc</w:t>
+      </w:r>
+      <w:r>
+        <w:t xml:space="preserve"> -Context AppDbContext </w:t>
+      </w:r>
+      <w:r>
+        <w:t>-Project KenHRApp.Infrastructure -StartupProject KenHRApp.Web -Verbose</w:t>
+      </w:r>
+    </w:p>
+    <w:p>
+      <w:pPr>
+        <w:spacing w:after="0"/>
+        <w:ind w:left="1080"/>
+      </w:pPr>
+    </w:p>
+    <w:p>
+      <w:pPr>
+        <w:spacing w:after="0"/>
+        <w:ind w:left="1080"/>
+      </w:pPr>
+      <w:r>
+        <w:t xml:space="preserve">Update-Database </w:t>
+      </w:r>
+      <w:r>
+        <w:t>-Context AppDbContext</w:t>
+      </w:r>
+    </w:p>
+    <w:p>
+      <w:pPr>
+        <w:spacing w:after="0"/>
+        <w:ind w:left="1080"/>
+        <w:rPr>
+          <w:u w:val="single"/>
+        </w:rPr>
+      </w:pPr>
+      <w:r>
+        <w:rPr>
+          <w:b/>
+          <w:bCs/>
+          <w:u w:val="single"/>
+        </w:rPr>
+        <w:t>Status:</w:t>
+      </w:r>
+      <w:r>
+        <w:rPr>
+          <w:u w:val="single"/>
+        </w:rPr>
+        <w:t xml:space="preserve"> </w:t>
+      </w:r>
+    </w:p>
+    <w:p>
+      <w:pPr>
+        <w:pStyle w:val="ListParagraph"/>
+        <w:numPr>
+          <w:ilvl w:val="0"/>
+          <w:numId w:val="9"/>
+        </w:numPr>
+        <w:spacing w:after="0"/>
+      </w:pPr>
+      <w:r>
+        <w:t>Development Database:</w:t>
+      </w:r>
+      <w:r>
+        <w:t xml:space="preserve"> </w:t>
+      </w:r>
+      <w:r>
+        <w:rPr>
+          <w:color w:val="00B050"/>
+        </w:rPr>
+        <w:t>Completed</w:t>
+      </w:r>
     </w:p>
     <w:p>
       <w:pPr>
@@ -9156,7 +9283,6 @@
         <w:rPr>
           <w:lang w:val="en-GB"/>
         </w:rPr>
-        <w:lastRenderedPageBreak/>
         <w:t>This generates a script that checks if the migration has already been applied before running it (safe for multiple DBs).</w:t>
       </w:r>
     </w:p>
@@ -9517,6 +9643,7 @@
           <w:bCs/>
           <w:lang w:val="en-GB"/>
         </w:rPr>
+        <w:lastRenderedPageBreak/>
         <w:t>Description:</w:t>
       </w:r>
       <w:r>
@@ -9645,7 +9772,6 @@
           <w:color w:val="00B050"/>
           <w:lang w:val="en-GB"/>
         </w:rPr>
-        <w:lastRenderedPageBreak/>
         <w:t xml:space="preserve">Status: </w:t>
       </w:r>
       <w:r>
@@ -10110,6 +10236,7 @@
         </w:rPr>
       </w:pPr>
       <w:r>
+        <w:lastRenderedPageBreak/>
         <w:t xml:space="preserve">Script-Migration -From </w:t>
       </w:r>
       <w:r>
@@ -10256,7 +10383,6 @@
           <w:bCs/>
           <w:lang w:val="en-GB"/>
         </w:rPr>
-        <w:lastRenderedPageBreak/>
         <w:t>Description:</w:t>
       </w:r>
       <w:r>
@@ -10869,7 +10995,6 @@
         </w:rPr>
       </w:pPr>
       <w:r>
-        <w:lastRenderedPageBreak/>
         <w:t xml:space="preserve">Script-Migration -From </w:t>
       </w:r>
       <w:r>
@@ -11385,6 +11510,7 @@
         </w:rPr>
       </w:pPr>
       <w:r>
+        <w:lastRenderedPageBreak/>
         <w:t xml:space="preserve">Script-Migration -From </w:t>
       </w:r>
       <w:r>
@@ -11545,7 +11671,6 @@
           <w:b/>
           <w:bCs/>
         </w:rPr>
-        <w:lastRenderedPageBreak/>
         <w:t>PMC script:</w:t>
       </w:r>
     </w:p>
@@ -12085,6 +12210,7 @@
           <w:b/>
           <w:bCs/>
         </w:rPr>
+        <w:lastRenderedPageBreak/>
         <w:t>PMC script:</w:t>
       </w:r>
     </w:p>
@@ -12199,7 +12325,6 @@
           <w:color w:val="EE0000"/>
           <w:lang w:val="en-GB"/>
         </w:rPr>
-        <w:lastRenderedPageBreak/>
         <w:t>Migration script #</w:t>
       </w:r>
       <w:r>
@@ -12769,6 +12894,7 @@
           <w:color w:val="EE0000"/>
           <w:lang w:val="en-GB"/>
         </w:rPr>
+        <w:lastRenderedPageBreak/>
         <w:t>Migration script #</w:t>
       </w:r>
       <w:r>
@@ -12919,7 +13045,6 @@
           <w:color w:val="00B050"/>
           <w:lang w:val="en-GB"/>
         </w:rPr>
-        <w:lastRenderedPageBreak/>
         <w:t>Status: Completed</w:t>
       </w:r>
     </w:p>
@@ -13426,6 +13551,7 @@
         </w:rPr>
       </w:pPr>
       <w:r>
+        <w:lastRenderedPageBreak/>
         <w:t xml:space="preserve">Script-Migration -From </w:t>
       </w:r>
       <w:r>
@@ -13604,7 +13730,6 @@
           <w:b/>
           <w:bCs/>
         </w:rPr>
-        <w:lastRenderedPageBreak/>
         <w:t>PMC script:</w:t>
       </w:r>
     </w:p>
@@ -14174,6 +14299,7 @@
           <w:b/>
           <w:bCs/>
         </w:rPr>
+        <w:lastRenderedPageBreak/>
         <w:t>PMC script:</w:t>
       </w:r>
     </w:p>
@@ -14311,7 +14437,6 @@
           <w:color w:val="EE0000"/>
           <w:lang w:val="en-GB"/>
         </w:rPr>
-        <w:lastRenderedPageBreak/>
         <w:t>Migration script #</w:t>
       </w:r>
       <w:r>
@@ -14893,6 +15018,7 @@
           <w:color w:val="EE0000"/>
           <w:lang w:val="en-GB"/>
         </w:rPr>
+        <w:lastRenderedPageBreak/>
         <w:t>Migration script #</w:t>
       </w:r>
       <w:r>
@@ -15043,7 +15169,6 @@
         <w:rPr>
           <w:lang w:val="en-GB"/>
         </w:rPr>
-        <w:lastRenderedPageBreak/>
         <w:t>Status:</w:t>
       </w:r>
       <w:r>
@@ -15659,6 +15784,7 @@
           <w:color w:val="EE0000"/>
           <w:lang w:val="en-GB"/>
         </w:rPr>
+        <w:lastRenderedPageBreak/>
         <w:t>Migration script #</w:t>
       </w:r>
       <w:r>
@@ -15812,7 +15938,6 @@
         <w:rPr>
           <w:lang w:val="en-GB"/>
         </w:rPr>
-        <w:lastRenderedPageBreak/>
         <w:t>Status:</w:t>
       </w:r>
       <w:r>
@@ -16417,6 +16542,7 @@
           <w:color w:val="EE0000"/>
           <w:lang w:val="en-GB"/>
         </w:rPr>
+        <w:lastRenderedPageBreak/>
         <w:t>Migration script #</w:t>
       </w:r>
       <w:r>
@@ -16610,7 +16736,6 @@
           <w:color w:val="EE0000"/>
           <w:lang w:val="en-GB"/>
         </w:rPr>
-        <w:lastRenderedPageBreak/>
         <w:t>Migration script #</w:t>
       </w:r>
       <w:r>
@@ -17260,6 +17385,7 @@
         </w:rPr>
       </w:pPr>
       <w:r>
+        <w:lastRenderedPageBreak/>
         <w:t xml:space="preserve">Script-Migration -From </w:t>
       </w:r>
       <w:r>
@@ -17481,7 +17607,6 @@
         </w:rPr>
       </w:pPr>
       <w:r>
-        <w:lastRenderedPageBreak/>
         <w:t xml:space="preserve">Script-Migration -From </w:t>
       </w:r>
       <w:r>
@@ -18195,6 +18320,24 @@
     </w:p>
     <w:p>
       <w:pPr>
+        <w:spacing w:after="0"/>
+        <w:ind w:left="720"/>
+        <w:rPr>
+          <w:color w:val="00B050"/>
+        </w:rPr>
+      </w:pPr>
+    </w:p>
+    <w:p>
+      <w:pPr>
+        <w:spacing w:after="0"/>
+        <w:ind w:left="720"/>
+        <w:rPr>
+          <w:color w:val="00B050"/>
+        </w:rPr>
+      </w:pPr>
+    </w:p>
+    <w:p>
+      <w:pPr>
         <w:pStyle w:val="ListParagraph"/>
         <w:numPr>
           <w:ilvl w:val="0"/>
@@ -18215,6 +18358,7 @@
           <w:color w:val="EE0000"/>
           <w:lang w:val="en-GB"/>
         </w:rPr>
+        <w:lastRenderedPageBreak/>
         <w:t>Migration script #</w:t>
       </w:r>
       <w:r>
@@ -18380,24 +18524,6 @@
         </w:rPr>
         <w:t xml:space="preserve"> on 14-Apr-2026</w:t>
       </w:r>
-    </w:p>
-    <w:p>
-      <w:pPr>
-        <w:spacing w:after="0"/>
-        <w:ind w:left="720"/>
-        <w:rPr>
-          <w:color w:val="00B050"/>
-        </w:rPr>
-      </w:pPr>
-    </w:p>
-    <w:p>
-      <w:pPr>
-        <w:spacing w:after="0"/>
-        <w:ind w:left="720"/>
-        <w:rPr>
-          <w:color w:val="00B050"/>
-        </w:rPr>
-      </w:pPr>
     </w:p>
     <w:p>
       <w:pPr>
@@ -18430,271 +18556,471 @@
           <w:color w:val="EE0000"/>
           <w:lang w:val="en-GB"/>
         </w:rPr>
+        <w:t>Migration script #</w:t>
+      </w:r>
+      <w:r>
+        <w:rPr>
+          <w:b/>
+          <w:bCs/>
+          <w:color w:val="EE0000"/>
+          <w:lang w:val="en-GB"/>
+        </w:rPr>
+        <w:t>48</w:t>
+      </w:r>
+    </w:p>
+    <w:p>
+      <w:pPr>
+        <w:spacing w:after="0"/>
+        <w:ind w:left="720"/>
+        <w:rPr>
+          <w:lang w:val="en-GB"/>
+        </w:rPr>
+      </w:pPr>
+      <w:r>
+        <w:rPr>
+          <w:b/>
+          <w:bCs/>
+          <w:lang w:val="en-GB"/>
+        </w:rPr>
+        <w:t>Description:</w:t>
+      </w:r>
+      <w:r>
+        <w:rPr>
+          <w:lang w:val="en-GB"/>
+        </w:rPr>
+        <w:t xml:space="preserve"> Create SQL migration script from “</w:t>
+      </w:r>
+      <w:r>
+        <w:rPr>
+          <w:lang w:val="en-GB"/>
+        </w:rPr>
+        <w:t>SetNullableNextStepDefinitionId</w:t>
+      </w:r>
+      <w:r>
+        <w:rPr>
+          <w:lang w:val="en-GB"/>
+        </w:rPr>
+        <w:t>” to  “</w:t>
+      </w:r>
+      <w:r>
+        <w:t>AddGroupType</w:t>
+      </w:r>
+      <w:r>
+        <w:rPr>
+          <w:lang w:val="en-GB"/>
+        </w:rPr>
+        <w:t>”</w:t>
+      </w:r>
+    </w:p>
+    <w:p>
+      <w:pPr>
+        <w:spacing w:after="0"/>
+        <w:ind w:left="720"/>
+        <w:rPr>
+          <w:b/>
+          <w:bCs/>
+        </w:rPr>
+      </w:pPr>
+      <w:r>
+        <w:rPr>
+          <w:b/>
+          <w:bCs/>
+        </w:rPr>
+        <w:t>PMC script:</w:t>
+      </w:r>
+    </w:p>
+    <w:p>
+      <w:pPr>
+        <w:spacing w:after="0"/>
+        <w:ind w:left="720"/>
+        <w:rPr>
+          <w:lang w:val="en-GB"/>
+        </w:rPr>
+      </w:pPr>
+      <w:r>
+        <w:t xml:space="preserve">Script-Migration -From </w:t>
+      </w:r>
+      <w:r>
+        <w:rPr>
+          <w:lang w:val="en-GB"/>
+        </w:rPr>
+        <w:t xml:space="preserve">SetNullableNextStepDefinitionId </w:t>
+      </w:r>
+      <w:r>
+        <w:t xml:space="preserve">-To </w:t>
+      </w:r>
+      <w:r>
+        <w:t>AddGroupType</w:t>
+      </w:r>
+      <w:r>
+        <w:rPr>
+          <w:lang w:val="en-GB"/>
+        </w:rPr>
+        <w:t xml:space="preserve"> </w:t>
+      </w:r>
+      <w:r>
+        <w:rPr>
+          <w:lang w:val="en-GB"/>
+        </w:rPr>
+        <w:t>-Context AppDbContext</w:t>
+      </w:r>
+      <w:r>
+        <w:t xml:space="preserve"> -Output </w:t>
+      </w:r>
+      <w:r>
+        <w:rPr>
+          <w:lang w:val="en-GB"/>
+        </w:rPr>
+        <w:t>".\MigrationScripts\</w:t>
+      </w:r>
+      <w:r>
+        <w:t>AddGroupType</w:t>
+      </w:r>
+      <w:r>
+        <w:rPr>
+          <w:lang w:val="en-GB"/>
+        </w:rPr>
+        <w:t>.sql"</w:t>
+      </w:r>
+    </w:p>
+    <w:p>
+      <w:pPr>
+        <w:spacing w:after="0"/>
+        <w:ind w:left="720"/>
+        <w:rPr>
+          <w:color w:val="00B050"/>
+        </w:rPr>
+      </w:pPr>
+      <w:r>
+        <w:rPr>
+          <w:lang w:val="en-GB"/>
+        </w:rPr>
+        <w:t>Status:</w:t>
+      </w:r>
+      <w:r>
+        <w:rPr>
+          <w:b/>
+          <w:bCs/>
+          <w:color w:val="00B050"/>
+          <w:lang w:val="en-GB"/>
+        </w:rPr>
+        <w:t xml:space="preserve"> </w:t>
+      </w:r>
+      <w:r>
+        <w:rPr>
+          <w:color w:val="00B050"/>
+        </w:rPr>
+        <w:t>Migration completed</w:t>
+      </w:r>
+      <w:r>
+        <w:rPr>
+          <w:color w:val="00B050"/>
+        </w:rPr>
+        <w:t xml:space="preserve"> on 16-Apr-2026</w:t>
+      </w:r>
+    </w:p>
+    <w:p>
+      <w:pPr>
+        <w:spacing w:after="0"/>
+        <w:ind w:left="720"/>
+        <w:rPr>
+          <w:color w:val="00B050"/>
+        </w:rPr>
+      </w:pPr>
+    </w:p>
+    <w:p>
+      <w:pPr>
+        <w:pStyle w:val="ListParagraph"/>
+        <w:numPr>
+          <w:ilvl w:val="0"/>
+          <w:numId w:val="3"/>
+        </w:numPr>
+        <w:spacing w:after="0"/>
+        <w:rPr>
+          <w:b/>
+          <w:bCs/>
+          <w:color w:val="EE0000"/>
+          <w:lang w:val="en-GB"/>
+        </w:rPr>
+      </w:pPr>
+      <w:r>
+        <w:rPr>
+          <w:b/>
+          <w:bCs/>
+          <w:color w:val="EE0000"/>
+          <w:lang w:val="en-GB"/>
+        </w:rPr>
+        <w:t>Migration script #</w:t>
+      </w:r>
+      <w:r>
+        <w:rPr>
+          <w:b/>
+          <w:bCs/>
+          <w:color w:val="EE0000"/>
+          <w:lang w:val="en-GB"/>
+        </w:rPr>
+        <w:t>4</w:t>
+      </w:r>
+      <w:r>
+        <w:rPr>
+          <w:b/>
+          <w:bCs/>
+          <w:color w:val="EE0000"/>
+          <w:lang w:val="en-GB"/>
+        </w:rPr>
+        <w:t>9</w:t>
+      </w:r>
+    </w:p>
+    <w:p>
+      <w:pPr>
+        <w:spacing w:after="0"/>
+        <w:ind w:left="720"/>
+        <w:rPr>
+          <w:lang w:val="en-GB"/>
+        </w:rPr>
+      </w:pPr>
+      <w:r>
+        <w:rPr>
+          <w:b/>
+          <w:bCs/>
+          <w:lang w:val="en-GB"/>
+        </w:rPr>
+        <w:t>Description:</w:t>
+      </w:r>
+      <w:r>
+        <w:rPr>
+          <w:lang w:val="en-GB"/>
+        </w:rPr>
+        <w:t xml:space="preserve"> Create SQL migration script from “</w:t>
+      </w:r>
+      <w:r>
+        <w:t>AddGroupType</w:t>
+      </w:r>
+      <w:r>
+        <w:rPr>
+          <w:lang w:val="en-GB"/>
+        </w:rPr>
+        <w:t>” to  “</w:t>
+      </w:r>
+      <w:r>
+        <w:rPr>
+          <w:lang w:val="en-GB"/>
+        </w:rPr>
+        <w:t>AddApprovalStageDesc</w:t>
+      </w:r>
+      <w:r>
+        <w:rPr>
+          <w:lang w:val="en-GB"/>
+        </w:rPr>
+        <w:t>”</w:t>
+      </w:r>
+    </w:p>
+    <w:p>
+      <w:pPr>
+        <w:spacing w:after="0"/>
+        <w:ind w:left="720"/>
+        <w:rPr>
+          <w:b/>
+          <w:bCs/>
+        </w:rPr>
+      </w:pPr>
+      <w:r>
+        <w:rPr>
+          <w:b/>
+          <w:bCs/>
+        </w:rPr>
+        <w:t>PMC script:</w:t>
+      </w:r>
+    </w:p>
+    <w:p>
+      <w:pPr>
+        <w:spacing w:after="0"/>
+        <w:ind w:left="720"/>
+        <w:rPr>
+          <w:lang w:val="en-GB"/>
+        </w:rPr>
+      </w:pPr>
+      <w:r>
+        <w:t xml:space="preserve">Script-Migration -From </w:t>
+      </w:r>
+      <w:r>
+        <w:t>AddGroupType</w:t>
+      </w:r>
+      <w:r>
+        <w:t xml:space="preserve"> </w:t>
+      </w:r>
+      <w:r>
+        <w:t xml:space="preserve">-To </w:t>
+      </w:r>
+      <w:r>
+        <w:rPr>
+          <w:lang w:val="en-GB"/>
+        </w:rPr>
+        <w:t>AddApprovalStageDesc</w:t>
+      </w:r>
+      <w:r>
+        <w:rPr>
+          <w:lang w:val="en-GB"/>
+        </w:rPr>
+        <w:t xml:space="preserve"> </w:t>
+      </w:r>
+      <w:r>
+        <w:rPr>
+          <w:lang w:val="en-GB"/>
+        </w:rPr>
+        <w:t>-Context AppDbContext</w:t>
+      </w:r>
+      <w:r>
+        <w:t xml:space="preserve"> -Output </w:t>
+      </w:r>
+      <w:r>
+        <w:rPr>
+          <w:lang w:val="en-GB"/>
+        </w:rPr>
+        <w:t>".\MigrationScripts\</w:t>
+      </w:r>
+      <w:r>
+        <w:rPr>
+          <w:lang w:val="en-GB"/>
+        </w:rPr>
+        <w:t>AddApprovalStageDesc</w:t>
+      </w:r>
+      <w:r>
+        <w:rPr>
+          <w:lang w:val="en-GB"/>
+        </w:rPr>
+        <w:t>.sql"</w:t>
+      </w:r>
+    </w:p>
+    <w:p>
+      <w:pPr>
+        <w:spacing w:after="0"/>
+        <w:ind w:left="720"/>
+        <w:rPr>
+          <w:color w:val="00B050"/>
+        </w:rPr>
+      </w:pPr>
+      <w:r>
+        <w:rPr>
+          <w:lang w:val="en-GB"/>
+        </w:rPr>
+        <w:t>Status:</w:t>
+      </w:r>
+      <w:r>
+        <w:rPr>
+          <w:b/>
+          <w:bCs/>
+          <w:color w:val="00B050"/>
+          <w:lang w:val="en-GB"/>
+        </w:rPr>
+        <w:t xml:space="preserve"> </w:t>
+      </w:r>
+      <w:r>
+        <w:rPr>
+          <w:color w:val="00B050"/>
+        </w:rPr>
+        <w:t>Migration completed</w:t>
+      </w:r>
+      <w:r>
+        <w:rPr>
+          <w:color w:val="00B050"/>
+        </w:rPr>
+        <w:t xml:space="preserve"> on </w:t>
+      </w:r>
+      <w:r>
+        <w:rPr>
+          <w:color w:val="00B050"/>
+        </w:rPr>
+        <w:t>20</w:t>
+      </w:r>
+      <w:r>
+        <w:rPr>
+          <w:color w:val="00B050"/>
+        </w:rPr>
+        <w:t>-Apr-2026</w:t>
+      </w:r>
+    </w:p>
+    <w:p>
+      <w:pPr>
+        <w:spacing w:after="0"/>
+        <w:rPr>
+          <w:color w:val="00B050"/>
+        </w:rPr>
+      </w:pPr>
+    </w:p>
+    <w:p>
+      <w:pPr>
+        <w:ind w:left="720"/>
+        <w:rPr>
+          <w:b/>
+          <w:bCs/>
+          <w:color w:val="00B050"/>
+          <w:lang w:val="en-GB"/>
+        </w:rPr>
+      </w:pPr>
+    </w:p>
+    <w:p>
+      <w:pPr>
+        <w:rPr>
+          <w:b/>
+          <w:bCs/>
+          <w:color w:val="EE0000"/>
+          <w:u w:val="single"/>
+        </w:rPr>
+      </w:pPr>
+      <w:r>
+        <w:rPr>
+          <w:b/>
+          <w:bCs/>
+          <w:color w:val="EE0000"/>
+          <w:u w:val="single"/>
+        </w:rPr>
+        <w:t>AI Prompts</w:t>
+      </w:r>
+    </w:p>
+    <w:p>
+      <w:r>
+        <w:t>I have successfully executed 5 migrations for my data model and have updated the database. However, I need to execute the same number of migrations but to a different database. Tell me how to run the migrations to a new database in Entity Framework Core.</w:t>
+      </w:r>
+    </w:p>
+    <w:p>
+      <w:r>
+        <w:t>I have created a new key called “</w:t>
+      </w:r>
+      <w:r>
+        <w:rPr>
+          <w:lang w:val="en-GB"/>
+        </w:rPr>
+        <w:t>AppSettings</w:t>
+      </w:r>
+      <w:r>
+        <w:t>” in the appsettings.json file. This key contains and object value where I defined a property called “Environment”. Now, tell me how to get the value of the “Environment” property under “AppSettings” key in Program.cs</w:t>
+      </w:r>
+    </w:p>
+    <w:p>
+      <w:pPr>
+        <w:rPr>
+          <w:lang w:val="en-GB"/>
+        </w:rPr>
+      </w:pPr>
+      <w:r>
+        <w:rPr>
+          <w:lang w:val="en-GB"/>
+        </w:rPr>
+        <w:t>I have successfully executed the SQL migration script on my new database. Now, I will create views and table view function database objects using SQL Server scripts. Tell me how to synchronize the database objects that I will create in SQL Server with my Entity Framework data model.</w:t>
+      </w:r>
+    </w:p>
+    <w:p>
+      <w:pPr>
+        <w:rPr>
+          <w:lang w:val="en-GB"/>
+        </w:rPr>
+      </w:pPr>
+      <w:r>
+        <w:rPr>
+          <w:lang w:val="en-GB"/>
+        </w:rPr>
         <w:lastRenderedPageBreak/>
-        <w:t>Migration script #</w:t>
-      </w:r>
-      <w:r>
-        <w:rPr>
-          <w:b/>
-          <w:bCs/>
-          <w:color w:val="EE0000"/>
-          <w:lang w:val="en-GB"/>
-        </w:rPr>
-        <w:t>4</w:t>
-      </w:r>
-      <w:r>
-        <w:rPr>
-          <w:b/>
-          <w:bCs/>
-          <w:color w:val="EE0000"/>
-          <w:lang w:val="en-GB"/>
-        </w:rPr>
-        <w:t>8</w:t>
-      </w:r>
-    </w:p>
-    <w:p>
-      <w:pPr>
-        <w:spacing w:after="0"/>
-        <w:ind w:left="720"/>
-        <w:rPr>
-          <w:lang w:val="en-GB"/>
-        </w:rPr>
-      </w:pPr>
-      <w:r>
-        <w:rPr>
-          <w:b/>
-          <w:bCs/>
-          <w:lang w:val="en-GB"/>
-        </w:rPr>
-        <w:t>Description:</w:t>
-      </w:r>
-      <w:r>
-        <w:rPr>
-          <w:lang w:val="en-GB"/>
-        </w:rPr>
-        <w:t xml:space="preserve"> Create SQL migration script from “</w:t>
-      </w:r>
-      <w:r>
-        <w:rPr>
-          <w:lang w:val="en-GB"/>
-        </w:rPr>
-        <w:t>SetNullableNextStepDefinitionId</w:t>
-      </w:r>
-      <w:r>
-        <w:rPr>
-          <w:lang w:val="en-GB"/>
-        </w:rPr>
-        <w:t>” to  “</w:t>
-      </w:r>
-      <w:r>
-        <w:t>AddGroupType</w:t>
-      </w:r>
-      <w:r>
-        <w:rPr>
-          <w:lang w:val="en-GB"/>
-        </w:rPr>
-        <w:t>”</w:t>
-      </w:r>
-    </w:p>
-    <w:p>
-      <w:pPr>
-        <w:spacing w:after="0"/>
-        <w:ind w:left="720"/>
-        <w:rPr>
-          <w:b/>
-          <w:bCs/>
-        </w:rPr>
-      </w:pPr>
-      <w:r>
-        <w:rPr>
-          <w:b/>
-          <w:bCs/>
-        </w:rPr>
-        <w:t>PMC script:</w:t>
-      </w:r>
-    </w:p>
-    <w:p>
-      <w:pPr>
-        <w:spacing w:after="0"/>
-        <w:ind w:left="720"/>
-        <w:rPr>
-          <w:lang w:val="en-GB"/>
-        </w:rPr>
-      </w:pPr>
-      <w:r>
-        <w:t xml:space="preserve">Script-Migration -From </w:t>
-      </w:r>
-      <w:r>
-        <w:rPr>
-          <w:lang w:val="en-GB"/>
-        </w:rPr>
-        <w:t xml:space="preserve">SetNullableNextStepDefinitionId </w:t>
-      </w:r>
-      <w:r>
-        <w:t xml:space="preserve">-To </w:t>
-      </w:r>
-      <w:r>
-        <w:t>AddGroupType</w:t>
-      </w:r>
-      <w:r>
-        <w:rPr>
-          <w:lang w:val="en-GB"/>
-        </w:rPr>
-        <w:t xml:space="preserve"> </w:t>
-      </w:r>
-      <w:r>
-        <w:rPr>
-          <w:lang w:val="en-GB"/>
-        </w:rPr>
-        <w:t>-Context AppDbContext</w:t>
-      </w:r>
-      <w:r>
-        <w:t xml:space="preserve"> -Output </w:t>
-      </w:r>
-      <w:r>
-        <w:rPr>
-          <w:lang w:val="en-GB"/>
-        </w:rPr>
-        <w:t>".\MigrationScripts\</w:t>
-      </w:r>
-      <w:r>
-        <w:t>AddGroupType</w:t>
-      </w:r>
-      <w:r>
-        <w:rPr>
-          <w:lang w:val="en-GB"/>
-        </w:rPr>
-        <w:t>.sql"</w:t>
-      </w:r>
-    </w:p>
-    <w:p>
-      <w:pPr>
-        <w:spacing w:after="0"/>
-        <w:ind w:left="720"/>
-        <w:rPr>
-          <w:color w:val="00B050"/>
-        </w:rPr>
-      </w:pPr>
-      <w:r>
-        <w:rPr>
-          <w:lang w:val="en-GB"/>
-        </w:rPr>
-        <w:t>Status:</w:t>
-      </w:r>
-      <w:r>
-        <w:rPr>
-          <w:b/>
-          <w:bCs/>
-          <w:color w:val="00B050"/>
-          <w:lang w:val="en-GB"/>
-        </w:rPr>
-        <w:t xml:space="preserve"> </w:t>
-      </w:r>
-      <w:r>
-        <w:rPr>
-          <w:color w:val="00B050"/>
-        </w:rPr>
-        <w:t>Migration completed</w:t>
-      </w:r>
-      <w:r>
-        <w:rPr>
-          <w:color w:val="00B050"/>
-        </w:rPr>
-        <w:t xml:space="preserve"> on 1</w:t>
-      </w:r>
-      <w:r>
-        <w:rPr>
-          <w:color w:val="00B050"/>
-        </w:rPr>
-        <w:t>6</w:t>
-      </w:r>
-      <w:r>
-        <w:rPr>
-          <w:color w:val="00B050"/>
-        </w:rPr>
-        <w:t>-Apr-2026</w:t>
-      </w:r>
-    </w:p>
-    <w:p>
-      <w:pPr>
-        <w:spacing w:after="0"/>
-        <w:rPr>
-          <w:color w:val="00B050"/>
-        </w:rPr>
-      </w:pPr>
-    </w:p>
-    <w:p>
-      <w:pPr>
-        <w:ind w:left="720"/>
-        <w:rPr>
-          <w:b/>
-          <w:bCs/>
-          <w:color w:val="00B050"/>
-          <w:lang w:val="en-GB"/>
-        </w:rPr>
-      </w:pPr>
-    </w:p>
-    <w:p>
-      <w:pPr>
-        <w:rPr>
-          <w:b/>
-          <w:bCs/>
-          <w:color w:val="EE0000"/>
-          <w:u w:val="single"/>
-        </w:rPr>
-      </w:pPr>
-      <w:r>
-        <w:rPr>
-          <w:b/>
-          <w:bCs/>
-          <w:color w:val="EE0000"/>
-          <w:u w:val="single"/>
-        </w:rPr>
-        <w:t>AI Prompts</w:t>
-      </w:r>
-    </w:p>
-    <w:p>
-      <w:r>
-        <w:t>I have successfully executed 5 migrations for my data model and have updated the database. However, I need to execute the same number of migrations but to a different database. Tell me how to run the migrations to a new database in Entity Framework Core.</w:t>
-      </w:r>
-    </w:p>
-    <w:p>
-      <w:r>
-        <w:t>I have created a new key called “</w:t>
-      </w:r>
-      <w:r>
-        <w:rPr>
-          <w:lang w:val="en-GB"/>
-        </w:rPr>
-        <w:t>AppSettings</w:t>
-      </w:r>
-      <w:r>
-        <w:t>” in the appsettings.json file. This key contains and object value where I defined a property called “Environment”. Now, tell me how to get the value of the “Environment” property under “AppSettings” key in Program.cs</w:t>
-      </w:r>
-    </w:p>
-    <w:p>
-      <w:pPr>
-        <w:rPr>
-          <w:lang w:val="en-GB"/>
-        </w:rPr>
-      </w:pPr>
-      <w:r>
-        <w:rPr>
-          <w:lang w:val="en-GB"/>
-        </w:rPr>
-        <w:t>I have successfully executed the SQL migration script on my new database. Now, I will create views and table view function database objects using SQL Server scripts. Tell me how to synchronize the database objects that I will create in SQL Server with my Entity Framework data model.</w:t>
-      </w:r>
-    </w:p>
-    <w:p>
-      <w:pPr>
-        <w:rPr>
-          <w:lang w:val="en-GB"/>
-        </w:rPr>
-      </w:pPr>
-      <w:r>
-        <w:rPr>
-          <w:lang w:val="en-GB"/>
-        </w:rPr>
         <w:t>I have created a new migration called, Update</w:t>
       </w:r>
       <w:r>
@@ -19493,7 +19819,7 @@
   <w:abstractNum w:abstractNumId="7" w15:restartNumberingAfterBreak="0">
     <w:nsid w:val="61067249"/>
     <w:multiLevelType w:val="hybridMultilevel"/>
-    <w:tmpl w:val="EE04ACA4"/>
+    <w:tmpl w:val="675A7F18"/>
     <w:lvl w:ilvl="0" w:tplc="08090001">
       <w:start w:val="1"/>
       <w:numFmt w:val="bullet"/>

</xml_diff>

<commit_message>
Migrated RegularRequestWF entity into the database
</commit_message>
<xml_diff>
--- a/MigrationScripts/EF Core Migration History.docx
+++ b/MigrationScripts/EF Core Migration History.docx
@@ -3152,6 +3152,7 @@
         </w:numPr>
       </w:pPr>
       <w:r>
+        <w:lastRenderedPageBreak/>
         <w:t xml:space="preserve">Staging Database: </w:t>
       </w:r>
       <w:r>
@@ -3180,7 +3181,6 @@
           <w:bCs/>
           <w:color w:val="EE0000"/>
         </w:rPr>
-        <w:lastRenderedPageBreak/>
         <w:t>Data Migration PMC Command #1</w:t>
       </w:r>
       <w:r>
@@ -9030,15 +9030,7 @@
           <w:bCs/>
           <w:color w:val="EE0000"/>
         </w:rPr>
-        <w:t>5</w:t>
-      </w:r>
-      <w:r>
-        <w:rPr>
-          <w:b/>
-          <w:bCs/>
-          <w:color w:val="EE0000"/>
-        </w:rPr>
-        <w:t>5</w:t>
+        <w:t>55</w:t>
       </w:r>
     </w:p>
     <w:p>
@@ -9136,6 +9128,168 @@
     </w:p>
     <w:p>
       <w:pPr>
+        <w:spacing w:after="0"/>
+      </w:pPr>
+    </w:p>
+    <w:p>
+      <w:pPr>
+        <w:spacing w:after="0"/>
+      </w:pPr>
+    </w:p>
+    <w:p>
+      <w:pPr>
+        <w:spacing w:after="0"/>
+      </w:pPr>
+    </w:p>
+    <w:p>
+      <w:pPr>
+        <w:spacing w:after="0"/>
+      </w:pPr>
+    </w:p>
+    <w:p>
+      <w:pPr>
+        <w:spacing w:after="0"/>
+      </w:pPr>
+    </w:p>
+    <w:p>
+      <w:pPr>
+        <w:spacing w:after="0"/>
+      </w:pPr>
+    </w:p>
+    <w:p>
+      <w:pPr>
+        <w:pStyle w:val="ListParagraph"/>
+        <w:numPr>
+          <w:ilvl w:val="0"/>
+          <w:numId w:val="6"/>
+        </w:numPr>
+        <w:spacing w:after="0"/>
+        <w:rPr>
+          <w:b/>
+          <w:bCs/>
+          <w:color w:val="EE0000"/>
+        </w:rPr>
+      </w:pPr>
+      <w:r>
+        <w:rPr>
+          <w:b/>
+          <w:bCs/>
+          <w:color w:val="EE0000"/>
+        </w:rPr>
+        <w:lastRenderedPageBreak/>
+        <w:t>Data Migration PMC Command #</w:t>
+      </w:r>
+      <w:r>
+        <w:rPr>
+          <w:b/>
+          <w:bCs/>
+          <w:color w:val="EE0000"/>
+        </w:rPr>
+        <w:t>5</w:t>
+      </w:r>
+      <w:r>
+        <w:rPr>
+          <w:b/>
+          <w:bCs/>
+          <w:color w:val="EE0000"/>
+        </w:rPr>
+        <w:t>6</w:t>
+      </w:r>
+    </w:p>
+    <w:p>
+      <w:pPr>
+        <w:spacing w:after="0"/>
+        <w:ind w:left="1080"/>
+      </w:pPr>
+      <w:r>
+        <w:t>Add-Migration</w:t>
+      </w:r>
+      <w:r>
+        <w:t xml:space="preserve"> </w:t>
+      </w:r>
+      <w:r>
+        <w:t>Add</w:t>
+      </w:r>
+      <w:r>
+        <w:rPr>
+          <w:lang w:val="en-GB"/>
+        </w:rPr>
+        <w:t>RegularRequestWF</w:t>
+      </w:r>
+      <w:r>
+        <w:t xml:space="preserve"> -Context AppDbContext </w:t>
+      </w:r>
+      <w:r>
+        <w:t>-Project KenHRApp.Infrastructure -StartupProject KenHRApp.Web -Verbose</w:t>
+      </w:r>
+    </w:p>
+    <w:p>
+      <w:pPr>
+        <w:spacing w:after="0"/>
+        <w:ind w:left="1080"/>
+      </w:pPr>
+    </w:p>
+    <w:p>
+      <w:pPr>
+        <w:spacing w:after="0"/>
+        <w:ind w:left="1080"/>
+      </w:pPr>
+      <w:r>
+        <w:t xml:space="preserve">Update-Database </w:t>
+      </w:r>
+      <w:r>
+        <w:t>-Context AppDbContext</w:t>
+      </w:r>
+    </w:p>
+    <w:p>
+      <w:pPr>
+        <w:spacing w:after="0"/>
+        <w:ind w:left="1080"/>
+        <w:rPr>
+          <w:u w:val="single"/>
+        </w:rPr>
+      </w:pPr>
+      <w:r>
+        <w:rPr>
+          <w:b/>
+          <w:bCs/>
+          <w:u w:val="single"/>
+        </w:rPr>
+        <w:t>Status:</w:t>
+      </w:r>
+      <w:r>
+        <w:rPr>
+          <w:u w:val="single"/>
+        </w:rPr>
+        <w:t xml:space="preserve"> </w:t>
+      </w:r>
+    </w:p>
+    <w:p>
+      <w:pPr>
+        <w:spacing w:after="0"/>
+        <w:ind w:left="1080"/>
+      </w:pPr>
+      <w:r>
+        <w:t>Development Database:</w:t>
+      </w:r>
+      <w:r>
+        <w:t xml:space="preserve"> </w:t>
+      </w:r>
+      <w:r>
+        <w:rPr>
+          <w:color w:val="00B050"/>
+        </w:rPr>
+        <w:t>Completed</w:t>
+      </w:r>
+      <w:r>
+        <w:rPr>
+          <w:color w:val="00B050"/>
+        </w:rPr>
+        <w:t xml:space="preserve"> on 23-May-2026</w:t>
+      </w:r>
+    </w:p>
+    <w:p>
+      <w:pPr>
         <w:rPr>
           <w:b/>
           <w:bCs/>
@@ -9643,7 +9797,6 @@
           <w:bCs/>
           <w:lang w:val="en-GB"/>
         </w:rPr>
-        <w:lastRenderedPageBreak/>
         <w:t>Description:</w:t>
       </w:r>
       <w:r>
@@ -10052,6 +10205,7 @@
         </w:rPr>
       </w:pPr>
       <w:r>
+        <w:lastRenderedPageBreak/>
         <w:t xml:space="preserve">Script-Migration -From </w:t>
       </w:r>
       <w:r>
@@ -10236,7 +10390,6 @@
         </w:rPr>
       </w:pPr>
       <w:r>
-        <w:lastRenderedPageBreak/>
         <w:t xml:space="preserve">Script-Migration -From </w:t>
       </w:r>
       <w:r>
@@ -11342,6 +11495,7 @@
         </w:rPr>
       </w:pPr>
       <w:r>
+        <w:lastRenderedPageBreak/>
         <w:t xml:space="preserve">Script-Migration -From </w:t>
       </w:r>
       <w:r>
@@ -11510,7 +11664,6 @@
         </w:rPr>
       </w:pPr>
       <w:r>
-        <w:lastRenderedPageBreak/>
         <w:t xml:space="preserve">Script-Migration -From </w:t>
       </w:r>
       <w:r>
@@ -12036,6 +12189,7 @@
         </w:rPr>
       </w:pPr>
       <w:r>
+        <w:lastRenderedPageBreak/>
         <w:t xml:space="preserve">Script-Migration -From </w:t>
       </w:r>
       <w:r>
@@ -12210,7 +12364,6 @@
           <w:b/>
           <w:bCs/>
         </w:rPr>
-        <w:lastRenderedPageBreak/>
         <w:t>PMC script:</w:t>
       </w:r>
     </w:p>
@@ -12719,6 +12872,7 @@
           <w:bCs/>
           <w:lang w:val="en-GB"/>
         </w:rPr>
+        <w:lastRenderedPageBreak/>
         <w:t>Description:</w:t>
       </w:r>
       <w:r>
@@ -12894,7 +13048,6 @@
           <w:color w:val="EE0000"/>
           <w:lang w:val="en-GB"/>
         </w:rPr>
-        <w:lastRenderedPageBreak/>
         <w:t>Migration script #</w:t>
       </w:r>
       <w:r>
@@ -13359,6 +13512,7 @@
         </w:rPr>
       </w:pPr>
       <w:r>
+        <w:lastRenderedPageBreak/>
         <w:t xml:space="preserve">Script-Migration -From </w:t>
       </w:r>
       <w:r>
@@ -13551,7 +13705,6 @@
         </w:rPr>
       </w:pPr>
       <w:r>
-        <w:lastRenderedPageBreak/>
         <w:t xml:space="preserve">Script-Migration -From </w:t>
       </w:r>
       <w:r>
@@ -14107,6 +14260,7 @@
           <w:b/>
           <w:bCs/>
         </w:rPr>
+        <w:lastRenderedPageBreak/>
         <w:t>PMC script:</w:t>
       </w:r>
     </w:p>
@@ -14299,7 +14453,6 @@
           <w:b/>
           <w:bCs/>
         </w:rPr>
-        <w:lastRenderedPageBreak/>
         <w:t>PMC script:</w:t>
       </w:r>
     </w:p>
@@ -14823,6 +14976,7 @@
           <w:color w:val="EE0000"/>
           <w:lang w:val="en-GB"/>
         </w:rPr>
+        <w:lastRenderedPageBreak/>
         <w:t>Migration script #</w:t>
       </w:r>
       <w:r>
@@ -15018,7 +15172,6 @@
           <w:color w:val="EE0000"/>
           <w:lang w:val="en-GB"/>
         </w:rPr>
-        <w:lastRenderedPageBreak/>
         <w:t>Migration script #</w:t>
       </w:r>
       <w:r>
@@ -15589,6 +15742,7 @@
           <w:color w:val="EE0000"/>
           <w:lang w:val="en-GB"/>
         </w:rPr>
+        <w:lastRenderedPageBreak/>
         <w:t>Migration script #</w:t>
       </w:r>
       <w:r>
@@ -15784,7 +15938,6 @@
           <w:color w:val="EE0000"/>
           <w:lang w:val="en-GB"/>
         </w:rPr>
-        <w:lastRenderedPageBreak/>
         <w:t>Migration script #</w:t>
       </w:r>
       <w:r>
@@ -16361,6 +16514,7 @@
           <w:color w:val="EE0000"/>
           <w:lang w:val="en-GB"/>
         </w:rPr>
+        <w:lastRenderedPageBreak/>
         <w:t>Migration script #</w:t>
       </w:r>
       <w:r>
@@ -16542,7 +16696,6 @@
           <w:color w:val="EE0000"/>
           <w:lang w:val="en-GB"/>
         </w:rPr>
-        <w:lastRenderedPageBreak/>
         <w:t>Migration script #</w:t>
       </w:r>
       <w:r>
@@ -17179,6 +17332,7 @@
           <w:b/>
           <w:bCs/>
         </w:rPr>
+        <w:lastRenderedPageBreak/>
         <w:t>PMC script:</w:t>
       </w:r>
     </w:p>
@@ -17385,7 +17539,6 @@
         </w:rPr>
       </w:pPr>
       <w:r>
-        <w:lastRenderedPageBreak/>
         <w:t xml:space="preserve">Script-Migration -From </w:t>
       </w:r>
       <w:r>
@@ -18163,6 +18316,7 @@
           <w:bCs/>
           <w:lang w:val="en-GB"/>
         </w:rPr>
+        <w:lastRenderedPageBreak/>
         <w:t>Description:</w:t>
       </w:r>
       <w:r>
@@ -18308,24 +18462,6 @@
         </w:rPr>
         <w:t xml:space="preserve"> on 14-Apr-2026</w:t>
       </w:r>
-    </w:p>
-    <w:p>
-      <w:pPr>
-        <w:spacing w:after="0"/>
-        <w:ind w:left="720"/>
-        <w:rPr>
-          <w:color w:val="00B050"/>
-        </w:rPr>
-      </w:pPr>
-    </w:p>
-    <w:p>
-      <w:pPr>
-        <w:spacing w:after="0"/>
-        <w:ind w:left="720"/>
-        <w:rPr>
-          <w:color w:val="00B050"/>
-        </w:rPr>
-      </w:pPr>
     </w:p>
     <w:p>
       <w:pPr>
@@ -18358,7 +18494,6 @@
           <w:color w:val="EE0000"/>
           <w:lang w:val="en-GB"/>
         </w:rPr>
-        <w:lastRenderedPageBreak/>
         <w:t>Migration script #</w:t>
       </w:r>
       <w:r>
@@ -18759,16 +18894,7 @@
           <w:color w:val="EE0000"/>
           <w:lang w:val="en-GB"/>
         </w:rPr>
-        <w:t>4</w:t>
-      </w:r>
-      <w:r>
-        <w:rPr>
-          <w:b/>
-          <w:bCs/>
-          <w:color w:val="EE0000"/>
-          <w:lang w:val="en-GB"/>
-        </w:rPr>
-        <w:t>9</w:t>
+        <w:t>49</w:t>
       </w:r>
     </w:p>
     <w:p>
@@ -18847,10 +18973,28 @@
         <w:t>AddGroupType</w:t>
       </w:r>
       <w:r>
-        <w:t xml:space="preserve"> </w:t>
-      </w:r>
-      <w:r>
-        <w:t xml:space="preserve">-To </w:t>
+        <w:t xml:space="preserve"> -To </w:t>
+      </w:r>
+      <w:r>
+        <w:rPr>
+          <w:lang w:val="en-GB"/>
+        </w:rPr>
+        <w:t xml:space="preserve">AddApprovalStageDesc </w:t>
+      </w:r>
+      <w:r>
+        <w:rPr>
+          <w:lang w:val="en-GB"/>
+        </w:rPr>
+        <w:t>-Context AppDbContext</w:t>
+      </w:r>
+      <w:r>
+        <w:t xml:space="preserve"> -Output </w:t>
+      </w:r>
+      <w:r>
+        <w:rPr>
+          <w:lang w:val="en-GB"/>
+        </w:rPr>
+        <w:t>".\MigrationScripts\</w:t>
       </w:r>
       <w:r>
         <w:rPr>
@@ -18862,6 +19006,173 @@
         <w:rPr>
           <w:lang w:val="en-GB"/>
         </w:rPr>
+        <w:t>.sql"</w:t>
+      </w:r>
+    </w:p>
+    <w:p>
+      <w:pPr>
+        <w:spacing w:after="0"/>
+        <w:ind w:left="720"/>
+        <w:rPr>
+          <w:color w:val="00B050"/>
+        </w:rPr>
+      </w:pPr>
+      <w:r>
+        <w:rPr>
+          <w:lang w:val="en-GB"/>
+        </w:rPr>
+        <w:t>Status:</w:t>
+      </w:r>
+      <w:r>
+        <w:rPr>
+          <w:b/>
+          <w:bCs/>
+          <w:color w:val="00B050"/>
+          <w:lang w:val="en-GB"/>
+        </w:rPr>
+        <w:t xml:space="preserve"> </w:t>
+      </w:r>
+      <w:r>
+        <w:rPr>
+          <w:color w:val="00B050"/>
+        </w:rPr>
+        <w:t>Migration completed</w:t>
+      </w:r>
+      <w:r>
+        <w:rPr>
+          <w:color w:val="00B050"/>
+        </w:rPr>
+        <w:t xml:space="preserve"> on 20-Apr-2026</w:t>
+      </w:r>
+    </w:p>
+    <w:p>
+      <w:pPr>
+        <w:spacing w:after="0"/>
+        <w:ind w:left="720"/>
+        <w:rPr>
+          <w:color w:val="00B050"/>
+        </w:rPr>
+      </w:pPr>
+    </w:p>
+    <w:p>
+      <w:pPr>
+        <w:pStyle w:val="ListParagraph"/>
+        <w:numPr>
+          <w:ilvl w:val="0"/>
+          <w:numId w:val="3"/>
+        </w:numPr>
+        <w:spacing w:after="0"/>
+        <w:rPr>
+          <w:b/>
+          <w:bCs/>
+          <w:color w:val="EE0000"/>
+          <w:lang w:val="en-GB"/>
+        </w:rPr>
+      </w:pPr>
+      <w:r>
+        <w:rPr>
+          <w:b/>
+          <w:bCs/>
+          <w:color w:val="EE0000"/>
+          <w:lang w:val="en-GB"/>
+        </w:rPr>
+        <w:t>Migration script #</w:t>
+      </w:r>
+      <w:r>
+        <w:rPr>
+          <w:b/>
+          <w:bCs/>
+          <w:color w:val="EE0000"/>
+          <w:lang w:val="en-GB"/>
+        </w:rPr>
+        <w:t>50</w:t>
+      </w:r>
+    </w:p>
+    <w:p>
+      <w:pPr>
+        <w:spacing w:after="0"/>
+        <w:ind w:left="720"/>
+        <w:rPr>
+          <w:lang w:val="en-GB"/>
+        </w:rPr>
+      </w:pPr>
+      <w:r>
+        <w:rPr>
+          <w:b/>
+          <w:bCs/>
+          <w:lang w:val="en-GB"/>
+        </w:rPr>
+        <w:t>Description:</w:t>
+      </w:r>
+      <w:r>
+        <w:rPr>
+          <w:lang w:val="en-GB"/>
+        </w:rPr>
+        <w:t xml:space="preserve"> Create SQL migration script from “</w:t>
+      </w:r>
+      <w:r>
+        <w:rPr>
+          <w:lang w:val="en-GB"/>
+        </w:rPr>
+        <w:t>AddApprovalStageDesc</w:t>
+      </w:r>
+      <w:r>
+        <w:rPr>
+          <w:lang w:val="en-GB"/>
+        </w:rPr>
+        <w:t>” to  “</w:t>
+      </w:r>
+      <w:r>
+        <w:t>AddRegularRequestWF</w:t>
+      </w:r>
+      <w:r>
+        <w:rPr>
+          <w:lang w:val="en-GB"/>
+        </w:rPr>
+        <w:t>”</w:t>
+      </w:r>
+    </w:p>
+    <w:p>
+      <w:pPr>
+        <w:spacing w:after="0"/>
+        <w:ind w:left="720"/>
+        <w:rPr>
+          <w:b/>
+          <w:bCs/>
+        </w:rPr>
+      </w:pPr>
+      <w:r>
+        <w:rPr>
+          <w:b/>
+          <w:bCs/>
+        </w:rPr>
+        <w:t>PMC script:</w:t>
+      </w:r>
+    </w:p>
+    <w:p>
+      <w:pPr>
+        <w:spacing w:after="0"/>
+        <w:ind w:left="720"/>
+        <w:rPr>
+          <w:lang w:val="en-GB"/>
+        </w:rPr>
+      </w:pPr>
+      <w:r>
+        <w:t xml:space="preserve">Script-Migration -From </w:t>
+      </w:r>
+      <w:r>
+        <w:rPr>
+          <w:lang w:val="en-GB"/>
+        </w:rPr>
+        <w:t>AddApprovalStageDesc</w:t>
+      </w:r>
+      <w:r>
+        <w:t xml:space="preserve"> -To </w:t>
+      </w:r>
+      <w:r>
+        <w:t>AddRegularRequestWF</w:t>
+      </w:r>
+      <w:r>
         <w:t xml:space="preserve"> </w:t>
       </w:r>
       <w:r>
@@ -18880,10 +19191,7 @@
         <w:t>".\MigrationScripts\</w:t>
       </w:r>
       <w:r>
-        <w:rPr>
-          <w:lang w:val="en-GB"/>
-        </w:rPr>
-        <w:t>AddApprovalStageDesc</w:t>
+        <w:t>AddRegularRequestWF</w:t>
       </w:r>
       <w:r>
         <w:rPr>
@@ -18917,27 +19225,9 @@
       </w:r>
       <w:r>
         <w:rPr>
-          <w:color w:val="00B050"/>
-        </w:rPr>
-        <w:t>Migration completed</w:t>
-      </w:r>
-      <w:r>
-        <w:rPr>
-          <w:color w:val="00B050"/>
-        </w:rPr>
-        <w:t xml:space="preserve"> on </w:t>
-      </w:r>
-      <w:r>
-        <w:rPr>
-          <w:color w:val="00B050"/>
-        </w:rPr>
-        <w:t>20</w:t>
-      </w:r>
-      <w:r>
-        <w:rPr>
-          <w:color w:val="00B050"/>
-        </w:rPr>
-        <w:t>-Apr-2026</w:t>
+          <w:color w:val="EE0000"/>
+        </w:rPr>
+        <w:t>Pending</w:t>
       </w:r>
     </w:p>
     <w:p>
@@ -19020,7 +19310,6 @@
         <w:rPr>
           <w:lang w:val="en-GB"/>
         </w:rPr>
-        <w:lastRenderedPageBreak/>
         <w:t>I have created a new migration called, Update</w:t>
       </w:r>
       <w:r>
@@ -19932,7 +20221,7 @@
   <w:abstractNum w:abstractNumId="8" w15:restartNumberingAfterBreak="0">
     <w:nsid w:val="7A8E6340"/>
     <w:multiLevelType w:val="hybridMultilevel"/>
-    <w:tmpl w:val="43FED5D0"/>
+    <w:tmpl w:val="39107FEC"/>
     <w:lvl w:ilvl="0" w:tplc="04090001">
       <w:start w:val="1"/>
       <w:numFmt w:val="bullet"/>
@@ -19957,16 +20246,16 @@
         <w:rFonts w:ascii="Courier New" w:hAnsi="Courier New" w:cs="Courier New" w:hint="default"/>
       </w:rPr>
     </w:lvl>
-    <w:lvl w:ilvl="2" w:tplc="04090005">
+    <w:lvl w:ilvl="2" w:tplc="04090001">
       <w:start w:val="1"/>
       <w:numFmt w:val="bullet"/>
-      <w:lvlText w:val=""/>
+      <w:lvlText w:val=""/>
       <w:lvlJc w:val="left"/>
       <w:pPr>
         <w:ind w:left="1800" w:hanging="360"/>
       </w:pPr>
       <w:rPr>
-        <w:rFonts w:ascii="Wingdings" w:hAnsi="Wingdings" w:hint="default"/>
+        <w:rFonts w:ascii="Symbol" w:hAnsi="Symbol" w:hint="default"/>
       </w:rPr>
     </w:lvl>
     <w:lvl w:ilvl="3" w:tplc="04090001" w:tentative="1">
@@ -20472,7 +20761,7 @@
   <w:style w:type="paragraph" w:default="1" w:styleId="Normal">
     <w:name w:val="Normal"/>
     <w:qFormat/>
-    <w:rsid w:val="00325888"/>
+    <w:rsid w:val="008D517C"/>
   </w:style>
   <w:style w:type="paragraph" w:styleId="Heading1">
     <w:name w:val="heading 1"/>

</xml_diff>

<commit_message>
Implemented CRUD operations for overtime request and completed data migration for populating DB objects used in OT module
</commit_message>
<xml_diff>
--- a/MigrationScripts/EF Core Migration History.docx
+++ b/MigrationScripts/EF Core Migration History.docx
@@ -12283,15 +12283,7 @@
           <w:bCs/>
           <w:color w:val="EE0000"/>
         </w:rPr>
-        <w:t>5</w:t>
-      </w:r>
-      <w:r>
-        <w:rPr>
-          <w:b/>
-          <w:bCs/>
-          <w:color w:val="EE0000"/>
-        </w:rPr>
-        <w:t>9</w:t>
+        <w:t>59</w:t>
       </w:r>
     </w:p>
     <w:p>
@@ -12310,13 +12302,7 @@
         <w:rPr>
           <w:lang w:val="en-GB"/>
         </w:rPr>
-        <w:t>Add</w:t>
-      </w:r>
-      <w:r>
-        <w:rPr>
-          <w:lang w:val="en-GB"/>
-        </w:rPr>
-        <w:t>NewField</w:t>
+        <w:t>AddNewField</w:t>
       </w:r>
       <w:r>
         <w:rPr>
@@ -12420,6 +12406,9 @@
       <w:pPr>
         <w:spacing w:after="0"/>
         <w:ind w:left="1080"/>
+        <w:rPr>
+          <w:color w:val="00B050"/>
+        </w:rPr>
       </w:pPr>
       <w:r>
         <w:t>Development Database:</w:t>
@@ -12456,6 +12445,265 @@
       <w:pPr>
         <w:spacing w:after="0"/>
         <w:ind w:left="1080"/>
+        <w:rPr>
+          <w:color w:val="00B050"/>
+        </w:rPr>
+      </w:pPr>
+    </w:p>
+    <w:p>
+      <w:pPr>
+        <w:spacing w:after="0"/>
+        <w:ind w:left="1080"/>
+        <w:rPr>
+          <w:color w:val="00B050"/>
+        </w:rPr>
+      </w:pPr>
+    </w:p>
+    <w:p>
+      <w:pPr>
+        <w:spacing w:after="0"/>
+        <w:ind w:left="1080"/>
+        <w:rPr>
+          <w:color w:val="00B050"/>
+        </w:rPr>
+      </w:pPr>
+    </w:p>
+    <w:p>
+      <w:pPr>
+        <w:spacing w:after="0"/>
+        <w:ind w:left="1080"/>
+        <w:rPr>
+          <w:color w:val="00B050"/>
+        </w:rPr>
+      </w:pPr>
+    </w:p>
+    <w:p>
+      <w:pPr>
+        <w:spacing w:after="0"/>
+        <w:ind w:left="1080"/>
+        <w:rPr>
+          <w:color w:val="00B050"/>
+        </w:rPr>
+      </w:pPr>
+    </w:p>
+    <w:p>
+      <w:pPr>
+        <w:spacing w:after="0"/>
+        <w:ind w:left="1080"/>
+        <w:rPr>
+          <w:color w:val="00B050"/>
+        </w:rPr>
+      </w:pPr>
+    </w:p>
+    <w:p>
+      <w:pPr>
+        <w:spacing w:after="0"/>
+        <w:ind w:left="1080"/>
+        <w:rPr>
+          <w:color w:val="00B050"/>
+        </w:rPr>
+      </w:pPr>
+    </w:p>
+    <w:p>
+      <w:pPr>
+        <w:pStyle w:val="ListParagraph"/>
+        <w:numPr>
+          <w:ilvl w:val="0"/>
+          <w:numId w:val="6"/>
+        </w:numPr>
+        <w:spacing w:after="0"/>
+        <w:rPr>
+          <w:b/>
+          <w:bCs/>
+          <w:color w:val="EE0000"/>
+        </w:rPr>
+      </w:pPr>
+      <w:r>
+        <w:rPr>
+          <w:b/>
+          <w:bCs/>
+          <w:color w:val="EE0000"/>
+        </w:rPr>
+        <w:lastRenderedPageBreak/>
+        <w:t>Data Migration PMC Command #</w:t>
+      </w:r>
+      <w:r>
+        <w:rPr>
+          <w:b/>
+          <w:bCs/>
+          <w:color w:val="EE0000"/>
+        </w:rPr>
+        <w:t>60</w:t>
+      </w:r>
+    </w:p>
+    <w:p>
+      <w:pPr>
+        <w:spacing w:after="0"/>
+        <w:ind w:left="1080"/>
+      </w:pPr>
+      <w:r>
+        <w:t>Add-Migration</w:t>
+      </w:r>
+      <w:r>
+        <w:t xml:space="preserve"> </w:t>
+      </w:r>
+      <w:proofErr w:type="spellStart"/>
+      <w:r>
+        <w:rPr>
+          <w:lang w:val="en-GB"/>
+        </w:rPr>
+        <w:t>CreateEntity</w:t>
+      </w:r>
+      <w:r>
+        <w:rPr>
+          <w:lang w:val="en-GB"/>
+        </w:rPr>
+        <w:t>OTRequestWF</w:t>
+      </w:r>
+      <w:proofErr w:type="spellEnd"/>
+      <w:r>
+        <w:rPr>
+          <w:lang w:val="en-GB"/>
+        </w:rPr>
+        <w:t xml:space="preserve"> </w:t>
+      </w:r>
+      <w:r>
+        <w:t xml:space="preserve">-Context </w:t>
+      </w:r>
+      <w:proofErr w:type="spellStart"/>
+      <w:r>
+        <w:t>AppDbContext</w:t>
+      </w:r>
+      <w:proofErr w:type="spellEnd"/>
+      <w:r>
+        <w:t xml:space="preserve"> </w:t>
+      </w:r>
+      <w:r>
+        <w:t xml:space="preserve">-Project </w:t>
+      </w:r>
+      <w:proofErr w:type="spellStart"/>
+      <w:r>
+        <w:t>KenHRApp.Infrastructure</w:t>
+      </w:r>
+      <w:proofErr w:type="spellEnd"/>
+      <w:r>
+        <w:t xml:space="preserve"> -</w:t>
+      </w:r>
+      <w:proofErr w:type="spellStart"/>
+      <w:r>
+        <w:t>StartupProject</w:t>
+      </w:r>
+      <w:proofErr w:type="spellEnd"/>
+      <w:r>
+        <w:t xml:space="preserve"> </w:t>
+      </w:r>
+      <w:proofErr w:type="spellStart"/>
+      <w:r>
+        <w:t>KenHRApp.Web</w:t>
+      </w:r>
+      <w:proofErr w:type="spellEnd"/>
+      <w:r>
+        <w:t xml:space="preserve"> -Verbose</w:t>
+      </w:r>
+    </w:p>
+    <w:p>
+      <w:pPr>
+        <w:spacing w:after="0"/>
+        <w:ind w:left="1080"/>
+      </w:pPr>
+    </w:p>
+    <w:p>
+      <w:pPr>
+        <w:spacing w:after="0"/>
+        <w:ind w:left="1080"/>
+      </w:pPr>
+      <w:r>
+        <w:t xml:space="preserve">Update-Database </w:t>
+      </w:r>
+      <w:r>
+        <w:t xml:space="preserve">-Context </w:t>
+      </w:r>
+      <w:proofErr w:type="spellStart"/>
+      <w:r>
+        <w:t>AppDbContext</w:t>
+      </w:r>
+      <w:proofErr w:type="spellEnd"/>
+    </w:p>
+    <w:p>
+      <w:pPr>
+        <w:spacing w:after="0"/>
+        <w:ind w:left="1080"/>
+        <w:rPr>
+          <w:u w:val="single"/>
+        </w:rPr>
+      </w:pPr>
+      <w:r>
+        <w:rPr>
+          <w:b/>
+          <w:bCs/>
+          <w:u w:val="single"/>
+        </w:rPr>
+        <w:t>Status:</w:t>
+      </w:r>
+      <w:r>
+        <w:rPr>
+          <w:u w:val="single"/>
+        </w:rPr>
+        <w:t xml:space="preserve"> </w:t>
+      </w:r>
+    </w:p>
+    <w:p>
+      <w:pPr>
+        <w:spacing w:after="0"/>
+        <w:ind w:left="1080"/>
+      </w:pPr>
+      <w:r>
+        <w:t>Development Database:</w:t>
+      </w:r>
+      <w:r>
+        <w:t xml:space="preserve"> </w:t>
+      </w:r>
+      <w:r>
+        <w:rPr>
+          <w:color w:val="00B050"/>
+        </w:rPr>
+        <w:t>Completed</w:t>
+      </w:r>
+      <w:r>
+        <w:rPr>
+          <w:color w:val="00B050"/>
+        </w:rPr>
+        <w:t xml:space="preserve"> on </w:t>
+      </w:r>
+      <w:r>
+        <w:rPr>
+          <w:color w:val="00B050"/>
+        </w:rPr>
+        <w:t>06</w:t>
+      </w:r>
+      <w:r>
+        <w:rPr>
+          <w:color w:val="00B050"/>
+        </w:rPr>
+        <w:t>-</w:t>
+      </w:r>
+      <w:r>
+        <w:rPr>
+          <w:color w:val="00B050"/>
+        </w:rPr>
+        <w:t>Jun</w:t>
+      </w:r>
+      <w:r>
+        <w:rPr>
+          <w:color w:val="00B050"/>
+        </w:rPr>
+        <w:t>-2026</w:t>
+      </w:r>
+    </w:p>
+    <w:p>
+      <w:pPr>
+        <w:spacing w:after="0"/>
+        <w:ind w:left="1080"/>
       </w:pPr>
     </w:p>
     <w:p>
@@ -12513,7 +12761,6 @@
     </w:p>
     <w:p>
       <w:r>
-        <w:lastRenderedPageBreak/>
         <w:t xml:space="preserve">Get-Migration -Context </w:t>
       </w:r>
       <w:proofErr w:type="spellStart"/>
@@ -12943,6 +13190,7 @@
           <w:color w:val="00B050"/>
           <w:lang w:val="en-GB"/>
         </w:rPr>
+        <w:lastRenderedPageBreak/>
         <w:t>Status: Completed</w:t>
       </w:r>
     </w:p>
@@ -13201,7 +13449,6 @@
           <w:bCs/>
           <w:lang w:val="en-GB"/>
         </w:rPr>
-        <w:lastRenderedPageBreak/>
         <w:t>Description:</w:t>
       </w:r>
       <w:r>
@@ -13703,6 +13950,7 @@
           <w:b/>
           <w:bCs/>
         </w:rPr>
+        <w:lastRenderedPageBreak/>
         <w:t>PMC script:</w:t>
       </w:r>
     </w:p>
@@ -13958,7 +14206,6 @@
         </w:rPr>
       </w:pPr>
       <w:r>
-        <w:lastRenderedPageBreak/>
         <w:t xml:space="preserve">Script-Migration -From </w:t>
       </w:r>
       <w:proofErr w:type="spellStart"/>
@@ -14564,6 +14811,7 @@
           <w:color w:val="00B050"/>
           <w:lang w:val="en-GB"/>
         </w:rPr>
+        <w:lastRenderedPageBreak/>
         <w:t xml:space="preserve">Status: </w:t>
       </w:r>
       <w:r>
@@ -15373,6 +15621,7 @@
           <w:b/>
           <w:bCs/>
         </w:rPr>
+        <w:lastRenderedPageBreak/>
         <w:t>PMC script:</w:t>
       </w:r>
     </w:p>
@@ -15606,7 +15855,6 @@
         </w:rPr>
       </w:pPr>
       <w:r>
-        <w:lastRenderedPageBreak/>
         <w:t xml:space="preserve">Script-Migration -From </w:t>
       </w:r>
       <w:proofErr w:type="spellStart"/>
@@ -16291,6 +16539,7 @@
           <w:b/>
           <w:bCs/>
         </w:rPr>
+        <w:lastRenderedPageBreak/>
         <w:t>PMC script:</w:t>
       </w:r>
     </w:p>
@@ -16522,7 +16771,6 @@
           <w:b/>
           <w:bCs/>
         </w:rPr>
-        <w:lastRenderedPageBreak/>
         <w:t>PMC script:</w:t>
       </w:r>
     </w:p>
@@ -17148,6 +17396,7 @@
           <w:color w:val="EE0000"/>
           <w:lang w:val="en-GB"/>
         </w:rPr>
+        <w:lastRenderedPageBreak/>
         <w:t>Migration script #</w:t>
       </w:r>
       <w:r>
@@ -17408,7 +17657,6 @@
           <w:color w:val="EE0000"/>
           <w:lang w:val="en-GB"/>
         </w:rPr>
-        <w:lastRenderedPageBreak/>
         <w:t>Migration script #</w:t>
       </w:r>
       <w:r>
@@ -17972,6 +18220,7 @@
           <w:b/>
           <w:bCs/>
         </w:rPr>
+        <w:lastRenderedPageBreak/>
         <w:t>PMC script:</w:t>
       </w:r>
     </w:p>
@@ -18245,7 +18494,6 @@
         </w:rPr>
       </w:pPr>
       <w:r>
-        <w:lastRenderedPageBreak/>
         <w:t xml:space="preserve">Script-Migration -From </w:t>
       </w:r>
       <w:proofErr w:type="spellStart"/>
@@ -18899,6 +19147,7 @@
           <w:bCs/>
           <w:lang w:val="en-GB"/>
         </w:rPr>
+        <w:lastRenderedPageBreak/>
         <w:t>Description:</w:t>
       </w:r>
       <w:r>
@@ -19195,7 +19444,6 @@
           <w:b/>
           <w:bCs/>
         </w:rPr>
-        <w:lastRenderedPageBreak/>
         <w:t>PMC script:</w:t>
       </w:r>
     </w:p>
@@ -19792,6 +20040,7 @@
         <w:rPr>
           <w:lang w:val="en-GB"/>
         </w:rPr>
+        <w:lastRenderedPageBreak/>
         <w:t>Status:</w:t>
       </w:r>
       <w:r>
@@ -20086,7 +20335,6 @@
           <w:color w:val="EE0000"/>
           <w:lang w:val="en-GB"/>
         </w:rPr>
-        <w:lastRenderedPageBreak/>
         <w:t>Migration script #</w:t>
       </w:r>
       <w:r>
@@ -20662,6 +20910,7 @@
         </w:rPr>
       </w:pPr>
       <w:r>
+        <w:lastRenderedPageBreak/>
         <w:t xml:space="preserve">Script-Migration -From </w:t>
       </w:r>
       <w:proofErr w:type="spellStart"/>
@@ -21044,7 +21293,6 @@
           <w:color w:val="EE0000"/>
           <w:lang w:val="en-GB"/>
         </w:rPr>
-        <w:lastRenderedPageBreak/>
         <w:t>Migration script #</w:t>
       </w:r>
       <w:r>
@@ -21636,6 +21884,7 @@
         </w:rPr>
       </w:pPr>
       <w:r>
+        <w:lastRenderedPageBreak/>
         <w:t xml:space="preserve">Script-Migration -From </w:t>
       </w:r>
       <w:proofErr w:type="spellStart"/>
@@ -22012,7 +22261,6 @@
           <w:color w:val="EE0000"/>
           <w:lang w:val="en-GB"/>
         </w:rPr>
-        <w:lastRenderedPageBreak/>
         <w:t>Migration script #</w:t>
       </w:r>
       <w:r>
@@ -22741,6 +22989,7 @@
           <w:color w:val="EE0000"/>
           <w:lang w:val="en-GB"/>
         </w:rPr>
+        <w:lastRenderedPageBreak/>
         <w:t>Migration script #</w:t>
       </w:r>
       <w:r>
@@ -23081,7 +23330,6 @@
         </w:rPr>
       </w:pPr>
       <w:r>
-        <w:lastRenderedPageBreak/>
         <w:t xml:space="preserve">Script-Migration -From </w:t>
       </w:r>
       <w:proofErr w:type="spellStart"/>
@@ -23974,6 +24222,7 @@
         <w:rPr>
           <w:lang w:val="en-GB"/>
         </w:rPr>
+        <w:lastRenderedPageBreak/>
         <w:t>Status:</w:t>
       </w:r>
       <w:r>
@@ -24296,7 +24545,6 @@
           <w:color w:val="EE0000"/>
           <w:lang w:val="en-GB"/>
         </w:rPr>
-        <w:lastRenderedPageBreak/>
         <w:t>Migration script #</w:t>
       </w:r>
       <w:r>
@@ -25078,6 +25326,7 @@
           <w:bCs/>
           <w:lang w:val="en-GB"/>
         </w:rPr>
+        <w:lastRenderedPageBreak/>
         <w:t>Description:</w:t>
       </w:r>
       <w:r>
@@ -25487,7 +25736,6 @@
         <w:rPr>
           <w:lang w:val="en-GB"/>
         </w:rPr>
-        <w:lastRenderedPageBreak/>
         <w:t>Status:</w:t>
       </w:r>
       <w:r>
@@ -25797,16 +26045,7 @@
           <w:color w:val="EE0000"/>
           <w:lang w:val="en-GB"/>
         </w:rPr>
-        <w:t>5</w:t>
-      </w:r>
-      <w:r>
-        <w:rPr>
-          <w:b/>
-          <w:bCs/>
-          <w:color w:val="EE0000"/>
-          <w:lang w:val="en-GB"/>
-        </w:rPr>
-        <w:t>3</w:t>
+        <w:t>53</w:t>
       </w:r>
     </w:p>
     <w:p>
@@ -25896,10 +26135,7 @@
       </w:r>
       <w:proofErr w:type="spellEnd"/>
       <w:r>
-        <w:t xml:space="preserve"> </w:t>
-      </w:r>
-      <w:r>
-        <w:t xml:space="preserve">-To </w:t>
+        <w:t xml:space="preserve"> -To </w:t>
       </w:r>
       <w:proofErr w:type="spellStart"/>
       <w:r>
@@ -26002,6 +26238,273 @@
         <w:rPr>
           <w:color w:val="00B050"/>
         </w:rPr>
+        <w:t>Migration completed</w:t>
+      </w:r>
+      <w:r>
+        <w:rPr>
+          <w:color w:val="00B050"/>
+        </w:rPr>
+        <w:t xml:space="preserve"> on 2</w:t>
+      </w:r>
+      <w:r>
+        <w:rPr>
+          <w:color w:val="00B050"/>
+        </w:rPr>
+        <w:t>8</w:t>
+      </w:r>
+      <w:r>
+        <w:rPr>
+          <w:color w:val="00B050"/>
+        </w:rPr>
+        <w:t>-May-2026</w:t>
+      </w:r>
+    </w:p>
+    <w:p>
+      <w:pPr>
+        <w:spacing w:after="0"/>
+        <w:ind w:left="720"/>
+        <w:rPr>
+          <w:color w:val="00B050"/>
+        </w:rPr>
+      </w:pPr>
+    </w:p>
+    <w:p>
+      <w:pPr>
+        <w:pStyle w:val="ListParagraph"/>
+        <w:numPr>
+          <w:ilvl w:val="0"/>
+          <w:numId w:val="3"/>
+        </w:numPr>
+        <w:spacing w:after="0"/>
+        <w:rPr>
+          <w:b/>
+          <w:bCs/>
+          <w:color w:val="EE0000"/>
+          <w:lang w:val="en-GB"/>
+        </w:rPr>
+      </w:pPr>
+      <w:r>
+        <w:rPr>
+          <w:b/>
+          <w:bCs/>
+          <w:color w:val="EE0000"/>
+          <w:lang w:val="en-GB"/>
+        </w:rPr>
+        <w:t>Migration script #</w:t>
+      </w:r>
+      <w:r>
+        <w:rPr>
+          <w:b/>
+          <w:bCs/>
+          <w:color w:val="EE0000"/>
+          <w:lang w:val="en-GB"/>
+        </w:rPr>
+        <w:t>5</w:t>
+      </w:r>
+      <w:r>
+        <w:rPr>
+          <w:b/>
+          <w:bCs/>
+          <w:color w:val="EE0000"/>
+          <w:lang w:val="en-GB"/>
+        </w:rPr>
+        <w:t>4</w:t>
+      </w:r>
+    </w:p>
+    <w:p>
+      <w:pPr>
+        <w:spacing w:after="0"/>
+        <w:ind w:left="720"/>
+        <w:rPr>
+          <w:lang w:val="en-GB"/>
+        </w:rPr>
+      </w:pPr>
+      <w:r>
+        <w:rPr>
+          <w:b/>
+          <w:bCs/>
+          <w:lang w:val="en-GB"/>
+        </w:rPr>
+        <w:t>Description:</w:t>
+      </w:r>
+      <w:r>
+        <w:rPr>
+          <w:lang w:val="en-GB"/>
+        </w:rPr>
+        <w:t xml:space="preserve"> Create SQL migration script from “</w:t>
+      </w:r>
+      <w:proofErr w:type="spellStart"/>
+      <w:r>
+        <w:t>AddNewFieldRegularRequestWF</w:t>
+      </w:r>
+      <w:proofErr w:type="spellEnd"/>
+      <w:r>
+        <w:rPr>
+          <w:lang w:val="en-GB"/>
+        </w:rPr>
+        <w:t xml:space="preserve">” </w:t>
+      </w:r>
+      <w:proofErr w:type="gramStart"/>
+      <w:r>
+        <w:rPr>
+          <w:lang w:val="en-GB"/>
+        </w:rPr>
+        <w:t>to  “</w:t>
+      </w:r>
+      <w:proofErr w:type="spellStart"/>
+      <w:proofErr w:type="gramEnd"/>
+      <w:r>
+        <w:t>CreateEntityOTRequestWF</w:t>
+      </w:r>
+      <w:proofErr w:type="spellEnd"/>
+      <w:r>
+        <w:rPr>
+          <w:lang w:val="en-GB"/>
+        </w:rPr>
+        <w:t>”</w:t>
+      </w:r>
+    </w:p>
+    <w:p>
+      <w:pPr>
+        <w:spacing w:after="0"/>
+        <w:ind w:left="720"/>
+        <w:rPr>
+          <w:b/>
+          <w:bCs/>
+        </w:rPr>
+      </w:pPr>
+      <w:r>
+        <w:rPr>
+          <w:b/>
+          <w:bCs/>
+        </w:rPr>
+        <w:t>PMC script:</w:t>
+      </w:r>
+    </w:p>
+    <w:p>
+      <w:pPr>
+        <w:spacing w:after="0"/>
+        <w:ind w:left="720"/>
+        <w:rPr>
+          <w:lang w:val="en-GB"/>
+        </w:rPr>
+      </w:pPr>
+      <w:r>
+        <w:lastRenderedPageBreak/>
+        <w:t xml:space="preserve">Script-Migration -From </w:t>
+      </w:r>
+      <w:proofErr w:type="spellStart"/>
+      <w:r>
+        <w:t>AddNewFieldRegularRequestWF</w:t>
+      </w:r>
+      <w:proofErr w:type="spellEnd"/>
+      <w:r>
+        <w:t xml:space="preserve"> </w:t>
+      </w:r>
+      <w:r>
+        <w:t xml:space="preserve">-To </w:t>
+      </w:r>
+      <w:proofErr w:type="spellStart"/>
+      <w:r>
+        <w:t>CreateEntityOTRequestWF</w:t>
+      </w:r>
+      <w:proofErr w:type="spellEnd"/>
+      <w:r>
+        <w:rPr>
+          <w:lang w:val="en-GB"/>
+        </w:rPr>
+        <w:t xml:space="preserve"> </w:t>
+      </w:r>
+      <w:r>
+        <w:rPr>
+          <w:lang w:val="en-GB"/>
+        </w:rPr>
+        <w:t xml:space="preserve">-Context </w:t>
+      </w:r>
+      <w:proofErr w:type="spellStart"/>
+      <w:r>
+        <w:rPr>
+          <w:lang w:val="en-GB"/>
+        </w:rPr>
+        <w:t>AppDbContext</w:t>
+      </w:r>
+      <w:proofErr w:type="spellEnd"/>
+      <w:r>
+        <w:t xml:space="preserve"> -Output </w:t>
+      </w:r>
+      <w:r>
+        <w:rPr>
+          <w:lang w:val="en-GB"/>
+        </w:rPr>
+        <w:t>".\</w:t>
+      </w:r>
+      <w:proofErr w:type="spellStart"/>
+      <w:r>
+        <w:rPr>
+          <w:lang w:val="en-GB"/>
+        </w:rPr>
+        <w:t>MigrationScripts</w:t>
+      </w:r>
+      <w:proofErr w:type="spellEnd"/>
+      <w:r>
+        <w:rPr>
+          <w:lang w:val="en-GB"/>
+        </w:rPr>
+        <w:t>\</w:t>
+      </w:r>
+      <w:proofErr w:type="spellStart"/>
+      <w:r>
+        <w:t>CreateEntityOTRequestWF</w:t>
+      </w:r>
+      <w:proofErr w:type="spellEnd"/>
+      <w:r>
+        <w:rPr>
+          <w:lang w:val="en-GB"/>
+        </w:rPr>
+        <w:t>.</w:t>
+      </w:r>
+      <w:proofErr w:type="spellStart"/>
+      <w:r>
+        <w:rPr>
+          <w:lang w:val="en-GB"/>
+        </w:rPr>
+        <w:t>sql</w:t>
+      </w:r>
+      <w:proofErr w:type="spellEnd"/>
+      <w:r>
+        <w:rPr>
+          <w:lang w:val="en-GB"/>
+        </w:rPr>
+        <w:t>"</w:t>
+      </w:r>
+    </w:p>
+    <w:p>
+      <w:pPr>
+        <w:spacing w:after="0"/>
+        <w:ind w:left="720"/>
+        <w:rPr>
+          <w:color w:val="00B050"/>
+        </w:rPr>
+      </w:pPr>
+      <w:r>
+        <w:rPr>
+          <w:lang w:val="en-GB"/>
+        </w:rPr>
+        <w:t>Status:</w:t>
+      </w:r>
+      <w:r>
+        <w:rPr>
+          <w:b/>
+          <w:bCs/>
+          <w:color w:val="00B050"/>
+          <w:lang w:val="en-GB"/>
+        </w:rPr>
+        <w:t xml:space="preserve"> </w:t>
+      </w:r>
+      <w:r>
+        <w:rPr>
+          <w:color w:val="00B050"/>
+        </w:rPr>
         <w:t>Pending</w:t>
       </w:r>
     </w:p>
@@ -26120,14 +26623,7 @@
         <w:rPr>
           <w:lang w:val="en-GB"/>
         </w:rPr>
-        <w:t xml:space="preserve">. Now, I realized that there are entity properties that I need to correct. So, I need to delete this migration. Note that this migration was not yet implemented in the database since I haven’t executed the command, </w:t>
-      </w:r>
-      <w:r>
-        <w:rPr>
-          <w:lang w:val="en-GB"/>
-        </w:rPr>
-        <w:lastRenderedPageBreak/>
-        <w:t>Update-Database. Tell me how to remove this migration in my Blazor project without affecting the database.</w:t>
+        <w:t>. Now, I realized that there are entity properties that I need to correct. So, I need to delete this migration. Note that this migration was not yet implemented in the database since I haven’t executed the command, Update-Database. Tell me how to remove this migration in my Blazor project without affecting the database.</w:t>
       </w:r>
     </w:p>
     <w:p/>
@@ -27566,7 +28062,7 @@
   <w:style w:type="paragraph" w:default="1" w:styleId="Normal">
     <w:name w:val="Normal"/>
     <w:qFormat/>
-    <w:rsid w:val="00EF36A2"/>
+    <w:rsid w:val="0073075C"/>
   </w:style>
   <w:style w:type="paragraph" w:styleId="Heading1">
     <w:name w:val="heading 1"/>

</xml_diff>

<commit_message>
Added data migration called "CreateEntityOutdoorRequestWF"
</commit_message>
<xml_diff>
--- a/MigrationScripts/EF Core Migration History.docx
+++ b/MigrationScripts/EF Core Migration History.docx
@@ -12656,6 +12656,9 @@
       <w:pPr>
         <w:spacing w:after="0"/>
         <w:ind w:left="1080"/>
+        <w:rPr>
+          <w:color w:val="00B050"/>
+        </w:rPr>
       </w:pPr>
       <w:r>
         <w:t>Development Database:</w:t>
@@ -12698,6 +12701,185 @@
           <w:color w:val="00B050"/>
         </w:rPr>
         <w:t>-2026</w:t>
+      </w:r>
+    </w:p>
+    <w:p>
+      <w:pPr>
+        <w:spacing w:after="0"/>
+        <w:ind w:left="1080"/>
+        <w:rPr>
+          <w:color w:val="00B050"/>
+        </w:rPr>
+      </w:pPr>
+    </w:p>
+    <w:p>
+      <w:pPr>
+        <w:pStyle w:val="ListParagraph"/>
+        <w:numPr>
+          <w:ilvl w:val="0"/>
+          <w:numId w:val="6"/>
+        </w:numPr>
+        <w:spacing w:after="0"/>
+        <w:rPr>
+          <w:b/>
+          <w:bCs/>
+          <w:color w:val="EE0000"/>
+        </w:rPr>
+      </w:pPr>
+      <w:r>
+        <w:rPr>
+          <w:b/>
+          <w:bCs/>
+          <w:color w:val="EE0000"/>
+        </w:rPr>
+        <w:t>Data Migration PMC Command #</w:t>
+      </w:r>
+      <w:r>
+        <w:rPr>
+          <w:b/>
+          <w:bCs/>
+          <w:color w:val="EE0000"/>
+        </w:rPr>
+        <w:t>6</w:t>
+      </w:r>
+      <w:r>
+        <w:rPr>
+          <w:b/>
+          <w:bCs/>
+          <w:color w:val="EE0000"/>
+        </w:rPr>
+        <w:t>1</w:t>
+      </w:r>
+    </w:p>
+    <w:p>
+      <w:pPr>
+        <w:spacing w:after="0"/>
+        <w:ind w:left="1080"/>
+      </w:pPr>
+      <w:r>
+        <w:t>Add-Migration</w:t>
+      </w:r>
+      <w:r>
+        <w:t xml:space="preserve"> </w:t>
+      </w:r>
+      <w:proofErr w:type="spellStart"/>
+      <w:r>
+        <w:rPr>
+          <w:lang w:val="en-GB"/>
+        </w:rPr>
+        <w:t>CreateEntity</w:t>
+      </w:r>
+      <w:r>
+        <w:t>OutdoorRequestWF</w:t>
+      </w:r>
+      <w:proofErr w:type="spellEnd"/>
+      <w:r>
+        <w:rPr>
+          <w:lang w:val="en-GB"/>
+        </w:rPr>
+        <w:t xml:space="preserve"> </w:t>
+      </w:r>
+      <w:r>
+        <w:t xml:space="preserve">-Context </w:t>
+      </w:r>
+      <w:proofErr w:type="spellStart"/>
+      <w:r>
+        <w:t>AppDbContext</w:t>
+      </w:r>
+      <w:proofErr w:type="spellEnd"/>
+      <w:r>
+        <w:t xml:space="preserve"> </w:t>
+      </w:r>
+      <w:r>
+        <w:t xml:space="preserve">-Project </w:t>
+      </w:r>
+      <w:proofErr w:type="spellStart"/>
+      <w:r>
+        <w:t>KenHRApp.Infrastructure</w:t>
+      </w:r>
+      <w:proofErr w:type="spellEnd"/>
+      <w:r>
+        <w:t xml:space="preserve"> -</w:t>
+      </w:r>
+      <w:proofErr w:type="spellStart"/>
+      <w:r>
+        <w:t>StartupProject</w:t>
+      </w:r>
+      <w:proofErr w:type="spellEnd"/>
+      <w:r>
+        <w:t xml:space="preserve"> </w:t>
+      </w:r>
+      <w:proofErr w:type="spellStart"/>
+      <w:r>
+        <w:t>KenHRApp.Web</w:t>
+      </w:r>
+      <w:proofErr w:type="spellEnd"/>
+      <w:r>
+        <w:t xml:space="preserve"> -Verbose</w:t>
+      </w:r>
+    </w:p>
+    <w:p>
+      <w:pPr>
+        <w:spacing w:after="0"/>
+        <w:ind w:left="1080"/>
+      </w:pPr>
+    </w:p>
+    <w:p>
+      <w:pPr>
+        <w:spacing w:after="0"/>
+        <w:ind w:left="1080"/>
+      </w:pPr>
+      <w:r>
+        <w:t xml:space="preserve">Update-Database </w:t>
+      </w:r>
+      <w:r>
+        <w:t xml:space="preserve">-Context </w:t>
+      </w:r>
+      <w:proofErr w:type="spellStart"/>
+      <w:r>
+        <w:t>AppDbContext</w:t>
+      </w:r>
+      <w:proofErr w:type="spellEnd"/>
+    </w:p>
+    <w:p>
+      <w:pPr>
+        <w:spacing w:after="0"/>
+        <w:ind w:left="1080"/>
+        <w:rPr>
+          <w:u w:val="single"/>
+        </w:rPr>
+      </w:pPr>
+      <w:r>
+        <w:rPr>
+          <w:b/>
+          <w:bCs/>
+          <w:u w:val="single"/>
+        </w:rPr>
+        <w:t>Status:</w:t>
+      </w:r>
+      <w:r>
+        <w:rPr>
+          <w:u w:val="single"/>
+        </w:rPr>
+        <w:t xml:space="preserve"> </w:t>
+      </w:r>
+    </w:p>
+    <w:p>
+      <w:pPr>
+        <w:spacing w:after="0"/>
+        <w:ind w:left="1080"/>
+      </w:pPr>
+      <w:r>
+        <w:t>Development Database:</w:t>
+      </w:r>
+      <w:r>
+        <w:t xml:space="preserve"> </w:t>
+      </w:r>
+      <w:r>
+        <w:rPr>
+          <w:color w:val="EE0000"/>
+        </w:rPr>
+        <w:t>Pending</w:t>
       </w:r>
     </w:p>
     <w:p>
@@ -12982,6 +13164,7 @@
           <w:bCs/>
           <w:color w:val="EE0000"/>
         </w:rPr>
+        <w:lastRenderedPageBreak/>
         <w:t>To generate SQL migration script</w:t>
       </w:r>
       <w:r>
@@ -13190,7 +13373,6 @@
           <w:color w:val="00B050"/>
           <w:lang w:val="en-GB"/>
         </w:rPr>
-        <w:lastRenderedPageBreak/>
         <w:t>Status: Completed</w:t>
       </w:r>
     </w:p>
@@ -13739,6 +13921,7 @@
         </w:rPr>
       </w:pPr>
       <w:r>
+        <w:lastRenderedPageBreak/>
         <w:t xml:space="preserve">Script-Migration -From </w:t>
       </w:r>
       <w:proofErr w:type="spellStart"/>
@@ -13950,7 +14133,6 @@
           <w:b/>
           <w:bCs/>
         </w:rPr>
-        <w:lastRenderedPageBreak/>
         <w:t>PMC script:</w:t>
       </w:r>
     </w:p>
@@ -14811,7 +14993,6 @@
           <w:color w:val="00B050"/>
           <w:lang w:val="en-GB"/>
         </w:rPr>
-        <w:lastRenderedPageBreak/>
         <w:t xml:space="preserve">Status: </w:t>
       </w:r>
       <w:r>
@@ -15399,6 +15580,7 @@
           <w:b/>
           <w:bCs/>
         </w:rPr>
+        <w:lastRenderedPageBreak/>
         <w:t>PMC script:</w:t>
       </w:r>
     </w:p>
@@ -15621,7 +15803,6 @@
           <w:b/>
           <w:bCs/>
         </w:rPr>
-        <w:lastRenderedPageBreak/>
         <w:t>PMC script:</w:t>
       </w:r>
     </w:p>
@@ -16301,6 +16482,7 @@
           <w:b/>
           <w:bCs/>
         </w:rPr>
+        <w:lastRenderedPageBreak/>
         <w:t>PMC script:</w:t>
       </w:r>
     </w:p>
@@ -16539,7 +16721,6 @@
           <w:b/>
           <w:bCs/>
         </w:rPr>
-        <w:lastRenderedPageBreak/>
         <w:t>PMC script:</w:t>
       </w:r>
     </w:p>
@@ -17147,6 +17328,7 @@
           <w:color w:val="EE0000"/>
           <w:lang w:val="en-GB"/>
         </w:rPr>
+        <w:lastRenderedPageBreak/>
         <w:t>Migration script #</w:t>
       </w:r>
       <w:r>
@@ -17396,7 +17578,6 @@
           <w:color w:val="EE0000"/>
           <w:lang w:val="en-GB"/>
         </w:rPr>
-        <w:lastRenderedPageBreak/>
         <w:t>Migration script #</w:t>
       </w:r>
       <w:r>
@@ -17982,6 +18163,7 @@
           <w:b/>
           <w:bCs/>
         </w:rPr>
+        <w:lastRenderedPageBreak/>
         <w:t>PMC script:</w:t>
       </w:r>
     </w:p>
@@ -18220,7 +18402,6 @@
           <w:b/>
           <w:bCs/>
         </w:rPr>
-        <w:lastRenderedPageBreak/>
         <w:t>PMC script:</w:t>
       </w:r>
     </w:p>
@@ -18965,6 +19146,7 @@
           <w:b/>
           <w:bCs/>
         </w:rPr>
+        <w:lastRenderedPageBreak/>
         <w:t>PMC script:</w:t>
       </w:r>
     </w:p>
@@ -19147,7 +19329,6 @@
           <w:bCs/>
           <w:lang w:val="en-GB"/>
         </w:rPr>
-        <w:lastRenderedPageBreak/>
         <w:t>Description:</w:t>
       </w:r>
       <w:r>
@@ -19850,6 +20031,7 @@
           <w:color w:val="EE0000"/>
           <w:lang w:val="en-GB"/>
         </w:rPr>
+        <w:lastRenderedPageBreak/>
         <w:t>Migration script #</w:t>
       </w:r>
       <w:r>
@@ -20040,7 +20222,6 @@
         <w:rPr>
           <w:lang w:val="en-GB"/>
         </w:rPr>
-        <w:lastRenderedPageBreak/>
         <w:t>Status:</w:t>
       </w:r>
       <w:r>
@@ -20774,6 +20955,7 @@
         <w:rPr>
           <w:lang w:val="en-GB"/>
         </w:rPr>
+        <w:lastRenderedPageBreak/>
         <w:t>Status:</w:t>
       </w:r>
       <w:r>
@@ -20910,7 +21092,6 @@
         </w:rPr>
       </w:pPr>
       <w:r>
-        <w:lastRenderedPageBreak/>
         <w:t xml:space="preserve">Script-Migration -From </w:t>
       </w:r>
       <w:proofErr w:type="spellStart"/>
@@ -21745,6 +21926,7 @@
         <w:rPr>
           <w:lang w:val="en-GB"/>
         </w:rPr>
+        <w:lastRenderedPageBreak/>
         <w:t>Status:</w:t>
       </w:r>
       <w:r>
@@ -21884,7 +22066,6 @@
         </w:rPr>
       </w:pPr>
       <w:r>
-        <w:lastRenderedPageBreak/>
         <w:t xml:space="preserve">Script-Migration -From </w:t>
       </w:r>
       <w:proofErr w:type="spellStart"/>
@@ -22727,6 +22908,24 @@
     </w:p>
     <w:p>
       <w:pPr>
+        <w:spacing w:after="0"/>
+        <w:ind w:left="720"/>
+        <w:rPr>
+          <w:color w:val="EE0000"/>
+        </w:rPr>
+      </w:pPr>
+    </w:p>
+    <w:p>
+      <w:pPr>
+        <w:spacing w:after="0"/>
+        <w:ind w:left="720"/>
+        <w:rPr>
+          <w:color w:val="EE0000"/>
+        </w:rPr>
+      </w:pPr>
+    </w:p>
+    <w:p>
+      <w:pPr>
         <w:pStyle w:val="ListParagraph"/>
         <w:numPr>
           <w:ilvl w:val="0"/>
@@ -22747,6 +22946,7 @@
           <w:color w:val="EE0000"/>
           <w:lang w:val="en-GB"/>
         </w:rPr>
+        <w:lastRenderedPageBreak/>
         <w:t>Migration script #</w:t>
       </w:r>
       <w:r>
@@ -22989,7 +23189,6 @@
           <w:color w:val="EE0000"/>
           <w:lang w:val="en-GB"/>
         </w:rPr>
-        <w:lastRenderedPageBreak/>
         <w:t>Migration script #</w:t>
       </w:r>
       <w:r>
@@ -23864,6 +24063,7 @@
         </w:rPr>
       </w:pPr>
       <w:r>
+        <w:lastRenderedPageBreak/>
         <w:t xml:space="preserve">Script-Migration -From </w:t>
       </w:r>
       <w:proofErr w:type="spellStart"/>
@@ -24222,7 +24422,6 @@
         <w:rPr>
           <w:lang w:val="en-GB"/>
         </w:rPr>
-        <w:lastRenderedPageBreak/>
         <w:t>Status:</w:t>
       </w:r>
       <w:r>
@@ -25048,6 +25247,7 @@
           <w:color w:val="EE0000"/>
           <w:lang w:val="en-GB"/>
         </w:rPr>
+        <w:lastRenderedPageBreak/>
         <w:t>Migration script #</w:t>
       </w:r>
       <w:r>
@@ -25326,7 +25526,6 @@
           <w:bCs/>
           <w:lang w:val="en-GB"/>
         </w:rPr>
-        <w:lastRenderedPageBreak/>
         <w:t>Description:</w:t>
       </w:r>
       <w:r>
@@ -26127,6 +26326,7 @@
         </w:rPr>
       </w:pPr>
       <w:r>
+        <w:lastRenderedPageBreak/>
         <w:t xml:space="preserve">Script-Migration -From </w:t>
       </w:r>
       <w:proofErr w:type="spellStart"/>
@@ -26244,19 +26444,7 @@
         <w:rPr>
           <w:color w:val="00B050"/>
         </w:rPr>
-        <w:t xml:space="preserve"> on 2</w:t>
-      </w:r>
-      <w:r>
-        <w:rPr>
-          <w:color w:val="00B050"/>
-        </w:rPr>
-        <w:t>8</w:t>
-      </w:r>
-      <w:r>
-        <w:rPr>
-          <w:color w:val="00B050"/>
-        </w:rPr>
-        <w:t>-May-2026</w:t>
+        <w:t xml:space="preserve"> on 28-May-2026</w:t>
       </w:r>
     </w:p>
     <w:p>
@@ -26299,16 +26487,7 @@
           <w:color w:val="EE0000"/>
           <w:lang w:val="en-GB"/>
         </w:rPr>
-        <w:t>5</w:t>
-      </w:r>
-      <w:r>
-        <w:rPr>
-          <w:b/>
-          <w:bCs/>
-          <w:color w:val="EE0000"/>
-          <w:lang w:val="en-GB"/>
-        </w:rPr>
-        <w:t>4</w:t>
+        <w:t>54</w:t>
       </w:r>
     </w:p>
     <w:p>
@@ -26390,7 +26569,6 @@
         </w:rPr>
       </w:pPr>
       <w:r>
-        <w:lastRenderedPageBreak/>
         <w:t xml:space="preserve">Script-Migration -From </w:t>
       </w:r>
       <w:proofErr w:type="spellStart"/>
@@ -26399,10 +26577,7 @@
       </w:r>
       <w:proofErr w:type="spellEnd"/>
       <w:r>
-        <w:t xml:space="preserve"> </w:t>
-      </w:r>
-      <w:r>
-        <w:t xml:space="preserve">-To </w:t>
+        <w:t xml:space="preserve"> -To </w:t>
       </w:r>
       <w:proofErr w:type="spellStart"/>
       <w:r>
@@ -26483,7 +26658,7 @@
         <w:spacing w:after="0"/>
         <w:ind w:left="720"/>
         <w:rPr>
-          <w:color w:val="00B050"/>
+          <w:color w:val="EE0000"/>
         </w:rPr>
       </w:pPr>
       <w:r>
@@ -26503,15 +26678,269 @@
       </w:r>
       <w:r>
         <w:rPr>
-          <w:color w:val="00B050"/>
+          <w:color w:val="EE0000"/>
         </w:rPr>
         <w:t>Pending</w:t>
       </w:r>
     </w:p>
     <w:p>
       <w:pPr>
+        <w:spacing w:after="0"/>
         <w:ind w:left="720"/>
         <w:rPr>
+          <w:color w:val="EE0000"/>
+        </w:rPr>
+      </w:pPr>
+    </w:p>
+    <w:p>
+      <w:pPr>
+        <w:pStyle w:val="ListParagraph"/>
+        <w:numPr>
+          <w:ilvl w:val="0"/>
+          <w:numId w:val="3"/>
+        </w:numPr>
+        <w:spacing w:after="0"/>
+        <w:rPr>
+          <w:b/>
+          <w:bCs/>
+          <w:color w:val="EE0000"/>
+          <w:lang w:val="en-GB"/>
+        </w:rPr>
+      </w:pPr>
+      <w:r>
+        <w:rPr>
+          <w:b/>
+          <w:bCs/>
+          <w:color w:val="EE0000"/>
+          <w:lang w:val="en-GB"/>
+        </w:rPr>
+        <w:t>Migration script #</w:t>
+      </w:r>
+      <w:r>
+        <w:rPr>
+          <w:b/>
+          <w:bCs/>
+          <w:color w:val="EE0000"/>
+          <w:lang w:val="en-GB"/>
+        </w:rPr>
+        <w:t>5</w:t>
+      </w:r>
+      <w:r>
+        <w:rPr>
+          <w:b/>
+          <w:bCs/>
+          <w:color w:val="EE0000"/>
+          <w:lang w:val="en-GB"/>
+        </w:rPr>
+        <w:t>5</w:t>
+      </w:r>
+    </w:p>
+    <w:p>
+      <w:pPr>
+        <w:spacing w:after="0"/>
+        <w:ind w:left="720"/>
+        <w:rPr>
+          <w:lang w:val="en-GB"/>
+        </w:rPr>
+      </w:pPr>
+      <w:r>
+        <w:rPr>
+          <w:b/>
+          <w:bCs/>
+          <w:lang w:val="en-GB"/>
+        </w:rPr>
+        <w:t>Description:</w:t>
+      </w:r>
+      <w:r>
+        <w:rPr>
+          <w:lang w:val="en-GB"/>
+        </w:rPr>
+        <w:t xml:space="preserve"> Create SQL migration script from “</w:t>
+      </w:r>
+      <w:proofErr w:type="spellStart"/>
+      <w:r>
+        <w:t>CreateEntityOTRequestWF</w:t>
+      </w:r>
+      <w:proofErr w:type="spellEnd"/>
+      <w:r>
+        <w:rPr>
+          <w:lang w:val="en-GB"/>
+        </w:rPr>
+        <w:t xml:space="preserve">” </w:t>
+      </w:r>
+      <w:proofErr w:type="gramStart"/>
+      <w:r>
+        <w:rPr>
+          <w:lang w:val="en-GB"/>
+        </w:rPr>
+        <w:t>to  “</w:t>
+      </w:r>
+      <w:proofErr w:type="spellStart"/>
+      <w:proofErr w:type="gramEnd"/>
+      <w:r>
+        <w:t>CreateEntityOutdoorRequestWF</w:t>
+      </w:r>
+      <w:proofErr w:type="spellEnd"/>
+      <w:r>
+        <w:rPr>
+          <w:lang w:val="en-GB"/>
+        </w:rPr>
+        <w:t>”</w:t>
+      </w:r>
+    </w:p>
+    <w:p>
+      <w:pPr>
+        <w:spacing w:after="0"/>
+        <w:ind w:left="720"/>
+        <w:rPr>
+          <w:b/>
+          <w:bCs/>
+        </w:rPr>
+      </w:pPr>
+      <w:r>
+        <w:rPr>
+          <w:b/>
+          <w:bCs/>
+        </w:rPr>
+        <w:t>PMC script:</w:t>
+      </w:r>
+    </w:p>
+    <w:p>
+      <w:pPr>
+        <w:spacing w:after="0"/>
+        <w:ind w:left="720"/>
+        <w:rPr>
+          <w:lang w:val="en-GB"/>
+        </w:rPr>
+      </w:pPr>
+      <w:r>
+        <w:t xml:space="preserve">Script-Migration -From </w:t>
+      </w:r>
+      <w:proofErr w:type="spellStart"/>
+      <w:r>
+        <w:t>CreateEntityOTRequestWF</w:t>
+      </w:r>
+      <w:proofErr w:type="spellEnd"/>
+      <w:r>
+        <w:t xml:space="preserve"> -To </w:t>
+      </w:r>
+      <w:proofErr w:type="spellStart"/>
+      <w:r>
+        <w:t>CreateEntityOutdoorRequestWF</w:t>
+      </w:r>
+      <w:proofErr w:type="spellEnd"/>
+      <w:r>
+        <w:rPr>
+          <w:lang w:val="en-GB"/>
+        </w:rPr>
+        <w:t xml:space="preserve"> </w:t>
+      </w:r>
+      <w:r>
+        <w:rPr>
+          <w:lang w:val="en-GB"/>
+        </w:rPr>
+        <w:t xml:space="preserve">-Context </w:t>
+      </w:r>
+      <w:proofErr w:type="spellStart"/>
+      <w:r>
+        <w:rPr>
+          <w:lang w:val="en-GB"/>
+        </w:rPr>
+        <w:t>AppDbContext</w:t>
+      </w:r>
+      <w:proofErr w:type="spellEnd"/>
+      <w:r>
+        <w:t xml:space="preserve"> -Output </w:t>
+      </w:r>
+      <w:r>
+        <w:rPr>
+          <w:lang w:val="en-GB"/>
+        </w:rPr>
+        <w:t>".\</w:t>
+      </w:r>
+      <w:proofErr w:type="spellStart"/>
+      <w:r>
+        <w:rPr>
+          <w:lang w:val="en-GB"/>
+        </w:rPr>
+        <w:t>MigrationScripts</w:t>
+      </w:r>
+      <w:proofErr w:type="spellEnd"/>
+      <w:r>
+        <w:rPr>
+          <w:lang w:val="en-GB"/>
+        </w:rPr>
+        <w:t>\</w:t>
+      </w:r>
+      <w:proofErr w:type="spellStart"/>
+      <w:r>
+        <w:t>CreateEntityOutdoorRequestWF</w:t>
+      </w:r>
+      <w:proofErr w:type="spellEnd"/>
+      <w:r>
+        <w:rPr>
+          <w:lang w:val="en-GB"/>
+        </w:rPr>
+        <w:t>.</w:t>
+      </w:r>
+      <w:proofErr w:type="spellStart"/>
+      <w:r>
+        <w:rPr>
+          <w:lang w:val="en-GB"/>
+        </w:rPr>
+        <w:t>sql</w:t>
+      </w:r>
+      <w:proofErr w:type="spellEnd"/>
+      <w:r>
+        <w:rPr>
+          <w:lang w:val="en-GB"/>
+        </w:rPr>
+        <w:t>"</w:t>
+      </w:r>
+    </w:p>
+    <w:p>
+      <w:pPr>
+        <w:spacing w:after="0"/>
+        <w:ind w:left="720"/>
+        <w:rPr>
+          <w:color w:val="00B050"/>
+        </w:rPr>
+      </w:pPr>
+      <w:r>
+        <w:rPr>
+          <w:lang w:val="en-GB"/>
+        </w:rPr>
+        <w:t>Status:</w:t>
+      </w:r>
+      <w:r>
+        <w:rPr>
+          <w:b/>
+          <w:bCs/>
+          <w:color w:val="00B050"/>
+          <w:lang w:val="en-GB"/>
+        </w:rPr>
+        <w:t xml:space="preserve"> </w:t>
+      </w:r>
+      <w:r>
+        <w:rPr>
+          <w:color w:val="EE0000"/>
+        </w:rPr>
+        <w:t>Pending</w:t>
+      </w:r>
+    </w:p>
+    <w:p>
+      <w:pPr>
+        <w:spacing w:after="0"/>
+        <w:ind w:left="720"/>
+        <w:rPr>
+          <w:color w:val="00B050"/>
+        </w:rPr>
+      </w:pPr>
+    </w:p>
+    <w:p>
+      <w:pPr>
+        <w:ind w:left="720"/>
+        <w:rPr>
           <w:b/>
           <w:bCs/>
           <w:color w:val="00B050"/>
@@ -26623,7 +27052,14 @@
         <w:rPr>
           <w:lang w:val="en-GB"/>
         </w:rPr>
-        <w:t>. Now, I realized that there are entity properties that I need to correct. So, I need to delete this migration. Note that this migration was not yet implemented in the database since I haven’t executed the command, Update-Database. Tell me how to remove this migration in my Blazor project without affecting the database.</w:t>
+        <w:t xml:space="preserve">. Now, I realized that there are entity properties that I need to correct. So, I need to delete this migration. Note that this </w:t>
+      </w:r>
+      <w:r>
+        <w:rPr>
+          <w:lang w:val="en-GB"/>
+        </w:rPr>
+        <w:lastRenderedPageBreak/>
+        <w:t>migration was not yet implemented in the database since I haven’t executed the command, Update-Database. Tell me how to remove this migration in my Blazor project without affecting the database.</w:t>
       </w:r>
     </w:p>
     <w:p/>
@@ -28062,7 +28498,7 @@
   <w:style w:type="paragraph" w:default="1" w:styleId="Normal">
     <w:name w:val="Normal"/>
     <w:qFormat/>
-    <w:rsid w:val="0073075C"/>
+    <w:rsid w:val="006E1484"/>
   </w:style>
   <w:style w:type="paragraph" w:styleId="Heading1">
     <w:name w:val="heading 1"/>

</xml_diff>

<commit_message>
Implemented CRUD operations for Outdoor request in the AttendanceRepository class.
</commit_message>
<xml_diff>
--- a/MigrationScripts/EF Core Migration History.docx
+++ b/MigrationScripts/EF Core Migration History.docx
@@ -12740,15 +12740,7 @@
           <w:bCs/>
           <w:color w:val="EE0000"/>
         </w:rPr>
-        <w:t>6</w:t>
-      </w:r>
-      <w:r>
-        <w:rPr>
-          <w:b/>
-          <w:bCs/>
-          <w:color w:val="EE0000"/>
-        </w:rPr>
-        <w:t>1</w:t>
+        <w:t>61</w:t>
       </w:r>
     </w:p>
     <w:p>
@@ -12877,9 +12869,27 @@
       </w:r>
       <w:r>
         <w:rPr>
-          <w:color w:val="EE0000"/>
-        </w:rPr>
-        <w:t>Pending</w:t>
+          <w:color w:val="00B050"/>
+        </w:rPr>
+        <w:t>Completed</w:t>
+      </w:r>
+      <w:r>
+        <w:rPr>
+          <w:color w:val="00B050"/>
+        </w:rPr>
+        <w:t xml:space="preserve"> on </w:t>
+      </w:r>
+      <w:r>
+        <w:rPr>
+          <w:color w:val="00B050"/>
+        </w:rPr>
+        <w:t>29</w:t>
+      </w:r>
+      <w:r>
+        <w:rPr>
+          <w:color w:val="00B050"/>
+        </w:rPr>
+        <w:t>-Jun-2026</w:t>
       </w:r>
     </w:p>
     <w:p>
@@ -26723,16 +26733,7 @@
           <w:color w:val="EE0000"/>
           <w:lang w:val="en-GB"/>
         </w:rPr>
-        <w:t>5</w:t>
-      </w:r>
-      <w:r>
-        <w:rPr>
-          <w:b/>
-          <w:bCs/>
-          <w:color w:val="EE0000"/>
-          <w:lang w:val="en-GB"/>
-        </w:rPr>
-        <w:t>5</w:t>
+        <w:t>55</w:t>
       </w:r>
     </w:p>
     <w:p>
@@ -28701,6 +28702,7 @@
   <w:style w:type="character" w:default="1" w:styleId="DefaultParagraphFont">
     <w:name w:val="Default Paragraph Font"/>
     <w:uiPriority w:val="1"/>
+    <w:semiHidden/>
     <w:unhideWhenUsed/>
   </w:style>
   <w:style w:type="table" w:default="1" w:styleId="TableNormal">

</xml_diff>

<commit_message>
Completed data migration into the staging database
</commit_message>
<xml_diff>
--- a/MigrationScripts/EF Core Migration History.docx
+++ b/MigrationScripts/EF Core Migration History.docx
@@ -3864,13 +3864,13 @@
       <w:r>
         <w:t>EmployeeCertification</w:t>
       </w:r>
-      <w:proofErr w:type="spellEnd"/>
       <w:r>
         <w:rPr>
           <w:lang w:val="en-GB"/>
         </w:rPr>
         <w:t>StateCity</w:t>
       </w:r>
+      <w:proofErr w:type="spellEnd"/>
       <w:r>
         <w:t xml:space="preserve"> -Context </w:t>
       </w:r>
@@ -9648,10 +9648,10 @@
         </w:rPr>
         <w:t>AddFields</w:t>
       </w:r>
+      <w:proofErr w:type="spellEnd"/>
       <w:r>
         <w:t>LeaveRequisitionWF</w:t>
       </w:r>
-      <w:proofErr w:type="spellEnd"/>
       <w:r>
         <w:t xml:space="preserve"> -Context </w:t>
       </w:r>
@@ -12877,19 +12877,7 @@
         <w:rPr>
           <w:color w:val="00B050"/>
         </w:rPr>
-        <w:t xml:space="preserve"> on </w:t>
-      </w:r>
-      <w:r>
-        <w:rPr>
-          <w:color w:val="00B050"/>
-        </w:rPr>
-        <w:t>29</w:t>
-      </w:r>
-      <w:r>
-        <w:rPr>
-          <w:color w:val="00B050"/>
-        </w:rPr>
-        <w:t>-Jun-2026</w:t>
+        <w:t xml:space="preserve"> on 29-Jun-2026</w:t>
       </w:r>
     </w:p>
     <w:p>
@@ -26688,9 +26676,15 @@
       </w:r>
       <w:r>
         <w:rPr>
-          <w:color w:val="EE0000"/>
-        </w:rPr>
-        <w:t>Pending</w:t>
+          <w:color w:val="00B050"/>
+        </w:rPr>
+        <w:t>Completed</w:t>
+      </w:r>
+      <w:r>
+        <w:rPr>
+          <w:color w:val="00B050"/>
+        </w:rPr>
+        <w:t xml:space="preserve"> on 06-Jun-2026</w:t>
       </w:r>
     </w:p>
     <w:p>
@@ -26924,9 +26918,27 @@
       </w:r>
       <w:r>
         <w:rPr>
-          <w:color w:val="EE0000"/>
-        </w:rPr>
-        <w:t>Pending</w:t>
+          <w:color w:val="00B050"/>
+        </w:rPr>
+        <w:t>Completed</w:t>
+      </w:r>
+      <w:r>
+        <w:rPr>
+          <w:color w:val="00B050"/>
+        </w:rPr>
+        <w:t xml:space="preserve"> on </w:t>
+      </w:r>
+      <w:r>
+        <w:rPr>
+          <w:color w:val="00B050"/>
+        </w:rPr>
+        <w:t>30</w:t>
+      </w:r>
+      <w:r>
+        <w:rPr>
+          <w:color w:val="00B050"/>
+        </w:rPr>
+        <w:t>-Jun-2026</w:t>
       </w:r>
     </w:p>
     <w:p>

</xml_diff>

<commit_message>
Implemented CRUD operations in the data repository class for leave planner request. Completed data migration.
</commit_message>
<xml_diff>
--- a/MigrationScripts/EF Core Migration History.docx
+++ b/MigrationScripts/EF Core Migration History.docx
@@ -73,7 +73,6 @@
         <w:t xml:space="preserve">Install-Package </w:t>
       </w:r>
       <w:proofErr w:type="spellStart"/>
-      <w:proofErr w:type="gramStart"/>
       <w:r>
         <w:rPr>
           <w:b/>
@@ -83,7 +82,6 @@
         <w:t>Microsoft.EntityFrameworkCore.Tools</w:t>
       </w:r>
       <w:proofErr w:type="spellEnd"/>
-      <w:proofErr w:type="gramEnd"/>
     </w:p>
     <w:p>
       <w:pPr>
@@ -125,7 +123,6 @@
         <w:t xml:space="preserve">Update-Package </w:t>
       </w:r>
       <w:proofErr w:type="spellStart"/>
-      <w:proofErr w:type="gramStart"/>
       <w:r>
         <w:rPr>
           <w:b/>
@@ -135,7 +132,6 @@
         <w:t>Microsoft.EntityFrameworkCore.Tools</w:t>
       </w:r>
       <w:proofErr w:type="spellEnd"/>
-      <w:proofErr w:type="gramEnd"/>
     </w:p>
     <w:p>
       <w:pPr>
@@ -751,15 +747,7 @@
           </w:tcPr>
           <w:p>
             <w:r>
-              <w:t xml:space="preserve">The directory </w:t>
-            </w:r>
-            <w:proofErr w:type="gramStart"/>
-            <w:r>
-              <w:t>use</w:t>
-            </w:r>
-            <w:proofErr w:type="gramEnd"/>
-            <w:r>
-              <w:t xml:space="preserve"> to output the files. Paths are relative to the target project directory. Defaults to "Migrations".</w:t>
+              <w:t>The directory use to output the files. Paths are relative to the target project directory. Defaults to "Migrations".</w:t>
             </w:r>
           </w:p>
         </w:tc>
@@ -1333,13 +1321,8 @@
       <w:pPr>
         <w:ind w:left="360"/>
       </w:pPr>
-      <w:proofErr w:type="gramStart"/>
-      <w:r>
-        <w:t>  The</w:t>
-      </w:r>
-      <w:proofErr w:type="gramEnd"/>
-      <w:r>
-        <w:t xml:space="preserve"> -</w:t>
+      <w:r>
+        <w:t>  The -</w:t>
       </w:r>
       <w:proofErr w:type="spellStart"/>
       <w:r>
@@ -1364,13 +1347,8 @@
       <w:pPr>
         <w:ind w:left="360"/>
       </w:pPr>
-      <w:proofErr w:type="gramStart"/>
-      <w:r>
-        <w:t>  If</w:t>
-      </w:r>
-      <w:proofErr w:type="gramEnd"/>
-      <w:r>
-        <w:t xml:space="preserve"> there are changes in your </w:t>
+      <w:r>
+        <w:t xml:space="preserve">  If there are changes in your </w:t>
       </w:r>
       <w:r>
         <w:rPr>
@@ -1397,13 +1375,8 @@
       <w:pPr>
         <w:ind w:left="360"/>
       </w:pPr>
-      <w:proofErr w:type="gramStart"/>
-      <w:r>
-        <w:t>  If</w:t>
-      </w:r>
-      <w:proofErr w:type="gramEnd"/>
-      <w:r>
-        <w:t xml:space="preserve"> there are </w:t>
+      <w:r>
+        <w:t xml:space="preserve">  If there are </w:t>
       </w:r>
       <w:r>
         <w:rPr>
@@ -1629,11 +1602,7 @@
         <w:ind w:left="1080"/>
       </w:pPr>
       <w:r>
-        <w:t>Add-</w:t>
-      </w:r>
-      <w:proofErr w:type="gramStart"/>
-      <w:r>
-        <w:t xml:space="preserve">Migration </w:t>
+        <w:t xml:space="preserve">Add-Migration </w:t>
       </w:r>
       <w:r>
         <w:t xml:space="preserve"> </w:t>
@@ -1649,7 +1618,6 @@
         <w:t>ToMaritalStatusCode</w:t>
       </w:r>
       <w:proofErr w:type="spellEnd"/>
-      <w:proofErr w:type="gramEnd"/>
       <w:r>
         <w:t xml:space="preserve"> -Context </w:t>
       </w:r>
@@ -1754,11 +1722,7 @@
         <w:ind w:left="1080"/>
       </w:pPr>
       <w:r>
-        <w:t>Add-</w:t>
-      </w:r>
-      <w:proofErr w:type="gramStart"/>
-      <w:r>
-        <w:t xml:space="preserve">Migration </w:t>
+        <w:t xml:space="preserve">Add-Migration </w:t>
       </w:r>
       <w:r>
         <w:t xml:space="preserve"> </w:t>
@@ -1768,7 +1732,6 @@
         <w:t>RefactorEmployeeEntitySchema</w:t>
       </w:r>
       <w:proofErr w:type="spellEnd"/>
-      <w:proofErr w:type="gramEnd"/>
       <w:r>
         <w:t xml:space="preserve"> -Context </w:t>
       </w:r>
@@ -12860,6 +12823,9 @@
       <w:pPr>
         <w:spacing w:after="0"/>
         <w:ind w:left="1080"/>
+        <w:rPr>
+          <w:color w:val="00B050"/>
+        </w:rPr>
       </w:pPr>
       <w:r>
         <w:t>Development Database:</w:t>
@@ -12884,6 +12850,221 @@
       <w:pPr>
         <w:spacing w:after="0"/>
         <w:ind w:left="1080"/>
+        <w:rPr>
+          <w:color w:val="00B050"/>
+        </w:rPr>
+      </w:pPr>
+    </w:p>
+    <w:p>
+      <w:pPr>
+        <w:pStyle w:val="ListParagraph"/>
+        <w:numPr>
+          <w:ilvl w:val="0"/>
+          <w:numId w:val="6"/>
+        </w:numPr>
+        <w:spacing w:after="0"/>
+        <w:rPr>
+          <w:b/>
+          <w:bCs/>
+          <w:color w:val="EE0000"/>
+        </w:rPr>
+      </w:pPr>
+      <w:r>
+        <w:rPr>
+          <w:b/>
+          <w:bCs/>
+          <w:color w:val="EE0000"/>
+        </w:rPr>
+        <w:t>Data Migration PMC Command #</w:t>
+      </w:r>
+      <w:r>
+        <w:rPr>
+          <w:b/>
+          <w:bCs/>
+          <w:color w:val="EE0000"/>
+        </w:rPr>
+        <w:t>6</w:t>
+      </w:r>
+      <w:r>
+        <w:rPr>
+          <w:b/>
+          <w:bCs/>
+          <w:color w:val="EE0000"/>
+        </w:rPr>
+        <w:t>2</w:t>
+      </w:r>
+    </w:p>
+    <w:p>
+      <w:pPr>
+        <w:spacing w:after="0"/>
+        <w:ind w:left="1080"/>
+      </w:pPr>
+      <w:r>
+        <w:t>Add-Migration</w:t>
+      </w:r>
+      <w:r>
+        <w:t xml:space="preserve"> </w:t>
+      </w:r>
+      <w:proofErr w:type="spellStart"/>
+      <w:r>
+        <w:rPr>
+          <w:lang w:val="en-GB"/>
+        </w:rPr>
+        <w:t>CreateEntity</w:t>
+      </w:r>
+      <w:r>
+        <w:t>PlannedLeaveRequest</w:t>
+      </w:r>
+      <w:proofErr w:type="spellEnd"/>
+      <w:r>
+        <w:rPr>
+          <w:lang w:val="en-GB"/>
+        </w:rPr>
+        <w:t xml:space="preserve"> </w:t>
+      </w:r>
+      <w:r>
+        <w:t xml:space="preserve">-Context </w:t>
+      </w:r>
+      <w:proofErr w:type="spellStart"/>
+      <w:r>
+        <w:t>AppDbContext</w:t>
+      </w:r>
+      <w:proofErr w:type="spellEnd"/>
+      <w:r>
+        <w:t xml:space="preserve"> </w:t>
+      </w:r>
+      <w:r>
+        <w:t xml:space="preserve">-Project </w:t>
+      </w:r>
+      <w:proofErr w:type="spellStart"/>
+      <w:r>
+        <w:t>KenHRApp.Infrastructure</w:t>
+      </w:r>
+      <w:proofErr w:type="spellEnd"/>
+      <w:r>
+        <w:t xml:space="preserve"> -</w:t>
+      </w:r>
+      <w:proofErr w:type="spellStart"/>
+      <w:r>
+        <w:t>StartupProject</w:t>
+      </w:r>
+      <w:proofErr w:type="spellEnd"/>
+      <w:r>
+        <w:t xml:space="preserve"> </w:t>
+      </w:r>
+      <w:proofErr w:type="spellStart"/>
+      <w:r>
+        <w:t>KenHRApp.Web</w:t>
+      </w:r>
+      <w:proofErr w:type="spellEnd"/>
+      <w:r>
+        <w:t xml:space="preserve"> -Verbose</w:t>
+      </w:r>
+    </w:p>
+    <w:p>
+      <w:pPr>
+        <w:spacing w:after="0"/>
+        <w:ind w:left="1080"/>
+      </w:pPr>
+    </w:p>
+    <w:p>
+      <w:pPr>
+        <w:spacing w:after="0"/>
+        <w:ind w:left="1080"/>
+      </w:pPr>
+      <w:r>
+        <w:t xml:space="preserve">Update-Database </w:t>
+      </w:r>
+      <w:r>
+        <w:t xml:space="preserve">-Context </w:t>
+      </w:r>
+      <w:proofErr w:type="spellStart"/>
+      <w:r>
+        <w:t>AppDbContext</w:t>
+      </w:r>
+      <w:proofErr w:type="spellEnd"/>
+    </w:p>
+    <w:p>
+      <w:pPr>
+        <w:spacing w:after="0"/>
+        <w:ind w:left="1080"/>
+        <w:rPr>
+          <w:u w:val="single"/>
+        </w:rPr>
+      </w:pPr>
+      <w:r>
+        <w:rPr>
+          <w:b/>
+          <w:bCs/>
+          <w:u w:val="single"/>
+        </w:rPr>
+        <w:t>Status:</w:t>
+      </w:r>
+      <w:r>
+        <w:rPr>
+          <w:u w:val="single"/>
+        </w:rPr>
+        <w:t xml:space="preserve"> </w:t>
+      </w:r>
+    </w:p>
+    <w:p>
+      <w:pPr>
+        <w:spacing w:after="0"/>
+        <w:ind w:left="1080"/>
+      </w:pPr>
+      <w:r>
+        <w:t>Development Database:</w:t>
+      </w:r>
+      <w:r>
+        <w:t xml:space="preserve"> </w:t>
+      </w:r>
+      <w:r>
+        <w:rPr>
+          <w:color w:val="00B050"/>
+        </w:rPr>
+        <w:t>Completed</w:t>
+      </w:r>
+      <w:r>
+        <w:rPr>
+          <w:color w:val="00B050"/>
+        </w:rPr>
+        <w:t xml:space="preserve"> on </w:t>
+      </w:r>
+      <w:r>
+        <w:rPr>
+          <w:color w:val="00B050"/>
+        </w:rPr>
+        <w:t>04</w:t>
+      </w:r>
+      <w:r>
+        <w:rPr>
+          <w:color w:val="00B050"/>
+        </w:rPr>
+        <w:t>-Ju</w:t>
+      </w:r>
+      <w:r>
+        <w:rPr>
+          <w:color w:val="00B050"/>
+        </w:rPr>
+        <w:t>l</w:t>
+      </w:r>
+      <w:r>
+        <w:rPr>
+          <w:color w:val="00B050"/>
+        </w:rPr>
+        <w:t>-2026</w:t>
+      </w:r>
+    </w:p>
+    <w:p>
+      <w:pPr>
+        <w:spacing w:after="0"/>
+        <w:ind w:left="1080"/>
+      </w:pPr>
+    </w:p>
+    <w:p>
+      <w:pPr>
+        <w:spacing w:after="0"/>
+        <w:ind w:left="1080"/>
       </w:pPr>
     </w:p>
     <w:p>
@@ -13102,6 +13283,7 @@
         <w:rPr>
           <w:lang w:val="en-GB"/>
         </w:rPr>
+        <w:lastRenderedPageBreak/>
         <w:t>This generates a script that checks if the migration has already been applied before running it (safe for multiple DBs).</w:t>
       </w:r>
     </w:p>
@@ -13162,7 +13344,6 @@
           <w:bCs/>
           <w:color w:val="EE0000"/>
         </w:rPr>
-        <w:lastRenderedPageBreak/>
         <w:t>To generate SQL migration script</w:t>
       </w:r>
       <w:r>
@@ -13795,6 +13976,7 @@
           <w:color w:val="00B050"/>
           <w:lang w:val="en-GB"/>
         </w:rPr>
+        <w:lastRenderedPageBreak/>
         <w:t xml:space="preserve">Status: </w:t>
       </w:r>
       <w:r>
@@ -13873,17 +14055,9 @@
         <w:rPr>
           <w:lang w:val="en-GB"/>
         </w:rPr>
-        <w:t xml:space="preserve">” </w:t>
-      </w:r>
-      <w:proofErr w:type="gramStart"/>
-      <w:r>
-        <w:rPr>
-          <w:lang w:val="en-GB"/>
-        </w:rPr>
-        <w:t>to  “</w:t>
-      </w:r>
-      <w:proofErr w:type="spellStart"/>
-      <w:proofErr w:type="gramEnd"/>
+        <w:t>” to  “</w:t>
+      </w:r>
+      <w:proofErr w:type="spellStart"/>
       <w:r>
         <w:t>UpdateFieldsEmployeeModel</w:t>
       </w:r>
@@ -13919,7 +14093,6 @@
         </w:rPr>
       </w:pPr>
       <w:r>
-        <w:lastRenderedPageBreak/>
         <w:t xml:space="preserve">Script-Migration -From </w:t>
       </w:r>
       <w:proofErr w:type="spellStart"/>
@@ -14096,17 +14269,9 @@
         <w:rPr>
           <w:lang w:val="en-GB"/>
         </w:rPr>
-        <w:t xml:space="preserve">” </w:t>
-      </w:r>
-      <w:proofErr w:type="gramStart"/>
-      <w:r>
-        <w:rPr>
-          <w:lang w:val="en-GB"/>
-        </w:rPr>
-        <w:t>to  “</w:t>
-      </w:r>
-      <w:proofErr w:type="spellStart"/>
-      <w:proofErr w:type="gramEnd"/>
+        <w:t>” to  “</w:t>
+      </w:r>
+      <w:proofErr w:type="spellStart"/>
       <w:r>
         <w:t>UpdatePresentPermanentCountry</w:t>
       </w:r>
@@ -14328,16 +14493,8 @@
         <w:rPr>
           <w:lang w:val="en-GB"/>
         </w:rPr>
-        <w:t xml:space="preserve">” </w:t>
-      </w:r>
-      <w:proofErr w:type="gramStart"/>
-      <w:r>
-        <w:rPr>
-          <w:lang w:val="en-GB"/>
-        </w:rPr>
-        <w:t>to  “</w:t>
-      </w:r>
-      <w:proofErr w:type="gramEnd"/>
+        <w:t>” to  “</w:t>
+      </w:r>
       <w:r>
         <w:t>Update</w:t>
       </w:r>
@@ -14572,6 +14729,7 @@
           <w:bCs/>
           <w:lang w:val="en-GB"/>
         </w:rPr>
+        <w:lastRenderedPageBreak/>
         <w:t>Description:</w:t>
       </w:r>
       <w:r>
@@ -14601,17 +14759,9 @@
         <w:rPr>
           <w:lang w:val="en-GB"/>
         </w:rPr>
-        <w:t xml:space="preserve">” </w:t>
-      </w:r>
-      <w:proofErr w:type="gramStart"/>
-      <w:r>
-        <w:rPr>
-          <w:lang w:val="en-GB"/>
-        </w:rPr>
-        <w:t>to  “</w:t>
-      </w:r>
-      <w:proofErr w:type="spellStart"/>
-      <w:proofErr w:type="gramEnd"/>
+        <w:t>” to  “</w:t>
+      </w:r>
+      <w:proofErr w:type="spellStart"/>
       <w:r>
         <w:rPr>
           <w:lang w:val="en-GB"/>
@@ -14841,17 +14991,9 @@
         <w:rPr>
           <w:lang w:val="en-GB"/>
         </w:rPr>
-        <w:t xml:space="preserve">” </w:t>
-      </w:r>
-      <w:proofErr w:type="gramStart"/>
-      <w:r>
-        <w:rPr>
-          <w:lang w:val="en-GB"/>
-        </w:rPr>
-        <w:t>to  “</w:t>
-      </w:r>
-      <w:proofErr w:type="spellStart"/>
-      <w:proofErr w:type="gramEnd"/>
+        <w:t>” to  “</w:t>
+      </w:r>
+      <w:proofErr w:type="spellStart"/>
       <w:r>
         <w:t>UpdateQualificationEntity</w:t>
       </w:r>
@@ -15077,17 +15219,9 @@
         <w:rPr>
           <w:lang w:val="en-GB"/>
         </w:rPr>
-        <w:t xml:space="preserve">” </w:t>
-      </w:r>
-      <w:proofErr w:type="gramStart"/>
-      <w:r>
-        <w:rPr>
-          <w:lang w:val="en-GB"/>
-        </w:rPr>
-        <w:t>to  “</w:t>
-      </w:r>
-      <w:proofErr w:type="spellStart"/>
-      <w:proofErr w:type="gramEnd"/>
+        <w:t>” to  “</w:t>
+      </w:r>
+      <w:proofErr w:type="spellStart"/>
       <w:r>
         <w:t>UpdateEmployeeSkillEntity</w:t>
       </w:r>
@@ -15310,17 +15444,9 @@
         <w:rPr>
           <w:lang w:val="en-GB"/>
         </w:rPr>
-        <w:t xml:space="preserve">” </w:t>
-      </w:r>
-      <w:proofErr w:type="gramStart"/>
-      <w:r>
-        <w:rPr>
-          <w:lang w:val="en-GB"/>
-        </w:rPr>
-        <w:t>to  “</w:t>
-      </w:r>
-      <w:proofErr w:type="spellStart"/>
-      <w:proofErr w:type="gramEnd"/>
+        <w:t>” to  “</w:t>
+      </w:r>
+      <w:proofErr w:type="spellStart"/>
       <w:r>
         <w:t>UpdateLanguageSkillEntity</w:t>
       </w:r>
@@ -15356,6 +15482,7 @@
         </w:rPr>
       </w:pPr>
       <w:r>
+        <w:lastRenderedPageBreak/>
         <w:t xml:space="preserve">Script-Migration -From </w:t>
       </w:r>
       <w:proofErr w:type="spellStart"/>
@@ -15543,17 +15670,9 @@
         <w:rPr>
           <w:lang w:val="en-GB"/>
         </w:rPr>
-        <w:t xml:space="preserve">” </w:t>
-      </w:r>
-      <w:proofErr w:type="gramStart"/>
-      <w:r>
-        <w:rPr>
-          <w:lang w:val="en-GB"/>
-        </w:rPr>
-        <w:t>to  “</w:t>
-      </w:r>
-      <w:proofErr w:type="spellStart"/>
-      <w:proofErr w:type="gramEnd"/>
+        <w:t>” to  “</w:t>
+      </w:r>
+      <w:proofErr w:type="spellStart"/>
       <w:r>
         <w:t>UpdateEmployeeCertification</w:t>
       </w:r>
@@ -15578,7 +15697,6 @@
           <w:b/>
           <w:bCs/>
         </w:rPr>
-        <w:lastRenderedPageBreak/>
         <w:t>PMC script:</w:t>
       </w:r>
     </w:p>
@@ -15766,17 +15884,9 @@
         <w:rPr>
           <w:lang w:val="en-GB"/>
         </w:rPr>
-        <w:t xml:space="preserve">” </w:t>
-      </w:r>
-      <w:proofErr w:type="gramStart"/>
-      <w:r>
-        <w:rPr>
-          <w:lang w:val="en-GB"/>
-        </w:rPr>
-        <w:t>to  “</w:t>
-      </w:r>
-      <w:proofErr w:type="spellStart"/>
-      <w:proofErr w:type="gramEnd"/>
+        <w:t>” to  “</w:t>
+      </w:r>
+      <w:proofErr w:type="spellStart"/>
       <w:r>
         <w:t>ChangeEmployeeCertificationStateCity</w:t>
       </w:r>
@@ -15988,17 +16098,9 @@
         <w:rPr>
           <w:lang w:val="en-GB"/>
         </w:rPr>
-        <w:t xml:space="preserve">” </w:t>
-      </w:r>
-      <w:proofErr w:type="gramStart"/>
-      <w:r>
-        <w:rPr>
-          <w:lang w:val="en-GB"/>
-        </w:rPr>
-        <w:t>to  “</w:t>
-      </w:r>
-      <w:proofErr w:type="spellStart"/>
-      <w:proofErr w:type="gramEnd"/>
+        <w:t>” to  “</w:t>
+      </w:r>
+      <w:proofErr w:type="spellStart"/>
       <w:r>
         <w:t>UpdateFamilyVisa</w:t>
       </w:r>
@@ -16210,17 +16312,9 @@
         <w:rPr>
           <w:lang w:val="en-GB"/>
         </w:rPr>
-        <w:t xml:space="preserve">” </w:t>
-      </w:r>
-      <w:proofErr w:type="gramStart"/>
-      <w:r>
-        <w:rPr>
-          <w:lang w:val="en-GB"/>
-        </w:rPr>
-        <w:t>to  “</w:t>
-      </w:r>
-      <w:proofErr w:type="spellStart"/>
-      <w:proofErr w:type="gramEnd"/>
+        <w:t>” to  “</w:t>
+      </w:r>
+      <w:proofErr w:type="spellStart"/>
       <w:r>
         <w:rPr>
           <w:lang w:val="en-GB"/>
@@ -16248,6 +16342,7 @@
           <w:b/>
           <w:bCs/>
         </w:rPr>
+        <w:lastRenderedPageBreak/>
         <w:t>PMC script:</w:t>
       </w:r>
     </w:p>
@@ -16436,17 +16531,9 @@
         <w:rPr>
           <w:lang w:val="en-GB"/>
         </w:rPr>
-        <w:t xml:space="preserve">” </w:t>
-      </w:r>
-      <w:proofErr w:type="gramStart"/>
-      <w:r>
-        <w:rPr>
-          <w:lang w:val="en-GB"/>
-        </w:rPr>
-        <w:t>to  “</w:t>
-      </w:r>
-      <w:proofErr w:type="spellStart"/>
-      <w:proofErr w:type="gramEnd"/>
+        <w:t>” to  “</w:t>
+      </w:r>
+      <w:proofErr w:type="spellStart"/>
       <w:r>
         <w:rPr>
           <w:lang w:val="en-GB"/>
@@ -16480,7 +16567,6 @@
           <w:b/>
           <w:bCs/>
         </w:rPr>
-        <w:lastRenderedPageBreak/>
         <w:t>PMC script:</w:t>
       </w:r>
     </w:p>
@@ -16681,17 +16767,9 @@
         <w:rPr>
           <w:lang w:val="en-GB"/>
         </w:rPr>
-        <w:t xml:space="preserve">” </w:t>
-      </w:r>
-      <w:proofErr w:type="gramStart"/>
-      <w:r>
-        <w:rPr>
-          <w:lang w:val="en-GB"/>
-        </w:rPr>
-        <w:t>to  “</w:t>
-      </w:r>
-      <w:proofErr w:type="spellStart"/>
-      <w:proofErr w:type="gramEnd"/>
+        <w:t>” to  “</w:t>
+      </w:r>
+      <w:proofErr w:type="spellStart"/>
       <w:r>
         <w:rPr>
           <w:lang w:val="en-GB"/>
@@ -16912,17 +16990,9 @@
         <w:rPr>
           <w:lang w:val="en-GB"/>
         </w:rPr>
-        <w:t xml:space="preserve">” </w:t>
-      </w:r>
-      <w:proofErr w:type="gramStart"/>
-      <w:r>
-        <w:rPr>
-          <w:lang w:val="en-GB"/>
-        </w:rPr>
-        <w:t>to  “</w:t>
-      </w:r>
-      <w:proofErr w:type="spellStart"/>
-      <w:proofErr w:type="gramEnd"/>
+        <w:t>” to  “</w:t>
+      </w:r>
+      <w:proofErr w:type="spellStart"/>
       <w:r>
         <w:rPr>
           <w:lang w:val="en-GB"/>
@@ -17098,6 +17168,7 @@
           <w:color w:val="EE0000"/>
           <w:lang w:val="en-GB"/>
         </w:rPr>
+        <w:lastRenderedPageBreak/>
         <w:t>Migration script #</w:t>
       </w:r>
       <w:r>
@@ -17143,17 +17214,9 @@
         <w:rPr>
           <w:lang w:val="en-GB"/>
         </w:rPr>
-        <w:t xml:space="preserve">” </w:t>
-      </w:r>
-      <w:proofErr w:type="gramStart"/>
-      <w:r>
-        <w:rPr>
-          <w:lang w:val="en-GB"/>
-        </w:rPr>
-        <w:t>to  “</w:t>
-      </w:r>
-      <w:proofErr w:type="spellStart"/>
-      <w:proofErr w:type="gramEnd"/>
+        <w:t>” to  “</w:t>
+      </w:r>
+      <w:proofErr w:type="spellStart"/>
       <w:r>
         <w:t>RenameCompanyBranch</w:t>
       </w:r>
@@ -17326,7 +17389,6 @@
           <w:color w:val="EE0000"/>
           <w:lang w:val="en-GB"/>
         </w:rPr>
-        <w:lastRenderedPageBreak/>
         <w:t>Migration script #</w:t>
       </w:r>
       <w:r>
@@ -17369,17 +17431,9 @@
         <w:rPr>
           <w:lang w:val="en-GB"/>
         </w:rPr>
-        <w:t xml:space="preserve">” </w:t>
-      </w:r>
-      <w:proofErr w:type="gramStart"/>
-      <w:r>
-        <w:rPr>
-          <w:lang w:val="en-GB"/>
-        </w:rPr>
-        <w:t>to  “</w:t>
-      </w:r>
-      <w:proofErr w:type="spellStart"/>
-      <w:proofErr w:type="gramEnd"/>
+        <w:t>” to  “</w:t>
+      </w:r>
+      <w:proofErr w:type="spellStart"/>
       <w:r>
         <w:rPr>
           <w:lang w:val="en-GB"/>
@@ -17471,7 +17525,6 @@
       <w:r>
         <w:t xml:space="preserve"> -Output </w:t>
       </w:r>
-      <w:proofErr w:type="gramStart"/>
       <w:r>
         <w:rPr>
           <w:lang w:val="en-GB"/>
@@ -17492,7 +17545,6 @@
         </w:rPr>
         <w:t>\</w:t>
       </w:r>
-      <w:proofErr w:type="gramEnd"/>
       <w:r>
         <w:rPr>
           <w:lang w:val="en-GB"/>
@@ -17627,17 +17679,9 @@
         <w:rPr>
           <w:lang w:val="en-GB"/>
         </w:rPr>
-        <w:t xml:space="preserve">” </w:t>
-      </w:r>
-      <w:proofErr w:type="gramStart"/>
-      <w:r>
-        <w:rPr>
-          <w:lang w:val="en-GB"/>
-        </w:rPr>
-        <w:t>to  “</w:t>
-      </w:r>
-      <w:proofErr w:type="spellStart"/>
-      <w:proofErr w:type="gramEnd"/>
+        <w:t>” to  “</w:t>
+      </w:r>
+      <w:proofErr w:type="spellStart"/>
       <w:r>
         <w:rPr>
           <w:lang w:val="en-GB"/>
@@ -17726,7 +17770,6 @@
       <w:r>
         <w:t xml:space="preserve"> -Output </w:t>
       </w:r>
-      <w:proofErr w:type="gramStart"/>
       <w:r>
         <w:rPr>
           <w:lang w:val="en-GB"/>
@@ -17747,7 +17790,6 @@
         </w:rPr>
         <w:t>\</w:t>
       </w:r>
-      <w:proofErr w:type="gramEnd"/>
       <w:r>
         <w:rPr>
           <w:lang w:val="en-GB"/>
@@ -17881,17 +17923,9 @@
         <w:rPr>
           <w:lang w:val="en-GB"/>
         </w:rPr>
-        <w:t xml:space="preserve">” </w:t>
-      </w:r>
-      <w:proofErr w:type="gramStart"/>
-      <w:r>
-        <w:rPr>
-          <w:lang w:val="en-GB"/>
-        </w:rPr>
-        <w:t>to  “</w:t>
-      </w:r>
-      <w:proofErr w:type="spellStart"/>
-      <w:proofErr w:type="gramEnd"/>
+        <w:t>” to  “</w:t>
+      </w:r>
+      <w:proofErr w:type="spellStart"/>
       <w:r>
         <w:rPr>
           <w:lang w:val="en-GB"/>
@@ -18032,6 +18066,7 @@
           <w:color w:val="00B050"/>
           <w:lang w:val="en-GB"/>
         </w:rPr>
+        <w:lastRenderedPageBreak/>
         <w:t>Status: Completed</w:t>
       </w:r>
     </w:p>
@@ -18123,17 +18158,9 @@
         <w:rPr>
           <w:lang w:val="en-GB"/>
         </w:rPr>
-        <w:t xml:space="preserve">” </w:t>
-      </w:r>
-      <w:proofErr w:type="gramStart"/>
-      <w:r>
-        <w:rPr>
-          <w:lang w:val="en-GB"/>
-        </w:rPr>
-        <w:t>to  “</w:t>
-      </w:r>
-      <w:proofErr w:type="spellStart"/>
-      <w:proofErr w:type="gramEnd"/>
+        <w:t>” to  “</w:t>
+      </w:r>
+      <w:proofErr w:type="spellStart"/>
       <w:r>
         <w:rPr>
           <w:lang w:val="en-GB"/>
@@ -18161,7 +18188,6 @@
           <w:b/>
           <w:bCs/>
         </w:rPr>
-        <w:lastRenderedPageBreak/>
         <w:t>PMC script:</w:t>
       </w:r>
     </w:p>
@@ -18350,17 +18376,9 @@
         <w:rPr>
           <w:lang w:val="en-GB"/>
         </w:rPr>
-        <w:t xml:space="preserve">” </w:t>
-      </w:r>
-      <w:proofErr w:type="gramStart"/>
-      <w:r>
-        <w:rPr>
-          <w:lang w:val="en-GB"/>
-        </w:rPr>
-        <w:t>to  “</w:t>
-      </w:r>
-      <w:proofErr w:type="spellStart"/>
-      <w:proofErr w:type="gramEnd"/>
+        <w:t>” to  “</w:t>
+      </w:r>
+      <w:proofErr w:type="spellStart"/>
       <w:r>
         <w:rPr>
           <w:lang w:val="en-GB"/>
@@ -18624,17 +18642,9 @@
         <w:rPr>
           <w:lang w:val="en-GB"/>
         </w:rPr>
-        <w:t xml:space="preserve">” </w:t>
-      </w:r>
-      <w:proofErr w:type="gramStart"/>
-      <w:r>
-        <w:rPr>
-          <w:lang w:val="en-GB"/>
-        </w:rPr>
-        <w:t>to  “</w:t>
-      </w:r>
-      <w:proofErr w:type="spellStart"/>
-      <w:proofErr w:type="gramEnd"/>
+        <w:t>” to  “</w:t>
+      </w:r>
+      <w:proofErr w:type="spellStart"/>
       <w:r>
         <w:rPr>
           <w:lang w:val="en-GB"/>
@@ -18871,17 +18881,9 @@
         <w:rPr>
           <w:lang w:val="en-GB"/>
         </w:rPr>
-        <w:t xml:space="preserve">” </w:t>
-      </w:r>
-      <w:proofErr w:type="gramStart"/>
-      <w:r>
-        <w:rPr>
-          <w:lang w:val="en-GB"/>
-        </w:rPr>
-        <w:t>to  “</w:t>
-      </w:r>
-      <w:proofErr w:type="spellStart"/>
-      <w:proofErr w:type="gramEnd"/>
+        <w:t>” to  “</w:t>
+      </w:r>
+      <w:proofErr w:type="spellStart"/>
       <w:r>
         <w:rPr>
           <w:lang w:val="en-GB"/>
@@ -18909,6 +18911,7 @@
           <w:b/>
           <w:bCs/>
         </w:rPr>
+        <w:lastRenderedPageBreak/>
         <w:t>PMC script:</w:t>
       </w:r>
     </w:p>
@@ -19106,17 +19109,9 @@
         <w:rPr>
           <w:lang w:val="en-GB"/>
         </w:rPr>
-        <w:t xml:space="preserve">” </w:t>
-      </w:r>
-      <w:proofErr w:type="gramStart"/>
-      <w:r>
-        <w:rPr>
-          <w:lang w:val="en-GB"/>
-        </w:rPr>
-        <w:t>to  “</w:t>
-      </w:r>
-      <w:proofErr w:type="spellStart"/>
-      <w:proofErr w:type="gramEnd"/>
+        <w:t>” to  “</w:t>
+      </w:r>
+      <w:proofErr w:type="spellStart"/>
       <w:r>
         <w:rPr>
           <w:lang w:val="en-GB"/>
@@ -19144,7 +19139,6 @@
           <w:b/>
           <w:bCs/>
         </w:rPr>
-        <w:lastRenderedPageBreak/>
         <w:t>PMC script:</w:t>
       </w:r>
     </w:p>
@@ -19347,17 +19341,9 @@
         <w:rPr>
           <w:lang w:val="en-GB"/>
         </w:rPr>
-        <w:t xml:space="preserve">” </w:t>
-      </w:r>
-      <w:proofErr w:type="gramStart"/>
-      <w:r>
-        <w:rPr>
-          <w:lang w:val="en-GB"/>
-        </w:rPr>
-        <w:t>to  “</w:t>
-      </w:r>
-      <w:proofErr w:type="spellStart"/>
-      <w:proofErr w:type="gramEnd"/>
+        <w:t>” to  “</w:t>
+      </w:r>
+      <w:proofErr w:type="spellStart"/>
       <w:r>
         <w:rPr>
           <w:lang w:val="en-GB"/>
@@ -19585,17 +19571,9 @@
         <w:rPr>
           <w:lang w:val="en-GB"/>
         </w:rPr>
-        <w:t xml:space="preserve">” </w:t>
-      </w:r>
-      <w:proofErr w:type="gramStart"/>
-      <w:r>
-        <w:rPr>
-          <w:lang w:val="en-GB"/>
-        </w:rPr>
-        <w:t>to  “</w:t>
-      </w:r>
-      <w:proofErr w:type="spellStart"/>
-      <w:proofErr w:type="gramEnd"/>
+        <w:t>” to  “</w:t>
+      </w:r>
+      <w:proofErr w:type="spellStart"/>
       <w:r>
         <w:rPr>
           <w:lang w:val="en-GB"/>
@@ -19794,6 +19772,7 @@
           <w:color w:val="EE0000"/>
           <w:lang w:val="en-GB"/>
         </w:rPr>
+        <w:lastRenderedPageBreak/>
         <w:t>Migration script #</w:t>
       </w:r>
       <w:r>
@@ -19839,17 +19818,9 @@
         <w:rPr>
           <w:lang w:val="en-GB"/>
         </w:rPr>
-        <w:t xml:space="preserve">” </w:t>
-      </w:r>
-      <w:proofErr w:type="gramStart"/>
-      <w:r>
-        <w:rPr>
-          <w:lang w:val="en-GB"/>
-        </w:rPr>
-        <w:t>to  “</w:t>
-      </w:r>
-      <w:proofErr w:type="spellStart"/>
-      <w:proofErr w:type="gramEnd"/>
+        <w:t>” to  “</w:t>
+      </w:r>
+      <w:proofErr w:type="spellStart"/>
       <w:r>
         <w:rPr>
           <w:lang w:val="en-GB"/>
@@ -20029,7 +20000,6 @@
           <w:color w:val="EE0000"/>
           <w:lang w:val="en-GB"/>
         </w:rPr>
-        <w:lastRenderedPageBreak/>
         <w:t>Migration script #</w:t>
       </w:r>
       <w:r>
@@ -20075,17 +20045,9 @@
         <w:rPr>
           <w:lang w:val="en-GB"/>
         </w:rPr>
-        <w:t xml:space="preserve">” </w:t>
-      </w:r>
-      <w:proofErr w:type="gramStart"/>
-      <w:r>
-        <w:rPr>
-          <w:lang w:val="en-GB"/>
-        </w:rPr>
-        <w:t>to  “</w:t>
-      </w:r>
-      <w:proofErr w:type="spellStart"/>
-      <w:proofErr w:type="gramEnd"/>
+        <w:t>” to  “</w:t>
+      </w:r>
+      <w:proofErr w:type="spellStart"/>
       <w:r>
         <w:rPr>
           <w:lang w:val="en-GB"/>
@@ -20318,17 +20280,9 @@
         <w:rPr>
           <w:lang w:val="en-GB"/>
         </w:rPr>
-        <w:t xml:space="preserve">” </w:t>
-      </w:r>
-      <w:proofErr w:type="gramStart"/>
-      <w:r>
-        <w:rPr>
-          <w:lang w:val="en-GB"/>
-        </w:rPr>
-        <w:t>to  “</w:t>
-      </w:r>
-      <w:proofErr w:type="spellStart"/>
-      <w:proofErr w:type="gramEnd"/>
+        <w:t>” to  “</w:t>
+      </w:r>
+      <w:proofErr w:type="spellStart"/>
       <w:r>
         <w:rPr>
           <w:lang w:val="en-GB"/>
@@ -20559,17 +20513,9 @@
         <w:rPr>
           <w:lang w:val="en-GB"/>
         </w:rPr>
-        <w:t xml:space="preserve">” </w:t>
-      </w:r>
-      <w:proofErr w:type="gramStart"/>
-      <w:r>
-        <w:rPr>
-          <w:lang w:val="en-GB"/>
-        </w:rPr>
-        <w:t>to  “</w:t>
-      </w:r>
-      <w:proofErr w:type="spellStart"/>
-      <w:proofErr w:type="gramEnd"/>
+        <w:t>” to  “</w:t>
+      </w:r>
+      <w:proofErr w:type="spellStart"/>
       <w:r>
         <w:rPr>
           <w:lang w:val="en-GB"/>
@@ -20710,6 +20656,7 @@
         <w:rPr>
           <w:lang w:val="en-GB"/>
         </w:rPr>
+        <w:lastRenderedPageBreak/>
         <w:t>Status:</w:t>
       </w:r>
       <w:r>
@@ -20800,17 +20747,9 @@
         <w:rPr>
           <w:lang w:val="en-GB"/>
         </w:rPr>
-        <w:t xml:space="preserve">” </w:t>
-      </w:r>
-      <w:proofErr w:type="gramStart"/>
-      <w:r>
-        <w:rPr>
-          <w:lang w:val="en-GB"/>
-        </w:rPr>
-        <w:t>to  “</w:t>
-      </w:r>
-      <w:proofErr w:type="spellStart"/>
-      <w:proofErr w:type="gramEnd"/>
+        <w:t>” to  “</w:t>
+      </w:r>
+      <w:proofErr w:type="spellStart"/>
       <w:r>
         <w:t>AddAutoIDToAttendanceTimesheet</w:t>
       </w:r>
@@ -20953,7 +20892,6 @@
         <w:rPr>
           <w:lang w:val="en-GB"/>
         </w:rPr>
-        <w:lastRenderedPageBreak/>
         <w:t>Status:</w:t>
       </w:r>
       <w:r>
@@ -21041,17 +20979,9 @@
         <w:rPr>
           <w:lang w:val="en-GB"/>
         </w:rPr>
-        <w:t xml:space="preserve">” </w:t>
-      </w:r>
-      <w:proofErr w:type="gramStart"/>
-      <w:r>
-        <w:rPr>
-          <w:lang w:val="en-GB"/>
-        </w:rPr>
-        <w:t>to  “</w:t>
-      </w:r>
-      <w:proofErr w:type="spellStart"/>
-      <w:proofErr w:type="gramEnd"/>
+        <w:t>” to  “</w:t>
+      </w:r>
+      <w:proofErr w:type="spellStart"/>
       <w:r>
         <w:rPr>
           <w:lang w:val="en-GB"/>
@@ -21276,17 +21206,9 @@
         <w:rPr>
           <w:lang w:val="en-GB"/>
         </w:rPr>
-        <w:t xml:space="preserve">” </w:t>
-      </w:r>
-      <w:proofErr w:type="gramStart"/>
-      <w:r>
-        <w:rPr>
-          <w:lang w:val="en-GB"/>
-        </w:rPr>
-        <w:t>to  “</w:t>
-      </w:r>
-      <w:proofErr w:type="spellStart"/>
-      <w:proofErr w:type="gramEnd"/>
+        <w:t>” to  “</w:t>
+      </w:r>
+      <w:proofErr w:type="spellStart"/>
       <w:r>
         <w:rPr>
           <w:lang w:val="en-GB"/>
@@ -21517,17 +21439,9 @@
         <w:rPr>
           <w:lang w:val="en-GB"/>
         </w:rPr>
-        <w:t xml:space="preserve">” </w:t>
-      </w:r>
-      <w:proofErr w:type="gramStart"/>
-      <w:r>
-        <w:rPr>
-          <w:lang w:val="en-GB"/>
-        </w:rPr>
-        <w:t>to  “</w:t>
-      </w:r>
-      <w:proofErr w:type="spellStart"/>
-      <w:proofErr w:type="gramEnd"/>
+        <w:t>” to  “</w:t>
+      </w:r>
+      <w:proofErr w:type="spellStart"/>
       <w:r>
         <w:rPr>
           <w:lang w:val="en-GB"/>
@@ -21671,6 +21585,7 @@
         <w:rPr>
           <w:lang w:val="en-GB"/>
         </w:rPr>
+        <w:lastRenderedPageBreak/>
         <w:t>Status:</w:t>
       </w:r>
       <w:r>
@@ -21773,17 +21688,9 @@
         <w:rPr>
           <w:lang w:val="en-GB"/>
         </w:rPr>
-        <w:t xml:space="preserve">” </w:t>
-      </w:r>
-      <w:proofErr w:type="gramStart"/>
-      <w:r>
-        <w:rPr>
-          <w:lang w:val="en-GB"/>
-        </w:rPr>
-        <w:t>to  “</w:t>
-      </w:r>
-      <w:proofErr w:type="spellStart"/>
-      <w:proofErr w:type="gramEnd"/>
+        <w:t>” to  “</w:t>
+      </w:r>
+      <w:proofErr w:type="spellStart"/>
       <w:r>
         <w:rPr>
           <w:lang w:val="en-GB"/>
@@ -21924,7 +21831,6 @@
         <w:rPr>
           <w:lang w:val="en-GB"/>
         </w:rPr>
-        <w:lastRenderedPageBreak/>
         <w:t>Status:</w:t>
       </w:r>
       <w:r>
@@ -22015,17 +21921,9 @@
         <w:rPr>
           <w:lang w:val="en-GB"/>
         </w:rPr>
-        <w:t xml:space="preserve">” </w:t>
-      </w:r>
-      <w:proofErr w:type="gramStart"/>
-      <w:r>
-        <w:rPr>
-          <w:lang w:val="en-GB"/>
-        </w:rPr>
-        <w:t>to  “</w:t>
-      </w:r>
-      <w:proofErr w:type="spellStart"/>
-      <w:proofErr w:type="gramEnd"/>
+        <w:t>” to  “</w:t>
+      </w:r>
+      <w:proofErr w:type="spellStart"/>
       <w:r>
         <w:rPr>
           <w:lang w:val="en-GB"/>
@@ -22250,17 +22148,9 @@
         <w:rPr>
           <w:lang w:val="en-GB"/>
         </w:rPr>
-        <w:t xml:space="preserve">” </w:t>
-      </w:r>
-      <w:proofErr w:type="gramStart"/>
-      <w:r>
-        <w:rPr>
-          <w:lang w:val="en-GB"/>
-        </w:rPr>
-        <w:t>to  “</w:t>
-      </w:r>
-      <w:proofErr w:type="spellStart"/>
-      <w:proofErr w:type="gramEnd"/>
+        <w:t>” to  “</w:t>
+      </w:r>
+      <w:proofErr w:type="spellStart"/>
       <w:r>
         <w:t>AddAuthenticationTokenFields</w:t>
       </w:r>
@@ -22483,17 +22373,9 @@
         <w:rPr>
           <w:lang w:val="en-GB"/>
         </w:rPr>
-        <w:t xml:space="preserve">” </w:t>
-      </w:r>
-      <w:proofErr w:type="gramStart"/>
-      <w:r>
-        <w:rPr>
-          <w:lang w:val="en-GB"/>
-        </w:rPr>
-        <w:t>to  “</w:t>
-      </w:r>
-      <w:proofErr w:type="spellStart"/>
-      <w:proofErr w:type="gramEnd"/>
+        <w:t>” to  “</w:t>
+      </w:r>
+      <w:proofErr w:type="spellStart"/>
       <w:r>
         <w:t>AddLeaveAttachment</w:t>
       </w:r>
@@ -22687,6 +22569,7 @@
           <w:color w:val="EE0000"/>
           <w:lang w:val="en-GB"/>
         </w:rPr>
+        <w:lastRenderedPageBreak/>
         <w:t>Migration script #</w:t>
       </w:r>
       <w:r>
@@ -22730,17 +22613,9 @@
         <w:rPr>
           <w:lang w:val="en-GB"/>
         </w:rPr>
-        <w:t xml:space="preserve">” </w:t>
-      </w:r>
-      <w:proofErr w:type="gramStart"/>
-      <w:r>
-        <w:rPr>
-          <w:lang w:val="en-GB"/>
-        </w:rPr>
-        <w:t>to  “</w:t>
-      </w:r>
-      <w:proofErr w:type="spellStart"/>
-      <w:proofErr w:type="gramEnd"/>
+        <w:t>” to  “</w:t>
+      </w:r>
+      <w:proofErr w:type="spellStart"/>
       <w:r>
         <w:t>AddFieldsLeaveRequisitionWF</w:t>
       </w:r>
@@ -22944,7 +22819,6 @@
           <w:color w:val="EE0000"/>
           <w:lang w:val="en-GB"/>
         </w:rPr>
-        <w:lastRenderedPageBreak/>
         <w:t>Migration script #</w:t>
       </w:r>
       <w:r>
@@ -22988,17 +22862,9 @@
         <w:rPr>
           <w:lang w:val="en-GB"/>
         </w:rPr>
-        <w:t xml:space="preserve">” </w:t>
-      </w:r>
-      <w:proofErr w:type="gramStart"/>
-      <w:r>
-        <w:rPr>
-          <w:lang w:val="en-GB"/>
-        </w:rPr>
-        <w:t>to  “</w:t>
-      </w:r>
-      <w:proofErr w:type="spellStart"/>
-      <w:proofErr w:type="gramEnd"/>
+        <w:t>” to  “</w:t>
+      </w:r>
+      <w:proofErr w:type="spellStart"/>
       <w:r>
         <w:t>ModifyRelationLeaveAttachment</w:t>
       </w:r>
@@ -23230,17 +23096,9 @@
         <w:rPr>
           <w:lang w:val="en-GB"/>
         </w:rPr>
-        <w:t xml:space="preserve">” </w:t>
-      </w:r>
-      <w:proofErr w:type="gramStart"/>
-      <w:r>
-        <w:rPr>
-          <w:lang w:val="en-GB"/>
-        </w:rPr>
-        <w:t>to  “</w:t>
-      </w:r>
-      <w:proofErr w:type="spellStart"/>
-      <w:proofErr w:type="gramEnd"/>
+        <w:t>” to  “</w:t>
+      </w:r>
+      <w:proofErr w:type="spellStart"/>
       <w:r>
         <w:rPr>
           <w:lang w:val="en-GB"/>
@@ -23476,17 +23334,9 @@
         <w:rPr>
           <w:lang w:val="en-GB"/>
         </w:rPr>
-        <w:t xml:space="preserve">” </w:t>
-      </w:r>
-      <w:proofErr w:type="gramStart"/>
-      <w:r>
-        <w:rPr>
-          <w:lang w:val="en-GB"/>
-        </w:rPr>
-        <w:t>to  “</w:t>
-      </w:r>
-      <w:proofErr w:type="spellStart"/>
-      <w:proofErr w:type="gramEnd"/>
+        <w:t>” to  “</w:t>
+      </w:r>
+      <w:proofErr w:type="spellStart"/>
       <w:r>
         <w:rPr>
           <w:lang w:val="en-GB"/>
@@ -23749,17 +23599,9 @@
         <w:rPr>
           <w:lang w:val="en-GB"/>
         </w:rPr>
-        <w:t xml:space="preserve">” </w:t>
-      </w:r>
-      <w:proofErr w:type="gramStart"/>
-      <w:r>
-        <w:rPr>
-          <w:lang w:val="en-GB"/>
-        </w:rPr>
-        <w:t>to  “</w:t>
-      </w:r>
-      <w:proofErr w:type="spellStart"/>
-      <w:proofErr w:type="gramEnd"/>
+        <w:t>” to  “</w:t>
+      </w:r>
+      <w:proofErr w:type="spellStart"/>
       <w:r>
         <w:rPr>
           <w:lang w:val="en-GB"/>
@@ -23788,6 +23630,7 @@
           <w:b/>
           <w:bCs/>
         </w:rPr>
+        <w:lastRenderedPageBreak/>
         <w:t>PMC script:</w:t>
       </w:r>
     </w:p>
@@ -24010,17 +23853,9 @@
         <w:rPr>
           <w:lang w:val="en-GB"/>
         </w:rPr>
-        <w:t xml:space="preserve">” </w:t>
-      </w:r>
-      <w:proofErr w:type="gramStart"/>
-      <w:r>
-        <w:rPr>
-          <w:lang w:val="en-GB"/>
-        </w:rPr>
-        <w:t>to  “</w:t>
-      </w:r>
-      <w:proofErr w:type="spellStart"/>
-      <w:proofErr w:type="gramEnd"/>
+        <w:t>” to  “</w:t>
+      </w:r>
+      <w:proofErr w:type="spellStart"/>
       <w:r>
         <w:rPr>
           <w:lang w:val="en-GB"/>
@@ -24061,7 +23896,6 @@
         </w:rPr>
       </w:pPr>
       <w:r>
-        <w:lastRenderedPageBreak/>
         <w:t xml:space="preserve">Script-Migration -From </w:t>
       </w:r>
       <w:proofErr w:type="spellStart"/>
@@ -24272,17 +24106,9 @@
         <w:rPr>
           <w:lang w:val="en-GB"/>
         </w:rPr>
-        <w:t xml:space="preserve">” </w:t>
-      </w:r>
-      <w:proofErr w:type="gramStart"/>
-      <w:r>
-        <w:rPr>
-          <w:lang w:val="en-GB"/>
-        </w:rPr>
-        <w:t>to  “</w:t>
-      </w:r>
-      <w:proofErr w:type="spellStart"/>
-      <w:proofErr w:type="gramEnd"/>
+        <w:t>” to  “</w:t>
+      </w:r>
+      <w:proofErr w:type="spellStart"/>
       <w:r>
         <w:rPr>
           <w:lang w:val="en-GB"/>
@@ -24530,17 +24356,9 @@
         <w:rPr>
           <w:lang w:val="en-GB"/>
         </w:rPr>
-        <w:t xml:space="preserve">” </w:t>
-      </w:r>
-      <w:proofErr w:type="gramStart"/>
-      <w:r>
-        <w:rPr>
-          <w:lang w:val="en-GB"/>
-        </w:rPr>
-        <w:t>to  “</w:t>
-      </w:r>
-      <w:proofErr w:type="spellStart"/>
-      <w:proofErr w:type="gramEnd"/>
+        <w:t>” to  “</w:t>
+      </w:r>
+      <w:proofErr w:type="spellStart"/>
       <w:r>
         <w:rPr>
           <w:lang w:val="en-GB"/>
@@ -24788,17 +24606,9 @@
         <w:rPr>
           <w:lang w:val="en-GB"/>
         </w:rPr>
-        <w:t xml:space="preserve">” </w:t>
-      </w:r>
-      <w:proofErr w:type="gramStart"/>
-      <w:r>
-        <w:rPr>
-          <w:lang w:val="en-GB"/>
-        </w:rPr>
-        <w:t>to  “</w:t>
-      </w:r>
-      <w:proofErr w:type="spellStart"/>
-      <w:proofErr w:type="gramEnd"/>
+        <w:t>” to  “</w:t>
+      </w:r>
+      <w:proofErr w:type="spellStart"/>
       <w:r>
         <w:rPr>
           <w:lang w:val="en-GB"/>
@@ -25037,17 +24847,9 @@
         <w:rPr>
           <w:lang w:val="en-GB"/>
         </w:rPr>
-        <w:t xml:space="preserve">” </w:t>
-      </w:r>
-      <w:proofErr w:type="gramStart"/>
-      <w:r>
-        <w:rPr>
-          <w:lang w:val="en-GB"/>
-        </w:rPr>
-        <w:t>to  “</w:t>
-      </w:r>
-      <w:proofErr w:type="spellStart"/>
-      <w:proofErr w:type="gramEnd"/>
+        <w:t>” to  “</w:t>
+      </w:r>
+      <w:proofErr w:type="spellStart"/>
       <w:r>
         <w:t>AddGroupType</w:t>
       </w:r>
@@ -25245,7 +25047,6 @@
           <w:color w:val="EE0000"/>
           <w:lang w:val="en-GB"/>
         </w:rPr>
-        <w:lastRenderedPageBreak/>
         <w:t>Migration script #</w:t>
       </w:r>
       <w:r>
@@ -25289,17 +25090,9 @@
         <w:rPr>
           <w:lang w:val="en-GB"/>
         </w:rPr>
-        <w:t xml:space="preserve">” </w:t>
-      </w:r>
-      <w:proofErr w:type="gramStart"/>
-      <w:r>
-        <w:rPr>
-          <w:lang w:val="en-GB"/>
-        </w:rPr>
-        <w:t>to  “</w:t>
-      </w:r>
-      <w:proofErr w:type="spellStart"/>
-      <w:proofErr w:type="gramEnd"/>
+        <w:t>” to  “</w:t>
+      </w:r>
+      <w:proofErr w:type="spellStart"/>
       <w:r>
         <w:rPr>
           <w:lang w:val="en-GB"/>
@@ -25544,17 +25337,9 @@
         <w:rPr>
           <w:lang w:val="en-GB"/>
         </w:rPr>
-        <w:t xml:space="preserve">” </w:t>
-      </w:r>
-      <w:proofErr w:type="gramStart"/>
-      <w:r>
-        <w:rPr>
-          <w:lang w:val="en-GB"/>
-        </w:rPr>
-        <w:t>to  “</w:t>
-      </w:r>
-      <w:proofErr w:type="spellStart"/>
-      <w:proofErr w:type="gramEnd"/>
+        <w:t>” to  “</w:t>
+      </w:r>
+      <w:proofErr w:type="spellStart"/>
       <w:r>
         <w:t>AddRegularRequestWF</w:t>
       </w:r>
@@ -25786,17 +25571,9 @@
         <w:rPr>
           <w:lang w:val="en-GB"/>
         </w:rPr>
-        <w:t xml:space="preserve">” </w:t>
-      </w:r>
-      <w:proofErr w:type="gramStart"/>
-      <w:r>
-        <w:rPr>
-          <w:lang w:val="en-GB"/>
-        </w:rPr>
-        <w:t>to  “</w:t>
-      </w:r>
-      <w:proofErr w:type="spellStart"/>
-      <w:proofErr w:type="gramEnd"/>
+        <w:t>” to  “</w:t>
+      </w:r>
+      <w:proofErr w:type="spellStart"/>
       <w:r>
         <w:t>Modify</w:t>
       </w:r>
@@ -26034,17 +25811,9 @@
         <w:rPr>
           <w:lang w:val="en-GB"/>
         </w:rPr>
-        <w:t xml:space="preserve">” </w:t>
-      </w:r>
-      <w:proofErr w:type="gramStart"/>
-      <w:r>
-        <w:rPr>
-          <w:lang w:val="en-GB"/>
-        </w:rPr>
-        <w:t>to  “</w:t>
-      </w:r>
-      <w:proofErr w:type="spellStart"/>
-      <w:proofErr w:type="gramEnd"/>
+        <w:t>” to  “</w:t>
+      </w:r>
+      <w:proofErr w:type="spellStart"/>
       <w:r>
         <w:t>AddCostCenterRegularRequestWF</w:t>
       </w:r>
@@ -26082,6 +25851,7 @@
         </w:rPr>
       </w:pPr>
       <w:r>
+        <w:lastRenderedPageBreak/>
         <w:t xml:space="preserve">Script-Migration -From </w:t>
       </w:r>
       <w:proofErr w:type="spellStart"/>
@@ -26276,17 +26046,9 @@
         <w:rPr>
           <w:lang w:val="en-GB"/>
         </w:rPr>
-        <w:t xml:space="preserve">” </w:t>
-      </w:r>
-      <w:proofErr w:type="gramStart"/>
-      <w:r>
-        <w:rPr>
-          <w:lang w:val="en-GB"/>
-        </w:rPr>
-        <w:t>to  “</w:t>
-      </w:r>
-      <w:proofErr w:type="spellStart"/>
-      <w:proofErr w:type="gramEnd"/>
+        <w:t>” to  “</w:t>
+      </w:r>
+      <w:proofErr w:type="spellStart"/>
       <w:r>
         <w:t>AddNewFieldRegularRequestWF</w:t>
       </w:r>
@@ -26324,7 +26086,6 @@
         </w:rPr>
       </w:pPr>
       <w:r>
-        <w:lastRenderedPageBreak/>
         <w:t xml:space="preserve">Script-Migration -From </w:t>
       </w:r>
       <w:proofErr w:type="spellStart"/>
@@ -26519,17 +26280,9 @@
         <w:rPr>
           <w:lang w:val="en-GB"/>
         </w:rPr>
-        <w:t xml:space="preserve">” </w:t>
-      </w:r>
-      <w:proofErr w:type="gramStart"/>
-      <w:r>
-        <w:rPr>
-          <w:lang w:val="en-GB"/>
-        </w:rPr>
-        <w:t>to  “</w:t>
-      </w:r>
-      <w:proofErr w:type="spellStart"/>
-      <w:proofErr w:type="gramEnd"/>
+        <w:t>” to  “</w:t>
+      </w:r>
+      <w:proofErr w:type="spellStart"/>
       <w:r>
         <w:t>CreateEntityOTRequestWF</w:t>
       </w:r>
@@ -26761,17 +26514,9 @@
         <w:rPr>
           <w:lang w:val="en-GB"/>
         </w:rPr>
-        <w:t xml:space="preserve">” </w:t>
-      </w:r>
-      <w:proofErr w:type="gramStart"/>
-      <w:r>
-        <w:rPr>
-          <w:lang w:val="en-GB"/>
-        </w:rPr>
-        <w:t>to  “</w:t>
-      </w:r>
-      <w:proofErr w:type="spellStart"/>
-      <w:proofErr w:type="gramEnd"/>
+        <w:t>” to  “</w:t>
+      </w:r>
+      <w:proofErr w:type="spellStart"/>
       <w:r>
         <w:t>CreateEntityOutdoorRequestWF</w:t>
       </w:r>
@@ -26926,19 +26671,7 @@
         <w:rPr>
           <w:color w:val="00B050"/>
         </w:rPr>
-        <w:t xml:space="preserve"> on </w:t>
-      </w:r>
-      <w:r>
-        <w:rPr>
-          <w:color w:val="00B050"/>
-        </w:rPr>
-        <w:t>30</w:t>
-      </w:r>
-      <w:r>
-        <w:rPr>
-          <w:color w:val="00B050"/>
-        </w:rPr>
-        <w:t>-Jun-2026</w:t>
+        <w:t xml:space="preserve"> on 30-Jun-2026</w:t>
       </w:r>
     </w:p>
     <w:p>
@@ -26952,8 +26685,251 @@
     </w:p>
     <w:p>
       <w:pPr>
+        <w:pStyle w:val="ListParagraph"/>
+        <w:numPr>
+          <w:ilvl w:val="0"/>
+          <w:numId w:val="3"/>
+        </w:numPr>
+        <w:spacing w:after="0"/>
+        <w:rPr>
+          <w:b/>
+          <w:bCs/>
+          <w:color w:val="EE0000"/>
+          <w:lang w:val="en-GB"/>
+        </w:rPr>
+      </w:pPr>
+      <w:r>
+        <w:rPr>
+          <w:b/>
+          <w:bCs/>
+          <w:color w:val="EE0000"/>
+          <w:lang w:val="en-GB"/>
+        </w:rPr>
+        <w:t>Migration script #</w:t>
+      </w:r>
+      <w:r>
+        <w:rPr>
+          <w:b/>
+          <w:bCs/>
+          <w:color w:val="EE0000"/>
+          <w:lang w:val="en-GB"/>
+        </w:rPr>
+        <w:t>5</w:t>
+      </w:r>
+      <w:r>
+        <w:rPr>
+          <w:b/>
+          <w:bCs/>
+          <w:color w:val="EE0000"/>
+          <w:lang w:val="en-GB"/>
+        </w:rPr>
+        <w:t>6</w:t>
+      </w:r>
+    </w:p>
+    <w:p>
+      <w:pPr>
+        <w:spacing w:after="0"/>
         <w:ind w:left="720"/>
         <w:rPr>
+          <w:lang w:val="en-GB"/>
+        </w:rPr>
+      </w:pPr>
+      <w:r>
+        <w:rPr>
+          <w:b/>
+          <w:bCs/>
+          <w:lang w:val="en-GB"/>
+        </w:rPr>
+        <w:t>Description:</w:t>
+      </w:r>
+      <w:r>
+        <w:rPr>
+          <w:lang w:val="en-GB"/>
+        </w:rPr>
+        <w:t xml:space="preserve"> Create SQL migration script from “</w:t>
+      </w:r>
+      <w:proofErr w:type="spellStart"/>
+      <w:r>
+        <w:t>CreateEntityOutdoorRequestWF</w:t>
+      </w:r>
+      <w:proofErr w:type="spellEnd"/>
+      <w:r>
+        <w:rPr>
+          <w:lang w:val="en-GB"/>
+        </w:rPr>
+        <w:t>” to  “</w:t>
+      </w:r>
+      <w:r>
+        <w:t>CreateEntityPlannedLeaveRequest</w:t>
+      </w:r>
+      <w:r>
+        <w:rPr>
+          <w:lang w:val="en-GB"/>
+        </w:rPr>
+        <w:t>”</w:t>
+      </w:r>
+    </w:p>
+    <w:p>
+      <w:pPr>
+        <w:spacing w:after="0"/>
+        <w:ind w:left="720"/>
+        <w:rPr>
+          <w:b/>
+          <w:bCs/>
+        </w:rPr>
+      </w:pPr>
+      <w:r>
+        <w:rPr>
+          <w:b/>
+          <w:bCs/>
+        </w:rPr>
+        <w:t>PMC script:</w:t>
+      </w:r>
+    </w:p>
+    <w:p>
+      <w:pPr>
+        <w:spacing w:after="0"/>
+        <w:ind w:left="720"/>
+        <w:rPr>
+          <w:lang w:val="en-GB"/>
+        </w:rPr>
+      </w:pPr>
+      <w:r>
+        <w:t xml:space="preserve">Script-Migration -From </w:t>
+      </w:r>
+      <w:proofErr w:type="spellStart"/>
+      <w:r>
+        <w:t>CreateEntityOutdoorRequestWF</w:t>
+      </w:r>
+      <w:proofErr w:type="spellEnd"/>
+      <w:r>
+        <w:t xml:space="preserve"> </w:t>
+      </w:r>
+      <w:r>
+        <w:t xml:space="preserve">-To </w:t>
+      </w:r>
+      <w:r>
+        <w:t>CreateEntityPlannedLeaveRequest</w:t>
+      </w:r>
+      <w:r>
+        <w:rPr>
+          <w:lang w:val="en-GB"/>
+        </w:rPr>
+        <w:t xml:space="preserve"> </w:t>
+      </w:r>
+      <w:r>
+        <w:rPr>
+          <w:lang w:val="en-GB"/>
+        </w:rPr>
+        <w:t xml:space="preserve">-Context </w:t>
+      </w:r>
+      <w:proofErr w:type="spellStart"/>
+      <w:r>
+        <w:rPr>
+          <w:lang w:val="en-GB"/>
+        </w:rPr>
+        <w:t>AppDbContext</w:t>
+      </w:r>
+      <w:proofErr w:type="spellEnd"/>
+      <w:r>
+        <w:t xml:space="preserve"> -Output </w:t>
+      </w:r>
+      <w:r>
+        <w:rPr>
+          <w:lang w:val="en-GB"/>
+        </w:rPr>
+        <w:t>".\</w:t>
+      </w:r>
+      <w:proofErr w:type="spellStart"/>
+      <w:r>
+        <w:rPr>
+          <w:lang w:val="en-GB"/>
+        </w:rPr>
+        <w:t>MigrationScripts</w:t>
+      </w:r>
+      <w:proofErr w:type="spellEnd"/>
+      <w:r>
+        <w:rPr>
+          <w:lang w:val="en-GB"/>
+        </w:rPr>
+        <w:t>\</w:t>
+      </w:r>
+      <w:r>
+        <w:t>CreateEntityPlannedLeaveRequest</w:t>
+      </w:r>
+      <w:r>
+        <w:rPr>
+          <w:lang w:val="en-GB"/>
+        </w:rPr>
+        <w:t>.</w:t>
+      </w:r>
+      <w:proofErr w:type="spellStart"/>
+      <w:r>
+        <w:rPr>
+          <w:lang w:val="en-GB"/>
+        </w:rPr>
+        <w:t>sql</w:t>
+      </w:r>
+      <w:proofErr w:type="spellEnd"/>
+      <w:r>
+        <w:rPr>
+          <w:lang w:val="en-GB"/>
+        </w:rPr>
+        <w:t>"</w:t>
+      </w:r>
+    </w:p>
+    <w:p>
+      <w:pPr>
+        <w:spacing w:after="0"/>
+        <w:ind w:left="720"/>
+        <w:rPr>
+          <w:color w:val="00B050"/>
+        </w:rPr>
+      </w:pPr>
+      <w:r>
+        <w:rPr>
+          <w:lang w:val="en-GB"/>
+        </w:rPr>
+        <w:t>Status:</w:t>
+      </w:r>
+      <w:r>
+        <w:rPr>
+          <w:b/>
+          <w:bCs/>
+          <w:color w:val="00B050"/>
+          <w:lang w:val="en-GB"/>
+        </w:rPr>
+        <w:t xml:space="preserve"> </w:t>
+      </w:r>
+      <w:r>
+        <w:rPr>
+          <w:color w:val="EE0000"/>
+        </w:rPr>
+        <w:t>Pending</w:t>
+      </w:r>
+    </w:p>
+    <w:p>
+      <w:pPr>
+        <w:spacing w:after="0"/>
+        <w:ind w:left="720"/>
+        <w:rPr>
+          <w:color w:val="00B050"/>
+        </w:rPr>
+      </w:pPr>
+    </w:p>
+    <w:p>
+      <w:pPr>
+        <w:spacing w:after="0"/>
+        <w:ind w:left="720"/>
+        <w:rPr>
+          <w:color w:val="00B050"/>
+        </w:rPr>
+      </w:pPr>
+    </w:p>
+    <w:p>
+      <w:pPr>
+        <w:ind w:left="720"/>
+        <w:rPr>
           <w:b/>
           <w:bCs/>
           <w:color w:val="00B050"/>
@@ -27065,14 +27041,7 @@
         <w:rPr>
           <w:lang w:val="en-GB"/>
         </w:rPr>
-        <w:t xml:space="preserve">. Now, I realized that there are entity properties that I need to correct. So, I need to delete this migration. Note that this </w:t>
-      </w:r>
-      <w:r>
-        <w:rPr>
-          <w:lang w:val="en-GB"/>
-        </w:rPr>
-        <w:lastRenderedPageBreak/>
-        <w:t>migration was not yet implemented in the database since I haven’t executed the command, Update-Database. Tell me how to remove this migration in my Blazor project without affecting the database.</w:t>
+        <w:t>. Now, I realized that there are entity properties that I need to correct. So, I need to delete this migration. Note that this migration was not yet implemented in the database since I haven’t executed the command, Update-Database. Tell me how to remove this migration in my Blazor project without affecting the database.</w:t>
       </w:r>
     </w:p>
     <w:p/>
@@ -28714,7 +28683,6 @@
   <w:style w:type="character" w:default="1" w:styleId="DefaultParagraphFont">
     <w:name w:val="Default Paragraph Font"/>
     <w:uiPriority w:val="1"/>
-    <w:semiHidden/>
     <w:unhideWhenUsed/>
   </w:style>
   <w:style w:type="table" w:default="1" w:styleId="TableNormal">

</xml_diff>

<commit_message>
Migrated changed to Qualifications entity in staging database.
</commit_message>
<xml_diff>
--- a/MigrationScripts/EF Core Migration History.docx
+++ b/MigrationScripts/EF Core Migration History.docx
@@ -10329,6 +10329,9 @@
       <w:pPr>
         <w:spacing w:after="0"/>
         <w:ind w:left="1080"/>
+        <w:rPr>
+          <w:color w:val="00B050"/>
+        </w:rPr>
       </w:pPr>
       <w:r>
         <w:t>Development Database:</w:t>
@@ -10346,19 +10349,151 @@
         <w:rPr>
           <w:color w:val="00B050"/>
         </w:rPr>
-        <w:t xml:space="preserve"> on 0</w:t>
-      </w:r>
-      <w:r>
-        <w:rPr>
-          <w:color w:val="00B050"/>
-        </w:rPr>
-        <w:t>9</w:t>
-      </w:r>
-      <w:r>
-        <w:rPr>
-          <w:color w:val="00B050"/>
-        </w:rPr>
-        <w:t>-Jul-2026</w:t>
+        <w:t xml:space="preserve"> on 09-Jul-2026</w:t>
+      </w:r>
+    </w:p>
+    <w:p>
+      <w:pPr>
+        <w:spacing w:after="0"/>
+        <w:ind w:left="1080"/>
+        <w:rPr>
+          <w:color w:val="00B050"/>
+        </w:rPr>
+      </w:pPr>
+    </w:p>
+    <w:p>
+      <w:pPr>
+        <w:pStyle w:val="ListParagraph"/>
+        <w:numPr>
+          <w:ilvl w:val="0"/>
+          <w:numId w:val="6"/>
+        </w:numPr>
+        <w:spacing w:after="0"/>
+        <w:rPr>
+          <w:b/>
+          <w:bCs/>
+          <w:color w:val="EE0000"/>
+        </w:rPr>
+      </w:pPr>
+      <w:r>
+        <w:rPr>
+          <w:b/>
+          <w:bCs/>
+          <w:color w:val="EE0000"/>
+        </w:rPr>
+        <w:t>Data Migration PMC Command #</w:t>
+      </w:r>
+      <w:r>
+        <w:rPr>
+          <w:b/>
+          <w:bCs/>
+          <w:color w:val="EE0000"/>
+        </w:rPr>
+        <w:t>6</w:t>
+      </w:r>
+      <w:r>
+        <w:rPr>
+          <w:b/>
+          <w:bCs/>
+          <w:color w:val="EE0000"/>
+        </w:rPr>
+        <w:t>4</w:t>
+      </w:r>
+    </w:p>
+    <w:p>
+      <w:pPr>
+        <w:spacing w:after="0"/>
+        <w:ind w:left="1080"/>
+      </w:pPr>
+      <w:r>
+        <w:t>Add-Migration</w:t>
+      </w:r>
+      <w:r>
+        <w:t xml:space="preserve"> </w:t>
+      </w:r>
+      <w:r>
+        <w:rPr>
+          <w:lang w:val="en-GB"/>
+        </w:rPr>
+        <w:t>Add</w:t>
+      </w:r>
+      <w:r>
+        <w:rPr>
+          <w:lang w:val="en-GB"/>
+        </w:rPr>
+        <w:t>Qualification</w:t>
+      </w:r>
+      <w:r>
+        <w:rPr>
+          <w:lang w:val="en-GB"/>
+        </w:rPr>
+        <w:t xml:space="preserve">StateName </w:t>
+      </w:r>
+      <w:r>
+        <w:t xml:space="preserve">-Context AppDbContext </w:t>
+      </w:r>
+      <w:r>
+        <w:t>-Project KenHRApp.Infrastructure -StartupProject KenHRApp.Web -Verbose</w:t>
+      </w:r>
+    </w:p>
+    <w:p>
+      <w:pPr>
+        <w:spacing w:after="0"/>
+        <w:ind w:left="1080"/>
+      </w:pPr>
+    </w:p>
+    <w:p>
+      <w:pPr>
+        <w:spacing w:after="0"/>
+        <w:ind w:left="1080"/>
+      </w:pPr>
+      <w:r>
+        <w:t xml:space="preserve">Update-Database </w:t>
+      </w:r>
+      <w:r>
+        <w:t>-Context AppDbContext</w:t>
+      </w:r>
+    </w:p>
+    <w:p>
+      <w:pPr>
+        <w:spacing w:after="0"/>
+        <w:ind w:left="1080"/>
+        <w:rPr>
+          <w:u w:val="single"/>
+        </w:rPr>
+      </w:pPr>
+      <w:r>
+        <w:rPr>
+          <w:b/>
+          <w:bCs/>
+          <w:u w:val="single"/>
+        </w:rPr>
+        <w:t>Status:</w:t>
+      </w:r>
+      <w:r>
+        <w:rPr>
+          <w:u w:val="single"/>
+        </w:rPr>
+        <w:t xml:space="preserve"> </w:t>
+      </w:r>
+    </w:p>
+    <w:p>
+      <w:pPr>
+        <w:spacing w:after="0"/>
+        <w:ind w:left="1080"/>
+      </w:pPr>
+      <w:r>
+        <w:lastRenderedPageBreak/>
+        <w:t>Development Database:</w:t>
+      </w:r>
+      <w:r>
+        <w:t xml:space="preserve"> </w:t>
+      </w:r>
+      <w:r>
+        <w:rPr>
+          <w:color w:val="00B050"/>
+        </w:rPr>
+        <w:t>Pending</w:t>
       </w:r>
     </w:p>
     <w:p>
@@ -10760,6 +10895,7 @@
         </w:rPr>
       </w:pPr>
       <w:r>
+        <w:lastRenderedPageBreak/>
         <w:t xml:space="preserve">Script-Migration -From </w:t>
       </w:r>
       <w:r>
@@ -10870,7 +11006,6 @@
           <w:bCs/>
           <w:lang w:val="en-GB"/>
         </w:rPr>
-        <w:lastRenderedPageBreak/>
         <w:t>Description:</w:t>
       </w:r>
       <w:r>
@@ -11381,6 +11516,7 @@
           <w:color w:val="EE0000"/>
           <w:lang w:val="en-GB"/>
         </w:rPr>
+        <w:lastRenderedPageBreak/>
         <w:t>Migration script #</w:t>
       </w:r>
       <w:r>
@@ -11463,7 +11599,6 @@
         </w:rPr>
       </w:pPr>
       <w:r>
-        <w:lastRenderedPageBreak/>
         <w:t xml:space="preserve">Script-Migration -From </w:t>
       </w:r>
       <w:r>
@@ -12032,6 +12167,7 @@
           <w:b/>
           <w:bCs/>
         </w:rPr>
+        <w:lastRenderedPageBreak/>
         <w:t>PMC script:</w:t>
       </w:r>
     </w:p>
@@ -12661,6 +12797,7 @@
           <w:color w:val="EE0000"/>
           <w:lang w:val="en-GB"/>
         </w:rPr>
+        <w:lastRenderedPageBreak/>
         <w:t>Migration script #</w:t>
       </w:r>
       <w:r>
@@ -12737,7 +12874,6 @@
         </w:rPr>
       </w:pPr>
       <w:r>
-        <w:lastRenderedPageBreak/>
         <w:t xml:space="preserve">Script-Migration -From </w:t>
       </w:r>
       <w:r>
@@ -13437,7 +13573,6 @@
           <w:b/>
           <w:bCs/>
         </w:rPr>
-        <w:lastRenderedPageBreak/>
         <w:t>PMC script:</w:t>
       </w:r>
     </w:p>
@@ -14003,6 +14138,7 @@
         </w:rPr>
       </w:pPr>
       <w:r>
+        <w:lastRenderedPageBreak/>
         <w:t xml:space="preserve">Script-Migration -From </w:t>
       </w:r>
       <w:r>
@@ -14121,7 +14257,6 @@
           <w:color w:val="EE0000"/>
           <w:lang w:val="en-GB"/>
         </w:rPr>
-        <w:lastRenderedPageBreak/>
         <w:t>Migration script #</w:t>
       </w:r>
       <w:r>
@@ -14708,6 +14843,7 @@
           <w:color w:val="EE0000"/>
           <w:lang w:val="en-GB"/>
         </w:rPr>
+        <w:lastRenderedPageBreak/>
         <w:t>Migration script #</w:t>
       </w:r>
       <w:r>
@@ -14778,7 +14914,6 @@
         </w:rPr>
       </w:pPr>
       <w:r>
-        <w:lastRenderedPageBreak/>
         <w:t xml:space="preserve">Script-Migration -From </w:t>
       </w:r>
       <w:r>
@@ -15410,6 +15545,7 @@
         <w:rPr>
           <w:lang w:val="en-GB"/>
         </w:rPr>
+        <w:lastRenderedPageBreak/>
         <w:t>Status:</w:t>
       </w:r>
       <w:r>
@@ -15526,7 +15662,6 @@
           <w:b/>
           <w:bCs/>
         </w:rPr>
-        <w:lastRenderedPageBreak/>
         <w:t>PMC script:</w:t>
       </w:r>
     </w:p>
@@ -16121,6 +16256,7 @@
           <w:b/>
           <w:bCs/>
         </w:rPr>
+        <w:lastRenderedPageBreak/>
         <w:t>PMC script:</w:t>
       </w:r>
     </w:p>
@@ -16245,7 +16381,6 @@
           <w:color w:val="EE0000"/>
           <w:lang w:val="en-GB"/>
         </w:rPr>
-        <w:lastRenderedPageBreak/>
         <w:t>Migration script #</w:t>
       </w:r>
       <w:r>
@@ -16887,6 +17022,7 @@
           <w:b/>
           <w:bCs/>
         </w:rPr>
+        <w:lastRenderedPageBreak/>
         <w:t>PMC script:</w:t>
       </w:r>
     </w:p>
@@ -17011,7 +17147,6 @@
           <w:color w:val="EE0000"/>
           <w:lang w:val="en-GB"/>
         </w:rPr>
-        <w:lastRenderedPageBreak/>
         <w:t>Migration script #</w:t>
       </w:r>
       <w:r>
@@ -17656,6 +17791,7 @@
           <w:b/>
           <w:bCs/>
         </w:rPr>
+        <w:lastRenderedPageBreak/>
         <w:t>PMC script:</w:t>
       </w:r>
     </w:p>
@@ -17769,7 +17905,6 @@
           <w:color w:val="EE0000"/>
           <w:lang w:val="en-GB"/>
         </w:rPr>
-        <w:lastRenderedPageBreak/>
         <w:t>Migration script #</w:t>
       </w:r>
       <w:r>
@@ -18436,6 +18571,7 @@
         </w:rPr>
       </w:pPr>
       <w:r>
+        <w:lastRenderedPageBreak/>
         <w:t xml:space="preserve">Script-Migration -From </w:t>
       </w:r>
       <w:r>
@@ -18618,7 +18754,6 @@
           <w:b/>
           <w:bCs/>
         </w:rPr>
-        <w:lastRenderedPageBreak/>
         <w:t>PMC script:</w:t>
       </w:r>
     </w:p>
@@ -19417,6 +19552,7 @@
           <w:bCs/>
           <w:lang w:val="en-GB"/>
         </w:rPr>
+        <w:lastRenderedPageBreak/>
         <w:t>Description:</w:t>
       </w:r>
       <w:r>
@@ -20330,6 +20466,7 @@
         <w:rPr>
           <w:lang w:val="en-GB"/>
         </w:rPr>
+        <w:lastRenderedPageBreak/>
         <w:t>Status:</w:t>
       </w:r>
       <w:r>
@@ -20467,7 +20604,6 @@
         </w:rPr>
       </w:pPr>
       <w:r>
-        <w:lastRenderedPageBreak/>
         <w:t xml:space="preserve">Script-Migration -From </w:t>
       </w:r>
       <w:r>
@@ -21124,6 +21260,24 @@
     </w:p>
     <w:p>
       <w:pPr>
+        <w:spacing w:after="0"/>
+        <w:ind w:left="720"/>
+        <w:rPr>
+          <w:color w:val="EE0000"/>
+        </w:rPr>
+      </w:pPr>
+    </w:p>
+    <w:p>
+      <w:pPr>
+        <w:spacing w:after="0"/>
+        <w:ind w:left="720"/>
+        <w:rPr>
+          <w:color w:val="EE0000"/>
+        </w:rPr>
+      </w:pPr>
+    </w:p>
+    <w:p>
+      <w:pPr>
         <w:pStyle w:val="ListParagraph"/>
         <w:numPr>
           <w:ilvl w:val="0"/>
@@ -21144,6 +21298,7 @@
           <w:color w:val="EE0000"/>
           <w:lang w:val="en-GB"/>
         </w:rPr>
+        <w:lastRenderedPageBreak/>
         <w:t>Migration script #</w:t>
       </w:r>
       <w:r>
@@ -21332,7 +21487,6 @@
           <w:color w:val="EE0000"/>
           <w:lang w:val="en-GB"/>
         </w:rPr>
-        <w:lastRenderedPageBreak/>
         <w:t>Migration script #</w:t>
       </w:r>
       <w:r>
@@ -21704,6 +21858,242 @@
     </w:p>
     <w:p>
       <w:pPr>
+        <w:pStyle w:val="ListParagraph"/>
+        <w:numPr>
+          <w:ilvl w:val="0"/>
+          <w:numId w:val="3"/>
+        </w:numPr>
+        <w:spacing w:after="0"/>
+        <w:rPr>
+          <w:b/>
+          <w:bCs/>
+          <w:color w:val="EE0000"/>
+          <w:lang w:val="en-GB"/>
+        </w:rPr>
+      </w:pPr>
+      <w:r>
+        <w:rPr>
+          <w:b/>
+          <w:bCs/>
+          <w:color w:val="EE0000"/>
+          <w:lang w:val="en-GB"/>
+        </w:rPr>
+        <w:t>Migration script #</w:t>
+      </w:r>
+      <w:r>
+        <w:rPr>
+          <w:b/>
+          <w:bCs/>
+          <w:color w:val="EE0000"/>
+          <w:lang w:val="en-GB"/>
+        </w:rPr>
+        <w:t>5</w:t>
+      </w:r>
+      <w:r>
+        <w:rPr>
+          <w:b/>
+          <w:bCs/>
+          <w:color w:val="EE0000"/>
+          <w:lang w:val="en-GB"/>
+        </w:rPr>
+        <w:t>8</w:t>
+      </w:r>
+    </w:p>
+    <w:p>
+      <w:pPr>
+        <w:spacing w:after="0"/>
+        <w:ind w:left="720"/>
+        <w:rPr>
+          <w:lang w:val="en-GB"/>
+        </w:rPr>
+      </w:pPr>
+      <w:r>
+        <w:rPr>
+          <w:b/>
+          <w:bCs/>
+          <w:lang w:val="en-GB"/>
+        </w:rPr>
+        <w:t>Description:</w:t>
+      </w:r>
+      <w:r>
+        <w:rPr>
+          <w:lang w:val="en-GB"/>
+        </w:rPr>
+        <w:t xml:space="preserve"> Create SQL migration script from “</w:t>
+      </w:r>
+      <w:r>
+        <w:rPr>
+          <w:lang w:val="en-GB"/>
+        </w:rPr>
+        <w:t>AddSubstituteLeaveRequest</w:t>
+      </w:r>
+      <w:r>
+        <w:rPr>
+          <w:lang w:val="en-GB"/>
+        </w:rPr>
+        <w:t>” to  “</w:t>
+      </w:r>
+      <w:r>
+        <w:rPr>
+          <w:lang w:val="en-GB"/>
+        </w:rPr>
+        <w:t>AddQualificationStateName</w:t>
+      </w:r>
+      <w:r>
+        <w:rPr>
+          <w:lang w:val="en-GB"/>
+        </w:rPr>
+        <w:t>”</w:t>
+      </w:r>
+    </w:p>
+    <w:p>
+      <w:pPr>
+        <w:spacing w:after="0"/>
+        <w:ind w:left="720"/>
+        <w:rPr>
+          <w:b/>
+          <w:bCs/>
+        </w:rPr>
+      </w:pPr>
+      <w:r>
+        <w:rPr>
+          <w:b/>
+          <w:bCs/>
+        </w:rPr>
+        <w:t>PMC script:</w:t>
+      </w:r>
+    </w:p>
+    <w:p>
+      <w:pPr>
+        <w:spacing w:after="0"/>
+        <w:ind w:left="720"/>
+        <w:rPr>
+          <w:lang w:val="en-GB"/>
+        </w:rPr>
+      </w:pPr>
+      <w:r>
+        <w:t xml:space="preserve">Script-Migration -From </w:t>
+      </w:r>
+      <w:r>
+        <w:rPr>
+          <w:lang w:val="en-GB"/>
+        </w:rPr>
+        <w:t>AddSubstituteLeaveRequest</w:t>
+      </w:r>
+      <w:r>
+        <w:t xml:space="preserve"> </w:t>
+      </w:r>
+      <w:r>
+        <w:t xml:space="preserve">-To </w:t>
+      </w:r>
+      <w:r>
+        <w:rPr>
+          <w:lang w:val="en-GB"/>
+        </w:rPr>
+        <w:t>AddQualificationStateName</w:t>
+      </w:r>
+      <w:r>
+        <w:rPr>
+          <w:lang w:val="en-GB"/>
+        </w:rPr>
+        <w:t xml:space="preserve"> </w:t>
+      </w:r>
+      <w:r>
+        <w:rPr>
+          <w:lang w:val="en-GB"/>
+        </w:rPr>
+        <w:t>-Context AppDbContext</w:t>
+      </w:r>
+      <w:r>
+        <w:t xml:space="preserve"> -Output </w:t>
+      </w:r>
+      <w:r>
+        <w:rPr>
+          <w:lang w:val="en-GB"/>
+        </w:rPr>
+        <w:t>".\MigrationScripts\</w:t>
+      </w:r>
+      <w:r>
+        <w:rPr>
+          <w:lang w:val="en-GB"/>
+        </w:rPr>
+        <w:t>AddQualificationStateName</w:t>
+      </w:r>
+      <w:r>
+        <w:rPr>
+          <w:lang w:val="en-GB"/>
+        </w:rPr>
+        <w:t>.sql"</w:t>
+      </w:r>
+    </w:p>
+    <w:p>
+      <w:pPr>
+        <w:spacing w:after="0"/>
+        <w:ind w:left="720"/>
+        <w:rPr>
+          <w:color w:val="00B050"/>
+        </w:rPr>
+      </w:pPr>
+      <w:r>
+        <w:rPr>
+          <w:lang w:val="en-GB"/>
+        </w:rPr>
+        <w:t>Status:</w:t>
+      </w:r>
+      <w:r>
+        <w:rPr>
+          <w:b/>
+          <w:bCs/>
+          <w:color w:val="00B050"/>
+          <w:lang w:val="en-GB"/>
+        </w:rPr>
+        <w:t xml:space="preserve"> </w:t>
+      </w:r>
+      <w:r>
+        <w:rPr>
+          <w:color w:val="00B050"/>
+        </w:rPr>
+        <w:t>Completed</w:t>
+      </w:r>
+      <w:r>
+        <w:rPr>
+          <w:color w:val="00B050"/>
+        </w:rPr>
+        <w:t xml:space="preserve"> on </w:t>
+      </w:r>
+      <w:r>
+        <w:rPr>
+          <w:color w:val="00B050"/>
+        </w:rPr>
+        <w:t>24</w:t>
+      </w:r>
+      <w:r>
+        <w:rPr>
+          <w:color w:val="00B050"/>
+        </w:rPr>
+        <w:t>-Jul-2026</w:t>
+      </w:r>
+    </w:p>
+    <w:p>
+      <w:pPr>
+        <w:spacing w:after="0"/>
+        <w:ind w:left="720"/>
+        <w:rPr>
+          <w:color w:val="00B050"/>
+        </w:rPr>
+      </w:pPr>
+    </w:p>
+    <w:p>
+      <w:pPr>
+        <w:spacing w:after="0"/>
+        <w:ind w:left="720"/>
+        <w:rPr>
+          <w:color w:val="00B050"/>
+        </w:rPr>
+      </w:pPr>
+    </w:p>
+    <w:p>
+      <w:pPr>
         <w:ind w:left="720"/>
         <w:rPr>
           <w:b/>
@@ -21734,6 +22124,7 @@
     </w:p>
     <w:p>
       <w:r>
+        <w:lastRenderedPageBreak/>
         <w:t>I have successfully executed 5 migrations for my data model and have updated the database. However, I need to execute the same number of migrations but to a different database. Tell me how to run the migrations to a new database in Entity Framework Core.</w:t>
       </w:r>
     </w:p>
@@ -23428,7 +23819,6 @@
   <w:style w:type="character" w:default="1" w:styleId="DefaultParagraphFont">
     <w:name w:val="Default Paragraph Font"/>
     <w:uiPriority w:val="1"/>
-    <w:semiHidden/>
     <w:unhideWhenUsed/>
   </w:style>
   <w:style w:type="table" w:default="1" w:styleId="TableNormal">

</xml_diff>

<commit_message>
Checked in changes to the Migration history document
</commit_message>
<xml_diff>
--- a/MigrationScripts/EF Core Migration History.docx
+++ b/MigrationScripts/EF Core Migration History.docx
@@ -10389,15 +10389,7 @@
           <w:bCs/>
           <w:color w:val="EE0000"/>
         </w:rPr>
-        <w:t>6</w:t>
-      </w:r>
-      <w:r>
-        <w:rPr>
-          <w:b/>
-          <w:bCs/>
-          <w:color w:val="EE0000"/>
-        </w:rPr>
-        <w:t>4</w:t>
+        <w:t>64</w:t>
       </w:r>
     </w:p>
     <w:p>
@@ -10493,7 +10485,25 @@
         <w:rPr>
           <w:color w:val="00B050"/>
         </w:rPr>
-        <w:t>Pending</w:t>
+        <w:t>Completed</w:t>
+      </w:r>
+      <w:r>
+        <w:rPr>
+          <w:color w:val="00B050"/>
+        </w:rPr>
+        <w:t xml:space="preserve"> on </w:t>
+      </w:r>
+      <w:r>
+        <w:rPr>
+          <w:color w:val="00B050"/>
+        </w:rPr>
+        <w:t>27</w:t>
+      </w:r>
+      <w:r>
+        <w:rPr>
+          <w:color w:val="00B050"/>
+        </w:rPr>
+        <w:t>-Jul-2026</w:t>
       </w:r>
     </w:p>
     <w:p>
@@ -21887,16 +21897,7 @@
           <w:color w:val="EE0000"/>
           <w:lang w:val="en-GB"/>
         </w:rPr>
-        <w:t>5</w:t>
-      </w:r>
-      <w:r>
-        <w:rPr>
-          <w:b/>
-          <w:bCs/>
-          <w:color w:val="EE0000"/>
-          <w:lang w:val="en-GB"/>
-        </w:rPr>
-        <w:t>8</w:t>
+        <w:t>58</w:t>
       </w:r>
     </w:p>
     <w:p>
@@ -21981,10 +21982,28 @@
         <w:t>AddSubstituteLeaveRequest</w:t>
       </w:r>
       <w:r>
-        <w:t xml:space="preserve"> </w:t>
-      </w:r>
-      <w:r>
-        <w:t xml:space="preserve">-To </w:t>
+        <w:t xml:space="preserve"> -To </w:t>
+      </w:r>
+      <w:r>
+        <w:rPr>
+          <w:lang w:val="en-GB"/>
+        </w:rPr>
+        <w:t xml:space="preserve">AddQualificationStateName </w:t>
+      </w:r>
+      <w:r>
+        <w:rPr>
+          <w:lang w:val="en-GB"/>
+        </w:rPr>
+        <w:t>-Context AppDbContext</w:t>
+      </w:r>
+      <w:r>
+        <w:t xml:space="preserve"> -Output </w:t>
+      </w:r>
+      <w:r>
+        <w:rPr>
+          <w:lang w:val="en-GB"/>
+        </w:rPr>
+        <w:t>".\MigrationScripts\</w:t>
       </w:r>
       <w:r>
         <w:rPr>
@@ -21996,33 +22015,6 @@
         <w:rPr>
           <w:lang w:val="en-GB"/>
         </w:rPr>
-        <w:t xml:space="preserve"> </w:t>
-      </w:r>
-      <w:r>
-        <w:rPr>
-          <w:lang w:val="en-GB"/>
-        </w:rPr>
-        <w:t>-Context AppDbContext</w:t>
-      </w:r>
-      <w:r>
-        <w:t xml:space="preserve"> -Output </w:t>
-      </w:r>
-      <w:r>
-        <w:rPr>
-          <w:lang w:val="en-GB"/>
-        </w:rPr>
-        <w:t>".\MigrationScripts\</w:t>
-      </w:r>
-      <w:r>
-        <w:rPr>
-          <w:lang w:val="en-GB"/>
-        </w:rPr>
-        <w:t>AddQualificationStateName</w:t>
-      </w:r>
-      <w:r>
-        <w:rPr>
-          <w:lang w:val="en-GB"/>
-        </w:rPr>
         <w:t>.sql"</w:t>
       </w:r>
     </w:p>
@@ -22059,19 +22051,7 @@
         <w:rPr>
           <w:color w:val="00B050"/>
         </w:rPr>
-        <w:t xml:space="preserve"> on </w:t>
-      </w:r>
-      <w:r>
-        <w:rPr>
-          <w:color w:val="00B050"/>
-        </w:rPr>
-        <w:t>24</w:t>
-      </w:r>
-      <w:r>
-        <w:rPr>
-          <w:color w:val="00B050"/>
-        </w:rPr>
-        <w:t>-Jul-2026</w:t>
+        <w:t xml:space="preserve"> on 24-Jul-2026</w:t>
       </w:r>
     </w:p>
     <w:p>
@@ -23819,6 +23799,7 @@
   <w:style w:type="character" w:default="1" w:styleId="DefaultParagraphFont">
     <w:name w:val="Default Paragraph Font"/>
     <w:uiPriority w:val="1"/>
+    <w:semiHidden/>
     <w:unhideWhenUsed/>
   </w:style>
   <w:style w:type="table" w:default="1" w:styleId="TableNormal">

</xml_diff>

<commit_message>
Completed the layout of Family Member expansion panel
</commit_message>
<xml_diff>
--- a/MigrationScripts/EF Core Migration History.docx
+++ b/MigrationScripts/EF Core Migration History.docx
@@ -1,6 +1,6 @@
 
 <file path=word/document.xml><?xml version="1.0" encoding="utf-8"?>
-<w:document xmlns:wpc="http://schemas.microsoft.com/office/word/2010/wordprocessingCanvas" xmlns:cx="http://schemas.microsoft.com/office/drawing/2014/chartex" xmlns:cx1="http://schemas.microsoft.com/office/drawing/2015/9/8/chartex" xmlns:cx2="http://schemas.microsoft.com/office/drawing/2015/10/21/chartex" xmlns:cx3="http://schemas.microsoft.com/office/drawing/2016/5/9/chartex" xmlns:cx4="http://schemas.microsoft.com/office/drawing/2016/5/10/chartex" xmlns:cx5="http://schemas.microsoft.com/office/drawing/2016/5/11/chartex" xmlns:cx6="http://schemas.microsoft.com/office/drawing/2016/5/12/chartex" xmlns:cx7="http://schemas.microsoft.com/office/drawing/2016/5/13/chartex" xmlns:cx8="http://schemas.microsoft.com/office/drawing/2016/5/14/chartex" xmlns:mc="http://schemas.openxmlformats.org/markup-compatibility/2006" xmlns:aink="http://schemas.microsoft.com/office/drawing/2016/ink" xmlns:am3d="http://schemas.microsoft.com/office/drawing/2017/model3d" xmlns:o="urn:schemas-microsoft-com:office:office" xmlns:oel="http://schemas.microsoft.com/office/2019/extlst" xmlns:r="http://schemas.openxmlformats.org/officeDocument/2006/relationships" xmlns:m="http://schemas.openxmlformats.org/officeDocument/2006/math" xmlns:v="urn:schemas-microsoft-com:vml" xmlns:wp14="http://schemas.microsoft.com/office/word/2010/wordprocessingDrawing" xmlns:wp="http://schemas.openxmlformats.org/drawingml/2006/wordprocessingDrawing" xmlns:w10="urn:schemas-microsoft-com:office:word" xmlns:w="http://schemas.openxmlformats.org/wordprocessingml/2006/main" xmlns:w14="http://schemas.microsoft.com/office/word/2010/wordml" xmlns:w15="http://schemas.microsoft.com/office/word/2012/wordml" xmlns:w16cex="http://schemas.microsoft.com/office/word/2018/wordml/cex" xmlns:w16cid="http://schemas.microsoft.com/office/word/2016/wordml/cid" xmlns:w16="http://schemas.microsoft.com/office/word/2018/wordml" xmlns:w16du="http://schemas.microsoft.com/office/word/2023/wordml/word16du" xmlns:w16sdtdh="http://schemas.microsoft.com/office/word/2020/wordml/sdtdatahash" xmlns:w16sdtfl="http://schemas.microsoft.com/office/word/2024/wordml/sdtformatlock" xmlns:w16se="http://schemas.microsoft.com/office/word/2015/wordml/symex" xmlns:wpg="http://schemas.microsoft.com/office/word/2010/wordprocessingGroup" xmlns:wpi="http://schemas.microsoft.com/office/word/2010/wordprocessingInk" xmlns:wne="http://schemas.microsoft.com/office/word/2006/wordml" xmlns:wps="http://schemas.microsoft.com/office/word/2010/wordprocessingShape" mc:Ignorable="w14 w15 w16se w16cid w16 w16cex w16sdtdh w16sdtfl w16du wp14">
+<w:document xmlns:wpc="http://schemas.microsoft.com/office/word/2010/wordprocessingCanvas" xmlns:cx="http://schemas.microsoft.com/office/drawing/2014/chartex" xmlns:cx1="http://schemas.microsoft.com/office/drawing/2015/9/8/chartex" xmlns:cx2="http://schemas.microsoft.com/office/drawing/2015/10/21/chartex" xmlns:cx3="http://schemas.microsoft.com/office/drawing/2016/5/9/chartex" xmlns:cx4="http://schemas.microsoft.com/office/drawing/2016/5/10/chartex" xmlns:cx5="http://schemas.microsoft.com/office/drawing/2016/5/11/chartex" xmlns:cx6="http://schemas.microsoft.com/office/drawing/2016/5/12/chartex" xmlns:cx7="http://schemas.microsoft.com/office/drawing/2016/5/13/chartex" xmlns:cx8="http://schemas.microsoft.com/office/drawing/2016/5/14/chartex" xmlns:mc="http://schemas.openxmlformats.org/markup-compatibility/2006" xmlns:aink="http://schemas.microsoft.com/office/drawing/2016/ink" xmlns:am3d="http://schemas.microsoft.com/office/drawing/2017/model3d" xmlns:o="urn:schemas-microsoft-com:office:office" xmlns:oel="http://schemas.microsoft.com/office/2019/extlst" xmlns:r="http://schemas.openxmlformats.org/officeDocument/2006/relationships" xmlns:m="http://schemas.openxmlformats.org/officeDocument/2006/math" xmlns:v="urn:schemas-microsoft-com:vml" xmlns:wp14="http://schemas.microsoft.com/office/word/2010/wordprocessingDrawing" xmlns:wp="http://schemas.openxmlformats.org/drawingml/2006/wordprocessingDrawing" xmlns:w10="urn:schemas-microsoft-com:office:word" xmlns:w="http://schemas.openxmlformats.org/wordprocessingml/2006/main" xmlns:w14="http://schemas.microsoft.com/office/word/2010/wordml" xmlns:w15="http://schemas.microsoft.com/office/word/2012/wordml" xmlns:w16cei="http://schemas.microsoft.com/office/word/2026/wordml/cei" xmlns:w16cex="http://schemas.microsoft.com/office/word/2018/wordml/cex" xmlns:w16cid="http://schemas.microsoft.com/office/word/2016/wordml/cid" xmlns:w16="http://schemas.microsoft.com/office/word/2018/wordml" xmlns:w16du="http://schemas.microsoft.com/office/word/2023/wordml/word16du" xmlns:w16sdtdh="http://schemas.microsoft.com/office/word/2020/wordml/sdtdatahash" xmlns:w16sdtfl="http://schemas.microsoft.com/office/word/2024/wordml/sdtformatlock" xmlns:w16se="http://schemas.microsoft.com/office/word/2015/wordml/symex" xmlns:wpg="http://schemas.microsoft.com/office/word/2010/wordprocessingGroup" xmlns:wpi="http://schemas.microsoft.com/office/word/2010/wordprocessingInk" xmlns:wne="http://schemas.microsoft.com/office/word/2006/wordml" xmlns:wps="http://schemas.microsoft.com/office/word/2010/wordprocessingShape" mc:Ignorable="w14 w15 w16se w16cid w16 w16cex w16sdtdh w16sdtfl w16du wp14">
   <w:body>
     <w:p>
       <w:pPr>
@@ -10473,6 +10473,9 @@
       <w:pPr>
         <w:spacing w:after="0"/>
         <w:ind w:left="1080"/>
+        <w:rPr>
+          <w:color w:val="00B050"/>
+        </w:rPr>
       </w:pPr>
       <w:r>
         <w:lastRenderedPageBreak/>
@@ -10491,20 +10494,157 @@
         <w:rPr>
           <w:color w:val="00B050"/>
         </w:rPr>
-        <w:t xml:space="preserve"> on </w:t>
-      </w:r>
-      <w:r>
-        <w:rPr>
-          <w:color w:val="00B050"/>
-        </w:rPr>
-        <w:t>27</w:t>
-      </w:r>
-      <w:r>
-        <w:rPr>
-          <w:color w:val="00B050"/>
-        </w:rPr>
-        <w:t>-Jul-2026</w:t>
-      </w:r>
+        <w:t xml:space="preserve"> on 27-Jul-2026</w:t>
+      </w:r>
+    </w:p>
+    <w:p>
+      <w:pPr>
+        <w:spacing w:after="0"/>
+        <w:ind w:left="1080"/>
+        <w:rPr>
+          <w:color w:val="00B050"/>
+        </w:rPr>
+      </w:pPr>
+    </w:p>
+    <w:p>
+      <w:pPr>
+        <w:pStyle w:val="ListParagraph"/>
+        <w:numPr>
+          <w:ilvl w:val="0"/>
+          <w:numId w:val="6"/>
+        </w:numPr>
+        <w:spacing w:after="0"/>
+        <w:rPr>
+          <w:b/>
+          <w:bCs/>
+          <w:color w:val="EE0000"/>
+        </w:rPr>
+      </w:pPr>
+      <w:r>
+        <w:rPr>
+          <w:b/>
+          <w:bCs/>
+          <w:color w:val="EE0000"/>
+        </w:rPr>
+        <w:t>Data Migration PMC Command #</w:t>
+      </w:r>
+      <w:r>
+        <w:rPr>
+          <w:b/>
+          <w:bCs/>
+          <w:color w:val="EE0000"/>
+        </w:rPr>
+        <w:t>6</w:t>
+      </w:r>
+      <w:r>
+        <w:rPr>
+          <w:b/>
+          <w:bCs/>
+          <w:color w:val="EE0000"/>
+        </w:rPr>
+        <w:t>5</w:t>
+      </w:r>
+    </w:p>
+    <w:p>
+      <w:pPr>
+        <w:spacing w:after="0"/>
+        <w:ind w:left="1080"/>
+      </w:pPr>
+      <w:r>
+        <w:t>Add-Migration</w:t>
+      </w:r>
+      <w:r>
+        <w:t xml:space="preserve"> </w:t>
+      </w:r>
+      <w:r>
+        <w:rPr>
+          <w:lang w:val="en-GB"/>
+        </w:rPr>
+        <w:t>Add</w:t>
+      </w:r>
+      <w:r>
+        <w:rPr>
+          <w:lang w:val="en-GB"/>
+        </w:rPr>
+        <w:t>FamilyMember</w:t>
+      </w:r>
+      <w:r>
+        <w:rPr>
+          <w:lang w:val="en-GB"/>
+        </w:rPr>
+        <w:t xml:space="preserve">StateName </w:t>
+      </w:r>
+      <w:r>
+        <w:t xml:space="preserve">-Context AppDbContext </w:t>
+      </w:r>
+      <w:r>
+        <w:t>-Project KenHRApp.Infrastructure -StartupProject KenHRApp.Web -Verbose</w:t>
+      </w:r>
+    </w:p>
+    <w:p>
+      <w:pPr>
+        <w:spacing w:after="0"/>
+        <w:ind w:left="1080"/>
+      </w:pPr>
+    </w:p>
+    <w:p>
+      <w:pPr>
+        <w:spacing w:after="0"/>
+        <w:ind w:left="1080"/>
+      </w:pPr>
+      <w:r>
+        <w:t xml:space="preserve">Update-Database </w:t>
+      </w:r>
+      <w:r>
+        <w:t>-Context AppDbContext</w:t>
+      </w:r>
+    </w:p>
+    <w:p>
+      <w:pPr>
+        <w:spacing w:after="0"/>
+        <w:ind w:left="1080"/>
+        <w:rPr>
+          <w:u w:val="single"/>
+        </w:rPr>
+      </w:pPr>
+      <w:r>
+        <w:rPr>
+          <w:b/>
+          <w:bCs/>
+          <w:u w:val="single"/>
+        </w:rPr>
+        <w:t>Status:</w:t>
+      </w:r>
+      <w:r>
+        <w:rPr>
+          <w:u w:val="single"/>
+        </w:rPr>
+        <w:t xml:space="preserve"> </w:t>
+      </w:r>
+    </w:p>
+    <w:p>
+      <w:pPr>
+        <w:spacing w:after="0"/>
+        <w:ind w:left="1080"/>
+      </w:pPr>
+      <w:r>
+        <w:t>Development Database:</w:t>
+      </w:r>
+      <w:r>
+        <w:t xml:space="preserve"> </w:t>
+      </w:r>
+      <w:r>
+        <w:rPr>
+          <w:color w:val="00B050"/>
+        </w:rPr>
+        <w:t>Pending</w:t>
+      </w:r>
+    </w:p>
+    <w:p>
+      <w:pPr>
+        <w:spacing w:after="0"/>
+        <w:ind w:left="1080"/>
+      </w:pPr>
     </w:p>
     <w:p>
       <w:pPr>
@@ -10777,6 +10917,7 @@
         <w:rPr>
           <w:lang w:val="en-GB"/>
         </w:rPr>
+        <w:lastRenderedPageBreak/>
         <w:t>S</w:t>
       </w:r>
       <w:r>
@@ -10905,7 +11046,6 @@
         </w:rPr>
       </w:pPr>
       <w:r>
-        <w:lastRenderedPageBreak/>
         <w:t xml:space="preserve">Script-Migration -From </w:t>
       </w:r>
       <w:r>
@@ -11373,6 +11513,7 @@
           <w:bCs/>
           <w:lang w:val="en-GB"/>
         </w:rPr>
+        <w:lastRenderedPageBreak/>
         <w:t>Description:</w:t>
       </w:r>
       <w:r>
@@ -11526,7 +11667,6 @@
           <w:color w:val="EE0000"/>
           <w:lang w:val="en-GB"/>
         </w:rPr>
-        <w:lastRenderedPageBreak/>
         <w:t>Migration script #</w:t>
       </w:r>
       <w:r>
@@ -12006,6 +12146,7 @@
         </w:rPr>
       </w:pPr>
       <w:r>
+        <w:lastRenderedPageBreak/>
         <w:t xml:space="preserve">Script-Migration -From </w:t>
       </w:r>
       <w:r>
@@ -12177,7 +12318,6 @@
           <w:b/>
           <w:bCs/>
         </w:rPr>
-        <w:lastRenderedPageBreak/>
         <w:t>PMC script:</w:t>
       </w:r>
     </w:p>
@@ -12664,6 +12804,7 @@
           <w:bCs/>
           <w:lang w:val="en-GB"/>
         </w:rPr>
+        <w:lastRenderedPageBreak/>
         <w:t>Description:</w:t>
       </w:r>
       <w:r>
@@ -12807,7 +12948,6 @@
           <w:color w:val="EE0000"/>
           <w:lang w:val="en-GB"/>
         </w:rPr>
-        <w:lastRenderedPageBreak/>
         <w:t>Migration script #</w:t>
       </w:r>
       <w:r>
@@ -13352,6 +13492,7 @@
           <w:bCs/>
           <w:lang w:val="en-GB"/>
         </w:rPr>
+        <w:lastRenderedPageBreak/>
         <w:t>Description:</w:t>
       </w:r>
       <w:r>
@@ -14033,6 +14174,7 @@
           <w:color w:val="00B050"/>
           <w:lang w:val="en-GB"/>
         </w:rPr>
+        <w:lastRenderedPageBreak/>
         <w:t xml:space="preserve">Status: </w:t>
       </w:r>
       <w:r>
@@ -14148,7 +14290,6 @@
         </w:rPr>
       </w:pPr>
       <w:r>
-        <w:lastRenderedPageBreak/>
         <w:t xml:space="preserve">Script-Migration -From </w:t>
       </w:r>
       <w:r>
@@ -14662,6 +14803,7 @@
           <w:bCs/>
           <w:lang w:val="en-GB"/>
         </w:rPr>
+        <w:lastRenderedPageBreak/>
         <w:t>Description:</w:t>
       </w:r>
       <w:r>
@@ -14853,7 +14995,6 @@
           <w:color w:val="EE0000"/>
           <w:lang w:val="en-GB"/>
         </w:rPr>
-        <w:lastRenderedPageBreak/>
         <w:t>Migration script #</w:t>
       </w:r>
       <w:r>
@@ -15408,6 +15549,7 @@
           <w:color w:val="EE0000"/>
           <w:lang w:val="en-GB"/>
         </w:rPr>
+        <w:lastRenderedPageBreak/>
         <w:t>Migration script #</w:t>
       </w:r>
       <w:r>
@@ -15555,7 +15697,6 @@
         <w:rPr>
           <w:lang w:val="en-GB"/>
         </w:rPr>
-        <w:lastRenderedPageBreak/>
         <w:t>Status:</w:t>
       </w:r>
       <w:r>
@@ -16080,6 +16221,7 @@
         </w:rPr>
       </w:pPr>
       <w:r>
+        <w:lastRenderedPageBreak/>
         <w:t xml:space="preserve">Script-Migration -From </w:t>
       </w:r>
       <w:r>
@@ -16266,7 +16408,6 @@
           <w:b/>
           <w:bCs/>
         </w:rPr>
-        <w:lastRenderedPageBreak/>
         <w:t>PMC script:</w:t>
       </w:r>
     </w:p>
@@ -16843,6 +16984,7 @@
           <w:b/>
           <w:bCs/>
         </w:rPr>
+        <w:lastRenderedPageBreak/>
         <w:t>PMC script:</w:t>
       </w:r>
     </w:p>
@@ -17032,7 +17174,6 @@
           <w:b/>
           <w:bCs/>
         </w:rPr>
-        <w:lastRenderedPageBreak/>
         <w:t>PMC script:</w:t>
       </w:r>
     </w:p>
@@ -17621,6 +17762,7 @@
           <w:b/>
           <w:bCs/>
         </w:rPr>
+        <w:lastRenderedPageBreak/>
         <w:t>PMC script:</w:t>
       </w:r>
     </w:p>
@@ -17801,7 +17943,6 @@
           <w:b/>
           <w:bCs/>
         </w:rPr>
-        <w:lastRenderedPageBreak/>
         <w:t>PMC script:</w:t>
       </w:r>
     </w:p>
@@ -18390,6 +18531,7 @@
         </w:rPr>
       </w:pPr>
       <w:r>
+        <w:lastRenderedPageBreak/>
         <w:t xml:space="preserve">Script-Migration -From </w:t>
       </w:r>
       <w:r>
@@ -18581,7 +18723,6 @@
         </w:rPr>
       </w:pPr>
       <w:r>
-        <w:lastRenderedPageBreak/>
         <w:t xml:space="preserve">Script-Migration -From </w:t>
       </w:r>
       <w:r>
@@ -19356,6 +19497,7 @@
           <w:bCs/>
           <w:lang w:val="en-GB"/>
         </w:rPr>
+        <w:lastRenderedPageBreak/>
         <w:t>Description:</w:t>
       </w:r>
       <w:r>
@@ -19562,7 +19704,6 @@
           <w:bCs/>
           <w:lang w:val="en-GB"/>
         </w:rPr>
-        <w:lastRenderedPageBreak/>
         <w:t>Description:</w:t>
       </w:r>
       <w:r>
@@ -20222,6 +20363,7 @@
         </w:rPr>
       </w:pPr>
       <w:r>
+        <w:lastRenderedPageBreak/>
         <w:t xml:space="preserve">Script-Migration -From </w:t>
       </w:r>
       <w:r>
@@ -20476,7 +20618,6 @@
         <w:rPr>
           <w:lang w:val="en-GB"/>
         </w:rPr>
-        <w:lastRenderedPageBreak/>
         <w:t>Status:</w:t>
       </w:r>
       <w:r>
@@ -21102,6 +21243,7 @@
           <w:color w:val="EE0000"/>
           <w:lang w:val="en-GB"/>
         </w:rPr>
+        <w:lastRenderedPageBreak/>
         <w:t>Migration script #</w:t>
       </w:r>
       <w:r>
@@ -21308,7 +21450,6 @@
           <w:color w:val="EE0000"/>
           <w:lang w:val="en-GB"/>
         </w:rPr>
-        <w:lastRenderedPageBreak/>
         <w:t>Migration script #</w:t>
       </w:r>
       <w:r>
@@ -21868,6 +22009,24 @@
     </w:p>
     <w:p>
       <w:pPr>
+        <w:spacing w:after="0"/>
+        <w:ind w:left="720"/>
+        <w:rPr>
+          <w:color w:val="00B050"/>
+        </w:rPr>
+      </w:pPr>
+    </w:p>
+    <w:p>
+      <w:pPr>
+        <w:spacing w:after="0"/>
+        <w:ind w:left="720"/>
+        <w:rPr>
+          <w:color w:val="00B050"/>
+        </w:rPr>
+      </w:pPr>
+    </w:p>
+    <w:p>
+      <w:pPr>
         <w:pStyle w:val="ListParagraph"/>
         <w:numPr>
           <w:ilvl w:val="0"/>
@@ -21888,6 +22047,7 @@
           <w:color w:val="EE0000"/>
           <w:lang w:val="en-GB"/>
         </w:rPr>
+        <w:lastRenderedPageBreak/>
         <w:t>Migration script #</w:t>
       </w:r>
       <w:r>
@@ -22065,6 +22225,224 @@
     </w:p>
     <w:p>
       <w:pPr>
+        <w:pStyle w:val="ListParagraph"/>
+        <w:numPr>
+          <w:ilvl w:val="0"/>
+          <w:numId w:val="3"/>
+        </w:numPr>
+        <w:spacing w:after="0"/>
+        <w:rPr>
+          <w:b/>
+          <w:bCs/>
+          <w:color w:val="EE0000"/>
+          <w:lang w:val="en-GB"/>
+        </w:rPr>
+      </w:pPr>
+      <w:r>
+        <w:rPr>
+          <w:b/>
+          <w:bCs/>
+          <w:color w:val="EE0000"/>
+          <w:lang w:val="en-GB"/>
+        </w:rPr>
+        <w:t>Migration script #</w:t>
+      </w:r>
+      <w:r>
+        <w:rPr>
+          <w:b/>
+          <w:bCs/>
+          <w:color w:val="EE0000"/>
+          <w:lang w:val="en-GB"/>
+        </w:rPr>
+        <w:t>5</w:t>
+      </w:r>
+      <w:r>
+        <w:rPr>
+          <w:b/>
+          <w:bCs/>
+          <w:color w:val="EE0000"/>
+          <w:lang w:val="en-GB"/>
+        </w:rPr>
+        <w:t>9</w:t>
+      </w:r>
+    </w:p>
+    <w:p>
+      <w:pPr>
+        <w:spacing w:after="0"/>
+        <w:ind w:left="720"/>
+        <w:rPr>
+          <w:lang w:val="en-GB"/>
+        </w:rPr>
+      </w:pPr>
+      <w:r>
+        <w:rPr>
+          <w:b/>
+          <w:bCs/>
+          <w:lang w:val="en-GB"/>
+        </w:rPr>
+        <w:t>Description:</w:t>
+      </w:r>
+      <w:r>
+        <w:rPr>
+          <w:lang w:val="en-GB"/>
+        </w:rPr>
+        <w:t xml:space="preserve"> Create SQL migration script from “</w:t>
+      </w:r>
+      <w:r>
+        <w:rPr>
+          <w:lang w:val="en-GB"/>
+        </w:rPr>
+        <w:t>AddQualificationStateName</w:t>
+      </w:r>
+      <w:r>
+        <w:rPr>
+          <w:lang w:val="en-GB"/>
+        </w:rPr>
+        <w:t>” to  “</w:t>
+      </w:r>
+      <w:r>
+        <w:rPr>
+          <w:lang w:val="en-GB"/>
+        </w:rPr>
+        <w:t>AddQualificationStateName</w:t>
+      </w:r>
+      <w:r>
+        <w:rPr>
+          <w:lang w:val="en-GB"/>
+        </w:rPr>
+        <w:t>”</w:t>
+      </w:r>
+    </w:p>
+    <w:p>
+      <w:pPr>
+        <w:spacing w:after="0"/>
+        <w:ind w:left="720"/>
+        <w:rPr>
+          <w:b/>
+          <w:bCs/>
+        </w:rPr>
+      </w:pPr>
+      <w:r>
+        <w:rPr>
+          <w:b/>
+          <w:bCs/>
+        </w:rPr>
+        <w:t>PMC script:</w:t>
+      </w:r>
+    </w:p>
+    <w:p>
+      <w:pPr>
+        <w:spacing w:after="0"/>
+        <w:ind w:left="720"/>
+        <w:rPr>
+          <w:lang w:val="en-GB"/>
+        </w:rPr>
+      </w:pPr>
+      <w:r>
+        <w:t xml:space="preserve">Script-Migration -From </w:t>
+      </w:r>
+      <w:r>
+        <w:rPr>
+          <w:lang w:val="en-GB"/>
+        </w:rPr>
+        <w:t>AddQualificationStateName</w:t>
+      </w:r>
+      <w:r>
+        <w:t xml:space="preserve"> </w:t>
+      </w:r>
+      <w:r>
+        <w:t xml:space="preserve">-To </w:t>
+      </w:r>
+      <w:r>
+        <w:rPr>
+          <w:lang w:val="en-GB"/>
+        </w:rPr>
+        <w:t>AddFamilyMemberStateName</w:t>
+      </w:r>
+      <w:r>
+        <w:rPr>
+          <w:lang w:val="en-GB"/>
+        </w:rPr>
+        <w:t xml:space="preserve"> </w:t>
+      </w:r>
+      <w:r>
+        <w:rPr>
+          <w:lang w:val="en-GB"/>
+        </w:rPr>
+        <w:t>-Context AppDbContext</w:t>
+      </w:r>
+      <w:r>
+        <w:t xml:space="preserve"> -Output </w:t>
+      </w:r>
+      <w:r>
+        <w:rPr>
+          <w:lang w:val="en-GB"/>
+        </w:rPr>
+        <w:t>".\MigrationScripts\</w:t>
+      </w:r>
+      <w:r>
+        <w:rPr>
+          <w:lang w:val="en-GB"/>
+        </w:rPr>
+        <w:t>AddFamilyMemberStateName</w:t>
+      </w:r>
+      <w:r>
+        <w:rPr>
+          <w:lang w:val="en-GB"/>
+        </w:rPr>
+        <w:t>.sql"</w:t>
+      </w:r>
+    </w:p>
+    <w:p>
+      <w:pPr>
+        <w:spacing w:after="0"/>
+        <w:ind w:left="720"/>
+        <w:rPr>
+          <w:color w:val="00B050"/>
+        </w:rPr>
+      </w:pPr>
+      <w:r>
+        <w:rPr>
+          <w:lang w:val="en-GB"/>
+        </w:rPr>
+        <w:t>Status:</w:t>
+      </w:r>
+      <w:r>
+        <w:rPr>
+          <w:b/>
+          <w:bCs/>
+          <w:color w:val="00B050"/>
+          <w:lang w:val="en-GB"/>
+        </w:rPr>
+        <w:t xml:space="preserve"> </w:t>
+      </w:r>
+      <w:r>
+        <w:rPr>
+          <w:color w:val="00B050"/>
+        </w:rPr>
+        <w:t>Completed</w:t>
+      </w:r>
+      <w:r>
+        <w:rPr>
+          <w:color w:val="00B050"/>
+        </w:rPr>
+        <w:t xml:space="preserve"> on 2</w:t>
+      </w:r>
+      <w:r>
+        <w:rPr>
+          <w:color w:val="00B050"/>
+        </w:rPr>
+        <w:t>8</w:t>
+      </w:r>
+      <w:r>
+        <w:rPr>
+          <w:color w:val="00B050"/>
+        </w:rPr>
+        <w:t>-Jul-2026</w:t>
+      </w:r>
+    </w:p>
+    <w:p>
+      <w:pPr>
         <w:spacing w:after="0"/>
         <w:ind w:left="720"/>
         <w:rPr>
@@ -22104,7 +22482,6 @@
     </w:p>
     <w:p>
       <w:r>
-        <w:lastRenderedPageBreak/>
         <w:t>I have successfully executed 5 migrations for my data model and have updated the database. However, I need to execute the same number of migrations but to a different database. Tell me how to run the migrations to a new database in Entity Framework Core.</w:t>
       </w:r>
     </w:p>
@@ -22172,7 +22549,7 @@
 </file>
 
 <file path=word/numbering.xml><?xml version="1.0" encoding="utf-8"?>
-<w:numbering xmlns:wpc="http://schemas.microsoft.com/office/word/2010/wordprocessingCanvas" xmlns:cx="http://schemas.microsoft.com/office/drawing/2014/chartex" xmlns:cx1="http://schemas.microsoft.com/office/drawing/2015/9/8/chartex" xmlns:cx2="http://schemas.microsoft.com/office/drawing/2015/10/21/chartex" xmlns:cx3="http://schemas.microsoft.com/office/drawing/2016/5/9/chartex" xmlns:cx4="http://schemas.microsoft.com/office/drawing/2016/5/10/chartex" xmlns:cx5="http://schemas.microsoft.com/office/drawing/2016/5/11/chartex" xmlns:cx6="http://schemas.microsoft.com/office/drawing/2016/5/12/chartex" xmlns:cx7="http://schemas.microsoft.com/office/drawing/2016/5/13/chartex" xmlns:cx8="http://schemas.microsoft.com/office/drawing/2016/5/14/chartex" xmlns:mc="http://schemas.openxmlformats.org/markup-compatibility/2006" xmlns:aink="http://schemas.microsoft.com/office/drawing/2016/ink" xmlns:am3d="http://schemas.microsoft.com/office/drawing/2017/model3d" xmlns:o="urn:schemas-microsoft-com:office:office" xmlns:oel="http://schemas.microsoft.com/office/2019/extlst" xmlns:r="http://schemas.openxmlformats.org/officeDocument/2006/relationships" xmlns:m="http://schemas.openxmlformats.org/officeDocument/2006/math" xmlns:v="urn:schemas-microsoft-com:vml" xmlns:wp14="http://schemas.microsoft.com/office/word/2010/wordprocessingDrawing" xmlns:wp="http://schemas.openxmlformats.org/drawingml/2006/wordprocessingDrawing" xmlns:w10="urn:schemas-microsoft-com:office:word" xmlns:w="http://schemas.openxmlformats.org/wordprocessingml/2006/main" xmlns:w14="http://schemas.microsoft.com/office/word/2010/wordml" xmlns:w15="http://schemas.microsoft.com/office/word/2012/wordml" xmlns:w16cex="http://schemas.microsoft.com/office/word/2018/wordml/cex" xmlns:w16cid="http://schemas.microsoft.com/office/word/2016/wordml/cid" xmlns:w16="http://schemas.microsoft.com/office/word/2018/wordml" xmlns:w16du="http://schemas.microsoft.com/office/word/2023/wordml/word16du" xmlns:w16sdtdh="http://schemas.microsoft.com/office/word/2020/wordml/sdtdatahash" xmlns:w16sdtfl="http://schemas.microsoft.com/office/word/2024/wordml/sdtformatlock" xmlns:w16se="http://schemas.microsoft.com/office/word/2015/wordml/symex" xmlns:wpg="http://schemas.microsoft.com/office/word/2010/wordprocessingGroup" xmlns:wpi="http://schemas.microsoft.com/office/word/2010/wordprocessingInk" xmlns:wne="http://schemas.microsoft.com/office/word/2006/wordml" xmlns:wps="http://schemas.microsoft.com/office/word/2010/wordprocessingShape" mc:Ignorable="w14 w15 w16se w16cid w16 w16cex w16sdtdh w16sdtfl w16du wp14">
+<w:numbering xmlns:wpc="http://schemas.microsoft.com/office/word/2010/wordprocessingCanvas" xmlns:cx="http://schemas.microsoft.com/office/drawing/2014/chartex" xmlns:cx1="http://schemas.microsoft.com/office/drawing/2015/9/8/chartex" xmlns:cx2="http://schemas.microsoft.com/office/drawing/2015/10/21/chartex" xmlns:cx3="http://schemas.microsoft.com/office/drawing/2016/5/9/chartex" xmlns:cx4="http://schemas.microsoft.com/office/drawing/2016/5/10/chartex" xmlns:cx5="http://schemas.microsoft.com/office/drawing/2016/5/11/chartex" xmlns:cx6="http://schemas.microsoft.com/office/drawing/2016/5/12/chartex" xmlns:cx7="http://schemas.microsoft.com/office/drawing/2016/5/13/chartex" xmlns:cx8="http://schemas.microsoft.com/office/drawing/2016/5/14/chartex" xmlns:mc="http://schemas.openxmlformats.org/markup-compatibility/2006" xmlns:aink="http://schemas.microsoft.com/office/drawing/2016/ink" xmlns:am3d="http://schemas.microsoft.com/office/drawing/2017/model3d" xmlns:o="urn:schemas-microsoft-com:office:office" xmlns:oel="http://schemas.microsoft.com/office/2019/extlst" xmlns:r="http://schemas.openxmlformats.org/officeDocument/2006/relationships" xmlns:m="http://schemas.openxmlformats.org/officeDocument/2006/math" xmlns:v="urn:schemas-microsoft-com:vml" xmlns:wp14="http://schemas.microsoft.com/office/word/2010/wordprocessingDrawing" xmlns:wp="http://schemas.openxmlformats.org/drawingml/2006/wordprocessingDrawing" xmlns:w10="urn:schemas-microsoft-com:office:word" xmlns:w="http://schemas.openxmlformats.org/wordprocessingml/2006/main" xmlns:w14="http://schemas.microsoft.com/office/word/2010/wordml" xmlns:w15="http://schemas.microsoft.com/office/word/2012/wordml" xmlns:w16cei="http://schemas.microsoft.com/office/word/2026/wordml/cei" xmlns:w16cex="http://schemas.microsoft.com/office/word/2018/wordml/cex" xmlns:w16cid="http://schemas.microsoft.com/office/word/2016/wordml/cid" xmlns:w16="http://schemas.microsoft.com/office/word/2018/wordml" xmlns:w16du="http://schemas.microsoft.com/office/word/2023/wordml/word16du" xmlns:w16sdtdh="http://schemas.microsoft.com/office/word/2020/wordml/sdtdatahash" xmlns:w16sdtfl="http://schemas.microsoft.com/office/word/2024/wordml/sdtformatlock" xmlns:w16se="http://schemas.microsoft.com/office/word/2015/wordml/symex" xmlns:wpg="http://schemas.microsoft.com/office/word/2010/wordprocessingGroup" xmlns:wpi="http://schemas.microsoft.com/office/word/2010/wordprocessingInk" xmlns:wne="http://schemas.microsoft.com/office/word/2006/wordml" xmlns:wps="http://schemas.microsoft.com/office/word/2010/wordprocessingShape" mc:Ignorable="w14 w15 w16se w16cid w16 w16cex w16sdtdh w16sdtfl w16du wp14">
   <w:abstractNum w:abstractNumId="0" w15:restartNumberingAfterBreak="0">
     <w:nsid w:val="0F421635"/>
     <w:multiLevelType w:val="hybridMultilevel"/>
@@ -23799,7 +24176,6 @@
   <w:style w:type="character" w:default="1" w:styleId="DefaultParagraphFont">
     <w:name w:val="Default Paragraph Font"/>
     <w:uiPriority w:val="1"/>
-    <w:semiHidden/>
     <w:unhideWhenUsed/>
   </w:style>
   <w:style w:type="table" w:default="1" w:styleId="TableNormal">

</xml_diff>

<commit_message>
Implemented Overview Dashboard using Lovable AI tool
</commit_message>
<xml_diff>
--- a/MigrationScripts/EF Core Migration History.docx
+++ b/MigrationScripts/EF Core Migration History.docx
@@ -10638,31 +10638,7 @@
         <w:rPr>
           <w:color w:val="00B050"/>
         </w:rPr>
-        <w:t xml:space="preserve"> on </w:t>
-      </w:r>
-      <w:r>
-        <w:rPr>
-          <w:color w:val="00B050"/>
-        </w:rPr>
-        <w:t>08</w:t>
-      </w:r>
-      <w:r>
-        <w:rPr>
-          <w:color w:val="00B050"/>
-        </w:rPr>
-        <w:t>-</w:t>
-      </w:r>
-      <w:r>
-        <w:rPr>
-          <w:color w:val="00B050"/>
-        </w:rPr>
-        <w:t>Aug</w:t>
-      </w:r>
-      <w:r>
-        <w:rPr>
-          <w:color w:val="00B050"/>
-        </w:rPr>
-        <w:t>-2026</w:t>
+        <w:t xml:space="preserve"> on 08-Aug-2026</w:t>
       </w:r>
     </w:p>
     <w:p>
@@ -10814,6 +10790,140 @@
     </w:p>
     <w:p>
       <w:pPr>
+        <w:pStyle w:val="ListParagraph"/>
+        <w:numPr>
+          <w:ilvl w:val="0"/>
+          <w:numId w:val="6"/>
+        </w:numPr>
+        <w:spacing w:after="0"/>
+        <w:rPr>
+          <w:b/>
+          <w:bCs/>
+          <w:color w:val="EE0000"/>
+        </w:rPr>
+      </w:pPr>
+      <w:r>
+        <w:rPr>
+          <w:b/>
+          <w:bCs/>
+          <w:color w:val="EE0000"/>
+        </w:rPr>
+        <w:t>Data Migration PMC Command #</w:t>
+      </w:r>
+      <w:r>
+        <w:rPr>
+          <w:b/>
+          <w:bCs/>
+          <w:color w:val="EE0000"/>
+        </w:rPr>
+        <w:t>6</w:t>
+      </w:r>
+      <w:r>
+        <w:rPr>
+          <w:b/>
+          <w:bCs/>
+          <w:color w:val="EE0000"/>
+        </w:rPr>
+        <w:t>7</w:t>
+      </w:r>
+    </w:p>
+    <w:p>
+      <w:pPr>
+        <w:spacing w:after="0"/>
+        <w:ind w:left="1080"/>
+      </w:pPr>
+      <w:r>
+        <w:t>Add-Migration</w:t>
+      </w:r>
+      <w:r>
+        <w:t xml:space="preserve"> </w:t>
+      </w:r>
+      <w:r>
+        <w:rPr>
+          <w:lang w:val="en-GB"/>
+        </w:rPr>
+        <w:t>Modify</w:t>
+      </w:r>
+      <w:r>
+        <w:rPr>
+          <w:lang w:val="en-GB"/>
+        </w:rPr>
+        <w:t>EmployeeEntity</w:t>
+      </w:r>
+      <w:r>
+        <w:rPr>
+          <w:lang w:val="en-GB"/>
+        </w:rPr>
+        <w:t xml:space="preserve"> </w:t>
+      </w:r>
+      <w:r>
+        <w:t xml:space="preserve">-Context AppDbContext </w:t>
+      </w:r>
+      <w:r>
+        <w:t>-Project KenHRApp.Infrastructure -StartupProject KenHRApp.Web -Verbose</w:t>
+      </w:r>
+    </w:p>
+    <w:p>
+      <w:pPr>
+        <w:spacing w:after="0"/>
+        <w:ind w:left="1080"/>
+      </w:pPr>
+    </w:p>
+    <w:p>
+      <w:pPr>
+        <w:spacing w:after="0"/>
+        <w:ind w:left="1080"/>
+      </w:pPr>
+      <w:r>
+        <w:t xml:space="preserve">Update-Database </w:t>
+      </w:r>
+      <w:r>
+        <w:t>-Context AppDbContext</w:t>
+      </w:r>
+    </w:p>
+    <w:p>
+      <w:pPr>
+        <w:spacing w:after="0"/>
+        <w:ind w:left="1080"/>
+        <w:rPr>
+          <w:u w:val="single"/>
+        </w:rPr>
+      </w:pPr>
+      <w:r>
+        <w:rPr>
+          <w:b/>
+          <w:bCs/>
+          <w:u w:val="single"/>
+        </w:rPr>
+        <w:t>Status:</w:t>
+      </w:r>
+      <w:r>
+        <w:rPr>
+          <w:u w:val="single"/>
+        </w:rPr>
+        <w:t xml:space="preserve"> </w:t>
+      </w:r>
+    </w:p>
+    <w:p>
+      <w:pPr>
+        <w:spacing w:after="0"/>
+        <w:ind w:left="1080"/>
+      </w:pPr>
+      <w:r>
+        <w:t>Development Database:</w:t>
+      </w:r>
+      <w:r>
+        <w:t xml:space="preserve"> </w:t>
+      </w:r>
+      <w:r>
+        <w:rPr>
+          <w:color w:val="00B050"/>
+        </w:rPr>
+        <w:t>Pending</w:t>
+      </w:r>
+    </w:p>
+    <w:p>
+      <w:pPr>
         <w:spacing w:after="0"/>
         <w:ind w:left="1080"/>
       </w:pPr>
@@ -10926,6 +11036,7 @@
           <w:color w:val="EE0000"/>
           <w:lang w:val="en-GB"/>
         </w:rPr>
+        <w:lastRenderedPageBreak/>
         <w:t xml:space="preserve">Script-Migration -Idempotent </w:t>
       </w:r>
       <w:r>
@@ -11010,7 +11121,6 @@
           <w:szCs w:val="30"/>
           <w:u w:val="single"/>
         </w:rPr>
-        <w:lastRenderedPageBreak/>
         <w:t>Migration using SQL Script:</w:t>
       </w:r>
     </w:p>
@@ -11385,6 +11495,7 @@
         </w:rPr>
       </w:pPr>
       <w:r>
+        <w:lastRenderedPageBreak/>
         <w:t xml:space="preserve">Script-Migration -From </w:t>
       </w:r>
       <w:r>
@@ -11557,7 +11668,6 @@
           <w:b/>
           <w:bCs/>
         </w:rPr>
-        <w:lastRenderedPageBreak/>
         <w:t>PMC script:</w:t>
       </w:r>
     </w:p>
@@ -12204,7 +12314,6 @@
           <w:color w:val="00B050"/>
           <w:lang w:val="en-GB"/>
         </w:rPr>
-        <w:lastRenderedPageBreak/>
         <w:t>Status: Completed</w:t>
       </w:r>
     </w:p>
@@ -12669,6 +12778,7 @@
           <w:b/>
           <w:bCs/>
         </w:rPr>
+        <w:lastRenderedPageBreak/>
         <w:t>PMC script:</w:t>
       </w:r>
     </w:p>
@@ -12808,7 +12918,6 @@
           <w:bCs/>
           <w:lang w:val="en-GB"/>
         </w:rPr>
-        <w:lastRenderedPageBreak/>
         <w:t>Description:</w:t>
       </w:r>
       <w:r>
@@ -13313,6 +13422,7 @@
           <w:bCs/>
           <w:lang w:val="en-GB"/>
         </w:rPr>
+        <w:lastRenderedPageBreak/>
         <w:t>Description:</w:t>
       </w:r>
       <w:r>
@@ -13490,7 +13600,6 @@
           <w:bCs/>
           <w:lang w:val="en-GB"/>
         </w:rPr>
-        <w:lastRenderedPageBreak/>
         <w:t>Description:</w:t>
       </w:r>
       <w:r>
@@ -14151,7 +14260,6 @@
           <w:color w:val="00B050"/>
           <w:lang w:val="en-GB"/>
         </w:rPr>
-        <w:lastRenderedPageBreak/>
         <w:t xml:space="preserve">Status: </w:t>
       </w:r>
       <w:r>
@@ -14662,6 +14770,7 @@
         </w:rPr>
       </w:pPr>
       <w:r>
+        <w:lastRenderedPageBreak/>
         <w:t xml:space="preserve">Script-Migration -From </w:t>
       </w:r>
       <w:r>
@@ -14801,7 +14910,6 @@
           <w:bCs/>
           <w:lang w:val="en-GB"/>
         </w:rPr>
-        <w:lastRenderedPageBreak/>
         <w:t>Description:</w:t>
       </w:r>
       <w:r>
@@ -15369,6 +15477,7 @@
           <w:bCs/>
           <w:lang w:val="en-GB"/>
         </w:rPr>
+        <w:lastRenderedPageBreak/>
         <w:t>Description:</w:t>
       </w:r>
       <w:r>
@@ -15558,7 +15667,6 @@
           <w:bCs/>
           <w:lang w:val="en-GB"/>
         </w:rPr>
-        <w:lastRenderedPageBreak/>
         <w:t>Description:</w:t>
       </w:r>
       <w:r>
@@ -16204,7 +16312,6 @@
         </w:rPr>
       </w:pPr>
       <w:r>
-        <w:lastRenderedPageBreak/>
         <w:t xml:space="preserve">Script-Migration -From </w:t>
       </w:r>
       <w:r>
@@ -16786,6 +16893,7 @@
         </w:rPr>
       </w:pPr>
       <w:r>
+        <w:lastRenderedPageBreak/>
         <w:t xml:space="preserve">Script-Migration -From </w:t>
       </w:r>
       <w:r>
@@ -16967,7 +17075,6 @@
           <w:b/>
           <w:bCs/>
         </w:rPr>
-        <w:lastRenderedPageBreak/>
         <w:t>PMC script:</w:t>
       </w:r>
     </w:p>
@@ -17552,6 +17659,7 @@
         </w:rPr>
       </w:pPr>
       <w:r>
+        <w:lastRenderedPageBreak/>
         <w:t xml:space="preserve">Script-Migration -From </w:t>
       </w:r>
       <w:r>
@@ -17751,7 +17859,6 @@
           <w:b/>
           <w:bCs/>
         </w:rPr>
-        <w:lastRenderedPageBreak/>
         <w:t>PMC script:</w:t>
       </w:r>
     </w:p>
@@ -18364,6 +18471,7 @@
         <w:rPr>
           <w:lang w:val="en-GB"/>
         </w:rPr>
+        <w:lastRenderedPageBreak/>
         <w:t>Status:</w:t>
       </w:r>
       <w:r>
@@ -18551,7 +18659,6 @@
         <w:rPr>
           <w:lang w:val="en-GB"/>
         </w:rPr>
-        <w:lastRenderedPageBreak/>
         <w:t>Status:</w:t>
       </w:r>
       <w:r>
@@ -19251,6 +19358,7 @@
           <w:bCs/>
           <w:lang w:val="en-GB"/>
         </w:rPr>
+        <w:lastRenderedPageBreak/>
         <w:t>Description:</w:t>
       </w:r>
       <w:r>
@@ -19460,7 +19568,6 @@
           <w:bCs/>
           <w:lang w:val="en-GB"/>
         </w:rPr>
-        <w:lastRenderedPageBreak/>
         <w:t>Description:</w:t>
       </w:r>
       <w:r>
@@ -20147,6 +20254,7 @@
         </w:rPr>
       </w:pPr>
       <w:r>
+        <w:lastRenderedPageBreak/>
         <w:t xml:space="preserve">Script-Migration -From </w:t>
       </w:r>
       <w:r>
@@ -20341,7 +20449,6 @@
         </w:rPr>
       </w:pPr>
       <w:r>
-        <w:lastRenderedPageBreak/>
         <w:t xml:space="preserve">Script-Migration -From </w:t>
       </w:r>
       <w:r>
@@ -21062,6 +21169,7 @@
           <w:bCs/>
           <w:lang w:val="en-GB"/>
         </w:rPr>
+        <w:lastRenderedPageBreak/>
         <w:t>Description:</w:t>
       </w:r>
       <w:r>
@@ -21253,7 +21361,6 @@
           <w:bCs/>
           <w:lang w:val="en-GB"/>
         </w:rPr>
-        <w:lastRenderedPageBreak/>
         <w:t>Description:</w:t>
       </w:r>
       <w:r>
@@ -21877,6 +21984,7 @@
           <w:b/>
           <w:bCs/>
         </w:rPr>
+        <w:lastRenderedPageBreak/>
         <w:t>PMC script:</w:t>
       </w:r>
     </w:p>
@@ -22068,7 +22176,6 @@
           <w:b/>
           <w:bCs/>
         </w:rPr>
-        <w:lastRenderedPageBreak/>
         <w:t>PMC script:</w:t>
       </w:r>
     </w:p>
@@ -22711,6 +22818,7 @@
         </w:rPr>
       </w:pPr>
       <w:r>
+        <w:lastRenderedPageBreak/>
         <w:t xml:space="preserve">Script-Migration -From </w:t>
       </w:r>
       <w:r>
@@ -22815,6 +22923,245 @@
     </w:p>
     <w:p>
       <w:pPr>
+        <w:pStyle w:val="ListParagraph"/>
+        <w:numPr>
+          <w:ilvl w:val="0"/>
+          <w:numId w:val="3"/>
+        </w:numPr>
+        <w:spacing w:after="0"/>
+        <w:rPr>
+          <w:b/>
+          <w:bCs/>
+          <w:color w:val="EE0000"/>
+          <w:lang w:val="en-GB"/>
+        </w:rPr>
+      </w:pPr>
+      <w:r>
+        <w:rPr>
+          <w:b/>
+          <w:bCs/>
+          <w:color w:val="EE0000"/>
+          <w:lang w:val="en-GB"/>
+        </w:rPr>
+        <w:t>Migration script #</w:t>
+      </w:r>
+      <w:r>
+        <w:rPr>
+          <w:b/>
+          <w:bCs/>
+          <w:color w:val="EE0000"/>
+          <w:lang w:val="en-GB"/>
+        </w:rPr>
+        <w:t>6</w:t>
+      </w:r>
+      <w:r>
+        <w:rPr>
+          <w:b/>
+          <w:bCs/>
+          <w:color w:val="EE0000"/>
+          <w:lang w:val="en-GB"/>
+        </w:rPr>
+        <w:t>1</w:t>
+      </w:r>
+    </w:p>
+    <w:p>
+      <w:pPr>
+        <w:spacing w:after="0"/>
+        <w:ind w:left="720"/>
+        <w:rPr>
+          <w:lang w:val="en-GB"/>
+        </w:rPr>
+      </w:pPr>
+      <w:r>
+        <w:rPr>
+          <w:b/>
+          <w:bCs/>
+          <w:lang w:val="en-GB"/>
+        </w:rPr>
+        <w:t>Description:</w:t>
+      </w:r>
+      <w:r>
+        <w:rPr>
+          <w:lang w:val="en-GB"/>
+        </w:rPr>
+        <w:t xml:space="preserve"> Create SQL migration script from “</w:t>
+      </w:r>
+      <w:r>
+        <w:rPr>
+          <w:lang w:val="en-GB"/>
+        </w:rPr>
+        <w:t>ModifyFamilyVisaKey</w:t>
+      </w:r>
+      <w:r>
+        <w:rPr>
+          <w:lang w:val="en-GB"/>
+        </w:rPr>
+        <w:t>” to  “</w:t>
+      </w:r>
+      <w:r>
+        <w:rPr>
+          <w:lang w:val="en-GB"/>
+        </w:rPr>
+        <w:t>ModifyEmployeeEntity</w:t>
+      </w:r>
+      <w:r>
+        <w:rPr>
+          <w:lang w:val="en-GB"/>
+        </w:rPr>
+        <w:t>”</w:t>
+      </w:r>
+    </w:p>
+    <w:p>
+      <w:pPr>
+        <w:spacing w:after="0"/>
+        <w:ind w:left="720"/>
+        <w:rPr>
+          <w:b/>
+          <w:bCs/>
+        </w:rPr>
+      </w:pPr>
+      <w:r>
+        <w:rPr>
+          <w:b/>
+          <w:bCs/>
+        </w:rPr>
+        <w:t>PMC script:</w:t>
+      </w:r>
+    </w:p>
+    <w:p>
+      <w:pPr>
+        <w:spacing w:after="0"/>
+        <w:ind w:left="720"/>
+        <w:rPr>
+          <w:lang w:val="en-GB"/>
+        </w:rPr>
+      </w:pPr>
+      <w:r>
+        <w:t xml:space="preserve">Script-Migration -From </w:t>
+      </w:r>
+      <w:r>
+        <w:rPr>
+          <w:lang w:val="en-GB"/>
+        </w:rPr>
+        <w:t>ModifyFamilyVisaKey</w:t>
+      </w:r>
+      <w:r>
+        <w:t xml:space="preserve"> </w:t>
+      </w:r>
+      <w:r>
+        <w:t xml:space="preserve">-To </w:t>
+      </w:r>
+      <w:r>
+        <w:rPr>
+          <w:lang w:val="en-GB"/>
+        </w:rPr>
+        <w:t>ModifyEmployeeEntity</w:t>
+      </w:r>
+      <w:r>
+        <w:rPr>
+          <w:lang w:val="en-GB"/>
+        </w:rPr>
+        <w:t xml:space="preserve"> </w:t>
+      </w:r>
+      <w:r>
+        <w:rPr>
+          <w:lang w:val="en-GB"/>
+        </w:rPr>
+        <w:t>-Context AppDbContext</w:t>
+      </w:r>
+      <w:r>
+        <w:t xml:space="preserve"> -Output </w:t>
+      </w:r>
+      <w:r>
+        <w:rPr>
+          <w:lang w:val="en-GB"/>
+        </w:rPr>
+        <w:t>".\MigrationScripts\</w:t>
+      </w:r>
+      <w:r>
+        <w:rPr>
+          <w:lang w:val="en-GB"/>
+        </w:rPr>
+        <w:t>ModifyEmployeeEntity</w:t>
+      </w:r>
+      <w:r>
+        <w:rPr>
+          <w:lang w:val="en-GB"/>
+        </w:rPr>
+        <w:t>.sql"</w:t>
+      </w:r>
+    </w:p>
+    <w:p>
+      <w:pPr>
+        <w:spacing w:after="0"/>
+        <w:ind w:left="720"/>
+        <w:rPr>
+          <w:color w:val="00B050"/>
+        </w:rPr>
+      </w:pPr>
+      <w:r>
+        <w:rPr>
+          <w:lang w:val="en-GB"/>
+        </w:rPr>
+        <w:t>Status:</w:t>
+      </w:r>
+      <w:r>
+        <w:rPr>
+          <w:b/>
+          <w:bCs/>
+          <w:color w:val="00B050"/>
+          <w:lang w:val="en-GB"/>
+        </w:rPr>
+        <w:t xml:space="preserve"> </w:t>
+      </w:r>
+      <w:r>
+        <w:rPr>
+          <w:color w:val="00B050"/>
+        </w:rPr>
+        <w:t>Completed</w:t>
+      </w:r>
+      <w:r>
+        <w:rPr>
+          <w:color w:val="00B050"/>
+        </w:rPr>
+        <w:t xml:space="preserve"> on </w:t>
+      </w:r>
+      <w:r>
+        <w:rPr>
+          <w:color w:val="00B050"/>
+        </w:rPr>
+        <w:t>15</w:t>
+      </w:r>
+      <w:r>
+        <w:rPr>
+          <w:color w:val="00B050"/>
+        </w:rPr>
+        <w:t>-</w:t>
+      </w:r>
+      <w:r>
+        <w:rPr>
+          <w:color w:val="00B050"/>
+        </w:rPr>
+        <w:t>Aug</w:t>
+      </w:r>
+      <w:r>
+        <w:rPr>
+          <w:color w:val="00B050"/>
+        </w:rPr>
+        <w:t>-2026</w:t>
+      </w:r>
+    </w:p>
+    <w:p>
+      <w:pPr>
+        <w:spacing w:after="0"/>
+        <w:ind w:left="720"/>
+        <w:rPr>
+          <w:color w:val="00B050"/>
+        </w:rPr>
+      </w:pPr>
+    </w:p>
+    <w:p>
+      <w:pPr>
         <w:ind w:left="720"/>
         <w:rPr>
           <w:b/>
@@ -22850,7 +23197,6 @@
     </w:p>
     <w:p>
       <w:r>
-        <w:lastRenderedPageBreak/>
         <w:t>I have created a new key called “</w:t>
       </w:r>
       <w:r>
@@ -24540,7 +24886,6 @@
   <w:style w:type="character" w:default="1" w:styleId="DefaultParagraphFont">
     <w:name w:val="Default Paragraph Font"/>
     <w:uiPriority w:val="1"/>
-    <w:semiHidden/>
     <w:unhideWhenUsed/>
   </w:style>
   <w:style w:type="table" w:default="1" w:styleId="TableNormal">

</xml_diff>